<commit_message>
erro dos filtros corrigido e termino do manual
</commit_message>
<xml_diff>
--- a/Anotações/Manual_Site.docx
+++ b/Anotações/Manual_Site.docx
@@ -1,6 +1,6 @@
 
 <file path=word/document.xml><?xml version="1.0" encoding="utf-8"?>
-<w:document xmlns:wpc="http://schemas.microsoft.com/office/word/2010/wordprocessingCanvas" xmlns:cx="http://schemas.microsoft.com/office/drawing/2014/chartex" xmlns:cx1="http://schemas.microsoft.com/office/drawing/2015/9/8/chartex" xmlns:cx2="http://schemas.microsoft.com/office/drawing/2015/10/21/chartex" xmlns:cx3="http://schemas.microsoft.com/office/drawing/2016/5/9/chartex" xmlns:cx4="http://schemas.microsoft.com/office/drawing/2016/5/10/chartex" xmlns:cx5="http://schemas.microsoft.com/office/drawing/2016/5/11/chartex" xmlns:cx6="http://schemas.microsoft.com/office/drawing/2016/5/12/chartex" xmlns:cx7="http://schemas.microsoft.com/office/drawing/2016/5/13/chartex" xmlns:cx8="http://schemas.microsoft.com/office/drawing/2016/5/14/chartex" xmlns:mc="http://schemas.openxmlformats.org/markup-compatibility/2006" xmlns:aink="http://schemas.microsoft.com/office/drawing/2016/ink" xmlns:am3d="http://schemas.microsoft.com/office/drawing/2017/model3d" xmlns:o="urn:schemas-microsoft-com:office:office" xmlns:oel="http://schemas.microsoft.com/office/2019/extlst" xmlns:r="http://schemas.openxmlformats.org/officeDocument/2006/relationships" xmlns:m="http://schemas.openxmlformats.org/officeDocument/2006/math" xmlns:v="urn:schemas-microsoft-com:vml" xmlns:wp14="http://schemas.microsoft.com/office/word/2010/wordprocessingDrawing" xmlns:wp="http://schemas.openxmlformats.org/drawingml/2006/wordprocessingDrawing" xmlns:w10="urn:schemas-microsoft-com:office:word" xmlns:w="http://schemas.openxmlformats.org/wordprocessingml/2006/main" xmlns:w14="http://schemas.microsoft.com/office/word/2010/wordml" xmlns:w15="http://schemas.microsoft.com/office/word/2012/wordml" xmlns:w16cex="http://schemas.microsoft.com/office/word/2018/wordml/cex" xmlns:w16cid="http://schemas.microsoft.com/office/word/2016/wordml/cid" xmlns:w16="http://schemas.microsoft.com/office/word/2018/wordml" xmlns:w16du="http://schemas.microsoft.com/office/word/2023/wordml/word16du" xmlns:w16sdtdh="http://schemas.microsoft.com/office/word/2020/wordml/sdtdatahash" xmlns:w16sdtfl="http://schemas.microsoft.com/office/word/2024/wordml/sdtformatlock" xmlns:w16se="http://schemas.microsoft.com/office/word/2015/wordml/symex" xmlns:wpg="http://schemas.microsoft.com/office/word/2010/wordprocessingGroup" xmlns:wpi="http://schemas.microsoft.com/office/word/2010/wordprocessingInk" xmlns:wne="http://schemas.microsoft.com/office/word/2006/wordml" xmlns:wps="http://schemas.microsoft.com/office/word/2010/wordprocessingShape" mc:Ignorable="w14 w15 w16se w16cid w16 w16cex w16sdtdh w16sdtfl w16du wp14">
+<w:document xmlns:wpc="http://schemas.microsoft.com/office/word/2010/wordprocessingCanvas" xmlns:cx="http://schemas.microsoft.com/office/drawing/2014/chartex" xmlns:mc="http://schemas.openxmlformats.org/markup-compatibility/2006" xmlns:o="urn:schemas-microsoft-com:office:office" xmlns:r="http://schemas.openxmlformats.org/officeDocument/2006/relationships" xmlns:m="http://schemas.openxmlformats.org/officeDocument/2006/math" xmlns:v="urn:schemas-microsoft-com:vml" xmlns:wp14="http://schemas.microsoft.com/office/word/2010/wordprocessingDrawing" xmlns:wp="http://schemas.openxmlformats.org/drawingml/2006/wordprocessingDrawing" xmlns:w10="urn:schemas-microsoft-com:office:word" xmlns:w="http://schemas.openxmlformats.org/wordprocessingml/2006/main" xmlns:w14="http://schemas.microsoft.com/office/word/2010/wordml" xmlns:w15="http://schemas.microsoft.com/office/word/2012/wordml" xmlns:w16se="http://schemas.microsoft.com/office/word/2015/wordml/symex" xmlns:wpg="http://schemas.microsoft.com/office/word/2010/wordprocessingGroup" xmlns:wpi="http://schemas.microsoft.com/office/word/2010/wordprocessingInk" xmlns:wne="http://schemas.microsoft.com/office/word/2006/wordml" xmlns:wps="http://schemas.microsoft.com/office/word/2010/wordprocessingShape" mc:Ignorable="w14 w15 w16se wp14">
   <w:body>
     <w:p>
       <w:pPr>
@@ -9,6 +9,340 @@
           <w:lang w:eastAsia="pt-BR"/>
         </w:rPr>
       </w:pPr>
+      <w:bookmarkStart w:id="0" w:name="_GoBack"/>
+      <w:r>
+        <w:rPr>
+          <w:noProof/>
+          <w:lang w:eastAsia="pt-BR"/>
+        </w:rPr>
+        <mc:AlternateContent>
+          <mc:Choice Requires="wps">
+            <w:drawing>
+              <wp:anchor distT="0" distB="0" distL="114300" distR="114300" simplePos="0" relativeHeight="251659264" behindDoc="0" locked="0" layoutInCell="1" allowOverlap="1" wp14:anchorId="1BD66B75" wp14:editId="7A50FD74">
+                <wp:simplePos x="0" y="0"/>
+                <wp:positionH relativeFrom="page">
+                  <wp:posOffset>-559558</wp:posOffset>
+                </wp:positionH>
+                <wp:positionV relativeFrom="paragraph">
+                  <wp:posOffset>-899795</wp:posOffset>
+                </wp:positionV>
+                <wp:extent cx="918968" cy="10863580"/>
+                <wp:effectExtent l="0" t="0" r="0" b="0"/>
+                <wp:wrapNone/>
+                <wp:docPr id="1" name="Retângulo 1"/>
+                <wp:cNvGraphicFramePr/>
+                <a:graphic xmlns:a="http://schemas.openxmlformats.org/drawingml/2006/main">
+                  <a:graphicData uri="http://schemas.microsoft.com/office/word/2010/wordprocessingShape">
+                    <wps:wsp>
+                      <wps:cNvSpPr/>
+                      <wps:spPr>
+                        <a:xfrm>
+                          <a:off x="0" y="0"/>
+                          <a:ext cx="918968" cy="10863580"/>
+                        </a:xfrm>
+                        <a:prstGeom prst="rect">
+                          <a:avLst/>
+                        </a:prstGeom>
+                        <a:solidFill>
+                          <a:srgbClr val="A02748"/>
+                        </a:solidFill>
+                        <a:ln>
+                          <a:noFill/>
+                        </a:ln>
+                      </wps:spPr>
+                      <wps:style>
+                        <a:lnRef idx="2">
+                          <a:schemeClr val="accent1">
+                            <a:shade val="50000"/>
+                          </a:schemeClr>
+                        </a:lnRef>
+                        <a:fillRef idx="1">
+                          <a:schemeClr val="accent1"/>
+                        </a:fillRef>
+                        <a:effectRef idx="0">
+                          <a:schemeClr val="accent1"/>
+                        </a:effectRef>
+                        <a:fontRef idx="minor">
+                          <a:schemeClr val="lt1"/>
+                        </a:fontRef>
+                      </wps:style>
+                      <wps:bodyPr rot="0" spcFirstLastPara="0" vertOverflow="overflow" horzOverflow="overflow" vert="horz" wrap="square" lIns="91440" tIns="45720" rIns="91440" bIns="45720" numCol="1" spcCol="0" rtlCol="0" fromWordArt="0" anchor="ctr" anchorCtr="0" forceAA="0" compatLnSpc="1">
+                        <a:prstTxWarp prst="textNoShape">
+                          <a:avLst/>
+                        </a:prstTxWarp>
+                        <a:noAutofit/>
+                      </wps:bodyPr>
+                    </wps:wsp>
+                  </a:graphicData>
+                </a:graphic>
+                <wp14:sizeRelH relativeFrom="margin">
+                  <wp14:pctWidth>0</wp14:pctWidth>
+                </wp14:sizeRelH>
+                <wp14:sizeRelV relativeFrom="margin">
+                  <wp14:pctHeight>0</wp14:pctHeight>
+                </wp14:sizeRelV>
+              </wp:anchor>
+            </w:drawing>
+          </mc:Choice>
+          <mc:Fallback>
+            <w:pict>
+              <v:rect w14:anchorId="7E4FAC0A" id="Retângulo 1" o:spid="_x0000_s1026" style="position:absolute;margin-left:-44.05pt;margin-top:-70.85pt;width:72.35pt;height:855.4pt;z-index:251659264;visibility:visible;mso-wrap-style:square;mso-width-percent:0;mso-height-percent:0;mso-wrap-distance-left:9pt;mso-wrap-distance-top:0;mso-wrap-distance-right:9pt;mso-wrap-distance-bottom:0;mso-position-horizontal:absolute;mso-position-horizontal-relative:page;mso-position-vertical:absolute;mso-position-vertical-relative:text;mso-width-percent:0;mso-height-percent:0;mso-width-relative:margin;mso-height-relative:margin;v-text-anchor:middle" o:gfxdata="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" fillcolor="#a02748" stroked="f" strokeweight="1pt">
+                <w10:wrap anchorx="page"/>
+              </v:rect>
+            </w:pict>
+          </mc:Fallback>
+        </mc:AlternateContent>
+      </w:r>
+      <w:bookmarkEnd w:id="0"/>
+      <w:r>
+        <w:rPr>
+          <w:noProof/>
+          <w:lang w:eastAsia="pt-BR"/>
+        </w:rPr>
+        <mc:AlternateContent>
+          <mc:Choice Requires="wps">
+            <w:drawing>
+              <wp:anchor distT="0" distB="0" distL="114300" distR="114300" simplePos="0" relativeHeight="251662336" behindDoc="0" locked="0" layoutInCell="1" allowOverlap="1" wp14:anchorId="1F1AB489" wp14:editId="2F867171">
+                <wp:simplePos x="0" y="0"/>
+                <wp:positionH relativeFrom="page">
+                  <wp:posOffset>7192369</wp:posOffset>
+                </wp:positionH>
+                <wp:positionV relativeFrom="paragraph">
+                  <wp:posOffset>-899795</wp:posOffset>
+                </wp:positionV>
+                <wp:extent cx="641445" cy="10958830"/>
+                <wp:effectExtent l="0" t="0" r="6350" b="0"/>
+                <wp:wrapNone/>
+                <wp:docPr id="5" name="Retângulo 5"/>
+                <wp:cNvGraphicFramePr/>
+                <a:graphic xmlns:a="http://schemas.openxmlformats.org/drawingml/2006/main">
+                  <a:graphicData uri="http://schemas.microsoft.com/office/word/2010/wordprocessingShape">
+                    <wps:wsp>
+                      <wps:cNvSpPr/>
+                      <wps:spPr>
+                        <a:xfrm>
+                          <a:off x="0" y="0"/>
+                          <a:ext cx="641445" cy="10958830"/>
+                        </a:xfrm>
+                        <a:prstGeom prst="rect">
+                          <a:avLst/>
+                        </a:prstGeom>
+                        <a:solidFill>
+                          <a:srgbClr val="A02748"/>
+                        </a:solidFill>
+                        <a:ln>
+                          <a:noFill/>
+                        </a:ln>
+                      </wps:spPr>
+                      <wps:style>
+                        <a:lnRef idx="2">
+                          <a:schemeClr val="accent1">
+                            <a:shade val="50000"/>
+                          </a:schemeClr>
+                        </a:lnRef>
+                        <a:fillRef idx="1">
+                          <a:schemeClr val="accent1"/>
+                        </a:fillRef>
+                        <a:effectRef idx="0">
+                          <a:schemeClr val="accent1"/>
+                        </a:effectRef>
+                        <a:fontRef idx="minor">
+                          <a:schemeClr val="lt1"/>
+                        </a:fontRef>
+                      </wps:style>
+                      <wps:bodyPr rot="0" spcFirstLastPara="0" vertOverflow="overflow" horzOverflow="overflow" vert="horz" wrap="square" lIns="91440" tIns="45720" rIns="91440" bIns="45720" numCol="1" spcCol="0" rtlCol="0" fromWordArt="0" anchor="ctr" anchorCtr="0" forceAA="0" compatLnSpc="1">
+                        <a:prstTxWarp prst="textNoShape">
+                          <a:avLst/>
+                        </a:prstTxWarp>
+                        <a:noAutofit/>
+                      </wps:bodyPr>
+                    </wps:wsp>
+                  </a:graphicData>
+                </a:graphic>
+                <wp14:sizeRelH relativeFrom="margin">
+                  <wp14:pctWidth>0</wp14:pctWidth>
+                </wp14:sizeRelH>
+                <wp14:sizeRelV relativeFrom="margin">
+                  <wp14:pctHeight>0</wp14:pctHeight>
+                </wp14:sizeRelV>
+              </wp:anchor>
+            </w:drawing>
+          </mc:Choice>
+          <mc:Fallback>
+            <w:pict>
+              <v:rect w14:anchorId="221F309C" id="Retângulo 5" o:spid="_x0000_s1026" style="position:absolute;margin-left:566.35pt;margin-top:-70.85pt;width:50.5pt;height:862.9pt;z-index:251662336;visibility:visible;mso-wrap-style:square;mso-width-percent:0;mso-height-percent:0;mso-wrap-distance-left:9pt;mso-wrap-distance-top:0;mso-wrap-distance-right:9pt;mso-wrap-distance-bottom:0;mso-position-horizontal:absolute;mso-position-horizontal-relative:page;mso-position-vertical:absolute;mso-position-vertical-relative:text;mso-width-percent:0;mso-height-percent:0;mso-width-relative:margin;mso-height-relative:margin;v-text-anchor:middle" o:gfxdata="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" fillcolor="#a02748" stroked="f" strokeweight="1pt">
+                <w10:wrap anchorx="page"/>
+              </v:rect>
+            </w:pict>
+          </mc:Fallback>
+        </mc:AlternateContent>
+      </w:r>
+      <w:r>
+        <w:rPr>
+          <w:noProof/>
+          <w:lang w:eastAsia="pt-BR"/>
+        </w:rPr>
+        <mc:AlternateContent>
+          <mc:Choice Requires="wps">
+            <w:drawing>
+              <wp:anchor distT="0" distB="0" distL="114300" distR="114300" simplePos="0" relativeHeight="251661312" behindDoc="0" locked="0" layoutInCell="1" allowOverlap="1" wp14:anchorId="40FF0442" wp14:editId="3F34E98D">
+                <wp:simplePos x="0" y="0"/>
+                <wp:positionH relativeFrom="page">
+                  <wp:posOffset>7014949</wp:posOffset>
+                </wp:positionH>
+                <wp:positionV relativeFrom="paragraph">
+                  <wp:posOffset>-899795</wp:posOffset>
+                </wp:positionV>
+                <wp:extent cx="539750" cy="10890913"/>
+                <wp:effectExtent l="0" t="0" r="0" b="5715"/>
+                <wp:wrapNone/>
+                <wp:docPr id="4" name="Retângulo 4"/>
+                <wp:cNvGraphicFramePr/>
+                <a:graphic xmlns:a="http://schemas.openxmlformats.org/drawingml/2006/main">
+                  <a:graphicData uri="http://schemas.microsoft.com/office/word/2010/wordprocessingShape">
+                    <wps:wsp>
+                      <wps:cNvSpPr/>
+                      <wps:spPr>
+                        <a:xfrm>
+                          <a:off x="0" y="0"/>
+                          <a:ext cx="539750" cy="10890913"/>
+                        </a:xfrm>
+                        <a:prstGeom prst="rect">
+                          <a:avLst/>
+                        </a:prstGeom>
+                        <a:solidFill>
+                          <a:srgbClr val="EECBAD"/>
+                        </a:solidFill>
+                        <a:ln>
+                          <a:noFill/>
+                        </a:ln>
+                      </wps:spPr>
+                      <wps:style>
+                        <a:lnRef idx="2">
+                          <a:schemeClr val="accent1">
+                            <a:shade val="50000"/>
+                          </a:schemeClr>
+                        </a:lnRef>
+                        <a:fillRef idx="1">
+                          <a:schemeClr val="accent1"/>
+                        </a:fillRef>
+                        <a:effectRef idx="0">
+                          <a:schemeClr val="accent1"/>
+                        </a:effectRef>
+                        <a:fontRef idx="minor">
+                          <a:schemeClr val="lt1"/>
+                        </a:fontRef>
+                      </wps:style>
+                      <wps:bodyPr rot="0" spcFirstLastPara="0" vertOverflow="overflow" horzOverflow="overflow" vert="horz" wrap="square" lIns="91440" tIns="45720" rIns="91440" bIns="45720" numCol="1" spcCol="0" rtlCol="0" fromWordArt="0" anchor="ctr" anchorCtr="0" forceAA="0" compatLnSpc="1">
+                        <a:prstTxWarp prst="textNoShape">
+                          <a:avLst/>
+                        </a:prstTxWarp>
+                        <a:noAutofit/>
+                      </wps:bodyPr>
+                    </wps:wsp>
+                  </a:graphicData>
+                </a:graphic>
+                <wp14:sizeRelH relativeFrom="margin">
+                  <wp14:pctWidth>0</wp14:pctWidth>
+                </wp14:sizeRelH>
+                <wp14:sizeRelV relativeFrom="margin">
+                  <wp14:pctHeight>0</wp14:pctHeight>
+                </wp14:sizeRelV>
+              </wp:anchor>
+            </w:drawing>
+          </mc:Choice>
+          <mc:Fallback>
+            <w:pict>
+              <v:rect w14:anchorId="0A0B43A5" id="Retângulo 4" o:spid="_x0000_s1026" style="position:absolute;margin-left:552.35pt;margin-top:-70.85pt;width:42.5pt;height:857.55pt;z-index:251661312;visibility:visible;mso-wrap-style:square;mso-width-percent:0;mso-height-percent:0;mso-wrap-distance-left:9pt;mso-wrap-distance-top:0;mso-wrap-distance-right:9pt;mso-wrap-distance-bottom:0;mso-position-horizontal:absolute;mso-position-horizontal-relative:page;mso-position-vertical:absolute;mso-position-vertical-relative:text;mso-width-percent:0;mso-height-percent:0;mso-width-relative:margin;mso-height-relative:margin;v-text-anchor:middle" o:gfxdata="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" fillcolor="#eecbad" stroked="f" strokeweight="1pt">
+                <w10:wrap anchorx="page"/>
+              </v:rect>
+            </w:pict>
+          </mc:Fallback>
+        </mc:AlternateContent>
+      </w:r>
+      <w:r>
+        <w:rPr>
+          <w:noProof/>
+          <w:lang w:eastAsia="pt-BR"/>
+        </w:rPr>
+        <mc:AlternateContent>
+          <mc:Choice Requires="wps">
+            <w:drawing>
+              <wp:anchor distT="0" distB="0" distL="114300" distR="114300" simplePos="0" relativeHeight="251658239" behindDoc="0" locked="0" layoutInCell="1" allowOverlap="1" wp14:anchorId="415DE84F" wp14:editId="715981A1">
+                <wp:simplePos x="0" y="0"/>
+                <wp:positionH relativeFrom="page">
+                  <wp:align>left</wp:align>
+                </wp:positionH>
+                <wp:positionV relativeFrom="paragraph">
+                  <wp:posOffset>-899795</wp:posOffset>
+                </wp:positionV>
+                <wp:extent cx="539750" cy="10781731"/>
+                <wp:effectExtent l="0" t="0" r="0" b="635"/>
+                <wp:wrapNone/>
+                <wp:docPr id="2" name="Retângulo 2"/>
+                <wp:cNvGraphicFramePr/>
+                <a:graphic xmlns:a="http://schemas.openxmlformats.org/drawingml/2006/main">
+                  <a:graphicData uri="http://schemas.microsoft.com/office/word/2010/wordprocessingShape">
+                    <wps:wsp>
+                      <wps:cNvSpPr/>
+                      <wps:spPr>
+                        <a:xfrm>
+                          <a:off x="0" y="0"/>
+                          <a:ext cx="539750" cy="10781731"/>
+                        </a:xfrm>
+                        <a:prstGeom prst="rect">
+                          <a:avLst/>
+                        </a:prstGeom>
+                        <a:solidFill>
+                          <a:srgbClr val="EECBAD"/>
+                        </a:solidFill>
+                        <a:ln>
+                          <a:noFill/>
+                        </a:ln>
+                      </wps:spPr>
+                      <wps:style>
+                        <a:lnRef idx="2">
+                          <a:schemeClr val="accent1">
+                            <a:shade val="50000"/>
+                          </a:schemeClr>
+                        </a:lnRef>
+                        <a:fillRef idx="1">
+                          <a:schemeClr val="accent1"/>
+                        </a:fillRef>
+                        <a:effectRef idx="0">
+                          <a:schemeClr val="accent1"/>
+                        </a:effectRef>
+                        <a:fontRef idx="minor">
+                          <a:schemeClr val="lt1"/>
+                        </a:fontRef>
+                      </wps:style>
+                      <wps:bodyPr rot="0" spcFirstLastPara="0" vertOverflow="overflow" horzOverflow="overflow" vert="horz" wrap="square" lIns="91440" tIns="45720" rIns="91440" bIns="45720" numCol="1" spcCol="0" rtlCol="0" fromWordArt="0" anchor="ctr" anchorCtr="0" forceAA="0" compatLnSpc="1">
+                        <a:prstTxWarp prst="textNoShape">
+                          <a:avLst/>
+                        </a:prstTxWarp>
+                        <a:noAutofit/>
+                      </wps:bodyPr>
+                    </wps:wsp>
+                  </a:graphicData>
+                </a:graphic>
+                <wp14:sizeRelH relativeFrom="margin">
+                  <wp14:pctWidth>0</wp14:pctWidth>
+                </wp14:sizeRelH>
+                <wp14:sizeRelV relativeFrom="margin">
+                  <wp14:pctHeight>0</wp14:pctHeight>
+                </wp14:sizeRelV>
+              </wp:anchor>
+            </w:drawing>
+          </mc:Choice>
+          <mc:Fallback>
+            <w:pict>
+              <v:rect w14:anchorId="456C38D3" id="Retângulo 2" o:spid="_x0000_s1026" style="position:absolute;margin-left:0;margin-top:-70.85pt;width:42.5pt;height:848.95pt;z-index:251658239;visibility:visible;mso-wrap-style:square;mso-width-percent:0;mso-height-percent:0;mso-wrap-distance-left:9pt;mso-wrap-distance-top:0;mso-wrap-distance-right:9pt;mso-wrap-distance-bottom:0;mso-position-horizontal:left;mso-position-horizontal-relative:page;mso-position-vertical:absolute;mso-position-vertical-relative:text;mso-width-percent:0;mso-height-percent:0;mso-width-relative:margin;mso-height-relative:margin;v-text-anchor:middle" o:gfxdata="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" fillcolor="#eecbad" stroked="f" strokeweight="1pt">
+                <w10:wrap anchorx="page"/>
+              </v:rect>
+            </w:pict>
+          </mc:Fallback>
+        </mc:AlternateContent>
+      </w:r>
     </w:p>
     <w:p>
       <w:pPr>
@@ -31,7 +365,7 @@
           <w:lang w:eastAsia="pt-BR"/>
         </w:rPr>
         <w:drawing>
-          <wp:inline distT="0" distB="0" distL="0" distR="0" wp14:anchorId="5AE1DDA7" wp14:editId="4C2E4E4B">
+          <wp:inline distT="0" distB="0" distL="0" distR="0" wp14:anchorId="5AE1DDA7" wp14:editId="5A01877B">
             <wp:extent cx="2880000" cy="2880000"/>
             <wp:effectExtent l="0" t="0" r="0" b="0"/>
             <wp:docPr id="1080377716" name="Imagem 2"/>
@@ -48,7 +382,7 @@
                     </pic:cNvPicPr>
                   </pic:nvPicPr>
                   <pic:blipFill>
-                    <a:blip r:embed="rId6" cstate="print">
+                    <a:blip r:embed="rId8" cstate="print">
                       <a:extLst>
                         <a:ext uri="{28A0092B-C50C-407E-A947-70E740481C1C}">
                           <a14:useLocalDpi xmlns:a14="http://schemas.microsoft.com/office/drawing/2010/main" val="0"/>
@@ -180,11 +514,19 @@
           <w:lang w:eastAsia="pt-BR"/>
         </w:rPr>
       </w:pPr>
-      <w:r>
-        <w:rPr>
-          <w:lang w:eastAsia="pt-BR"/>
-        </w:rPr>
-        <w:t xml:space="preserve">Navbar: </w:t>
+      <w:proofErr w:type="spellStart"/>
+      <w:r>
+        <w:rPr>
+          <w:lang w:eastAsia="pt-BR"/>
+        </w:rPr>
+        <w:t>Navbar</w:t>
+      </w:r>
+      <w:proofErr w:type="spellEnd"/>
+      <w:r>
+        <w:rPr>
+          <w:lang w:eastAsia="pt-BR"/>
+        </w:rPr>
+        <w:t xml:space="preserve">: </w:t>
       </w:r>
       <w:r>
         <w:rPr>
@@ -196,7 +538,21 @@
         <w:rPr>
           <w:lang w:eastAsia="pt-BR"/>
         </w:rPr>
-        <w:t xml:space="preserve"> fixa no topo com logo da empresa e links para as seções internas (Home, Quem Somos, Catálogo, Sobre, Localização e Redes sociais). Funciona como menu de navegação principal.</w:t>
+        <w:t xml:space="preserve"> fixa no topo com logo da empresa e links para as seções internas (Home, Quem Somos, Catálogo, </w:t>
+      </w:r>
+      <w:proofErr w:type="gramStart"/>
+      <w:r>
+        <w:rPr>
+          <w:lang w:eastAsia="pt-BR"/>
+        </w:rPr>
+        <w:t>Sobre, Localização e Redes sociais</w:t>
+      </w:r>
+      <w:proofErr w:type="gramEnd"/>
+      <w:r>
+        <w:rPr>
+          <w:lang w:eastAsia="pt-BR"/>
+        </w:rPr>
+        <w:t>). Funciona como menu de navegação principal.</w:t>
       </w:r>
     </w:p>
     <w:p>
@@ -230,7 +586,7 @@
                     </pic:cNvPicPr>
                   </pic:nvPicPr>
                   <pic:blipFill>
-                    <a:blip r:embed="rId7" cstate="print">
+                    <a:blip r:embed="rId9" cstate="print">
                       <a:extLst>
                         <a:ext uri="{28A0092B-C50C-407E-A947-70E740481C1C}">
                           <a14:useLocalDpi xmlns:a14="http://schemas.microsoft.com/office/drawing/2010/main" val="0"/>
@@ -317,7 +673,7 @@
                     </pic:cNvPicPr>
                   </pic:nvPicPr>
                   <pic:blipFill>
-                    <a:blip r:embed="rId8" cstate="print">
+                    <a:blip r:embed="rId10" cstate="print">
                       <a:extLst>
                         <a:ext uri="{28A0092B-C50C-407E-A947-70E740481C1C}">
                           <a14:useLocalDpi xmlns:a14="http://schemas.microsoft.com/office/drawing/2010/main" val="0"/>
@@ -370,7 +726,21 @@
         <w:rPr>
           <w:lang w:eastAsia="pt-BR"/>
         </w:rPr>
-        <w:t>Três cards descritivos apresentando a Missão Visão e Valores</w:t>
+        <w:t xml:space="preserve">Três </w:t>
+      </w:r>
+      <w:proofErr w:type="spellStart"/>
+      <w:r>
+        <w:rPr>
+          <w:lang w:eastAsia="pt-BR"/>
+        </w:rPr>
+        <w:t>cards</w:t>
+      </w:r>
+      <w:proofErr w:type="spellEnd"/>
+      <w:r>
+        <w:rPr>
+          <w:lang w:eastAsia="pt-BR"/>
+        </w:rPr>
+        <w:t xml:space="preserve"> descritivos apresentando a Missão Visão e Valores</w:t>
       </w:r>
       <w:r>
         <w:rPr>
@@ -410,7 +780,7 @@
                     </pic:cNvPicPr>
                   </pic:nvPicPr>
                   <pic:blipFill>
-                    <a:blip r:embed="rId9" cstate="print">
+                    <a:blip r:embed="rId11" cstate="print">
                       <a:extLst>
                         <a:ext uri="{28A0092B-C50C-407E-A947-70E740481C1C}">
                           <a14:useLocalDpi xmlns:a14="http://schemas.microsoft.com/office/drawing/2010/main" val="0"/>
@@ -514,7 +884,7 @@
                     </pic:cNvPicPr>
                   </pic:nvPicPr>
                   <pic:blipFill>
-                    <a:blip r:embed="rId10" cstate="print">
+                    <a:blip r:embed="rId12" cstate="print">
                       <a:extLst>
                         <a:ext uri="{28A0092B-C50C-407E-A947-70E740481C1C}">
                           <a14:useLocalDpi xmlns:a14="http://schemas.microsoft.com/office/drawing/2010/main" val="0"/>
@@ -625,7 +995,7 @@
                     </pic:cNvPicPr>
                   </pic:nvPicPr>
                   <pic:blipFill>
-                    <a:blip r:embed="rId11" cstate="print">
+                    <a:blip r:embed="rId13" cstate="print">
                       <a:extLst>
                         <a:ext uri="{28A0092B-C50C-407E-A947-70E740481C1C}">
                           <a14:useLocalDpi xmlns:a14="http://schemas.microsoft.com/office/drawing/2010/main" val="0"/>
@@ -678,7 +1048,21 @@
         <w:rPr>
           <w:lang w:eastAsia="pt-BR"/>
         </w:rPr>
-        <w:t>Seção com endereço completo, horários de funcionamento, telefone de contato e mapa interativo do Google Maps mostrando a localização exata.</w:t>
+        <w:t xml:space="preserve">Seção com endereço completo, horários de funcionamento, telefone de contato e mapa interativo do Google </w:t>
+      </w:r>
+      <w:proofErr w:type="spellStart"/>
+      <w:r>
+        <w:rPr>
+          <w:lang w:eastAsia="pt-BR"/>
+        </w:rPr>
+        <w:t>Maps</w:t>
+      </w:r>
+      <w:proofErr w:type="spellEnd"/>
+      <w:r>
+        <w:rPr>
+          <w:lang w:eastAsia="pt-BR"/>
+        </w:rPr>
+        <w:t xml:space="preserve"> mostrando a localização exata.</w:t>
       </w:r>
     </w:p>
     <w:p>
@@ -712,7 +1096,7 @@
                     </pic:cNvPicPr>
                   </pic:nvPicPr>
                   <pic:blipFill>
-                    <a:blip r:embed="rId12" cstate="print">
+                    <a:blip r:embed="rId14" cstate="print">
                       <a:extLst>
                         <a:ext uri="{28A0092B-C50C-407E-A947-70E740481C1C}">
                           <a14:useLocalDpi xmlns:a14="http://schemas.microsoft.com/office/drawing/2010/main" val="0"/>
@@ -782,7 +1166,21 @@
         <w:rPr>
           <w:lang w:eastAsia="pt-BR"/>
         </w:rPr>
-        <w:t>Dois cards com botões ilustrados para Instagram e WhatsApp, permitindo acesso direto às plataformas de contato da empresa.</w:t>
+        <w:t xml:space="preserve">Dois </w:t>
+      </w:r>
+      <w:proofErr w:type="spellStart"/>
+      <w:r>
+        <w:rPr>
+          <w:lang w:eastAsia="pt-BR"/>
+        </w:rPr>
+        <w:t>cards</w:t>
+      </w:r>
+      <w:proofErr w:type="spellEnd"/>
+      <w:r>
+        <w:rPr>
+          <w:lang w:eastAsia="pt-BR"/>
+        </w:rPr>
+        <w:t xml:space="preserve"> com botões ilustrados para Instagram e WhatsApp, permitindo acesso direto às plataformas de contato da empresa.</w:t>
       </w:r>
     </w:p>
     <w:p>
@@ -816,7 +1214,7 @@
                     </pic:cNvPicPr>
                   </pic:nvPicPr>
                   <pic:blipFill>
-                    <a:blip r:embed="rId13" cstate="print">
+                    <a:blip r:embed="rId15" cstate="print">
                       <a:extLst>
                         <a:ext uri="{28A0092B-C50C-407E-A947-70E740481C1C}">
                           <a14:useLocalDpi xmlns:a14="http://schemas.microsoft.com/office/drawing/2010/main" val="0"/>
@@ -859,11 +1257,19 @@
           <w:lang w:eastAsia="pt-BR"/>
         </w:rPr>
       </w:pPr>
-      <w:r>
-        <w:rPr>
-          <w:lang w:eastAsia="pt-BR"/>
-        </w:rPr>
-        <w:t xml:space="preserve">Footer: </w:t>
+      <w:proofErr w:type="spellStart"/>
+      <w:r>
+        <w:rPr>
+          <w:lang w:eastAsia="pt-BR"/>
+        </w:rPr>
+        <w:t>Footer</w:t>
+      </w:r>
+      <w:proofErr w:type="spellEnd"/>
+      <w:r>
+        <w:rPr>
+          <w:lang w:eastAsia="pt-BR"/>
+        </w:rPr>
+        <w:t xml:space="preserve">: </w:t>
       </w:r>
       <w:r>
         <w:rPr>
@@ -903,7 +1309,7 @@
                     </pic:cNvPicPr>
                   </pic:nvPicPr>
                   <pic:blipFill>
-                    <a:blip r:embed="rId14" cstate="print">
+                    <a:blip r:embed="rId16" cstate="print">
                       <a:extLst>
                         <a:ext uri="{28A0092B-C50C-407E-A947-70E740481C1C}">
                           <a14:useLocalDpi xmlns:a14="http://schemas.microsoft.com/office/drawing/2010/main" val="0"/>
@@ -993,11 +1399,19 @@
           <w:lang w:eastAsia="pt-BR"/>
         </w:rPr>
       </w:pPr>
-      <w:r>
-        <w:rPr>
-          <w:lang w:eastAsia="pt-BR"/>
-        </w:rPr>
-        <w:t xml:space="preserve">Navbar: </w:t>
+      <w:proofErr w:type="spellStart"/>
+      <w:r>
+        <w:rPr>
+          <w:lang w:eastAsia="pt-BR"/>
+        </w:rPr>
+        <w:t>Navbar</w:t>
+      </w:r>
+      <w:proofErr w:type="spellEnd"/>
+      <w:r>
+        <w:rPr>
+          <w:lang w:eastAsia="pt-BR"/>
+        </w:rPr>
+        <w:t xml:space="preserve">: </w:t>
       </w:r>
       <w:r>
         <w:rPr>
@@ -1037,7 +1451,7 @@
                     </pic:cNvPicPr>
                   </pic:nvPicPr>
                   <pic:blipFill>
-                    <a:blip r:embed="rId15" cstate="print">
+                    <a:blip r:embed="rId17" cstate="print">
                       <a:extLst>
                         <a:ext uri="{28A0092B-C50C-407E-A947-70E740481C1C}">
                           <a14:useLocalDpi xmlns:a14="http://schemas.microsoft.com/office/drawing/2010/main" val="0"/>
@@ -1124,7 +1538,7 @@
                     </pic:cNvPicPr>
                   </pic:nvPicPr>
                   <pic:blipFill>
-                    <a:blip r:embed="rId16">
+                    <a:blip r:embed="rId18">
                       <a:extLst>
                         <a:ext uri="{28A0092B-C50C-407E-A947-70E740481C1C}">
                           <a14:useLocalDpi xmlns:a14="http://schemas.microsoft.com/office/drawing/2010/main" val="0"/>
@@ -1223,7 +1637,7 @@
                     </pic:cNvPicPr>
                   </pic:nvPicPr>
                   <pic:blipFill>
-                    <a:blip r:embed="rId17">
+                    <a:blip r:embed="rId19">
                       <a:extLst>
                         <a:ext uri="{28A0092B-C50C-407E-A947-70E740481C1C}">
                           <a14:useLocalDpi xmlns:a14="http://schemas.microsoft.com/office/drawing/2010/main" val="0"/>
@@ -1277,7 +1691,21 @@
           <w:lang w:eastAsia="pt-BR"/>
         </w:rPr>
         <w:lastRenderedPageBreak/>
-        <w:t xml:space="preserve">Botão para o instagram: </w:t>
+        <w:t xml:space="preserve">Botão para o </w:t>
+      </w:r>
+      <w:proofErr w:type="spellStart"/>
+      <w:r>
+        <w:rPr>
+          <w:lang w:eastAsia="pt-BR"/>
+        </w:rPr>
+        <w:t>instagram</w:t>
+      </w:r>
+      <w:proofErr w:type="spellEnd"/>
+      <w:r>
+        <w:rPr>
+          <w:lang w:eastAsia="pt-BR"/>
+        </w:rPr>
+        <w:t xml:space="preserve">: </w:t>
       </w:r>
       <w:r>
         <w:rPr>
@@ -1295,7 +1723,21 @@
         <w:rPr>
           <w:lang w:eastAsia="pt-BR"/>
         </w:rPr>
-        <w:t xml:space="preserve"> card com ícone do Instagram para abrir a página oficial da Marcenaria Morais no Instagram em uma nova aba do navegador.</w:t>
+        <w:t xml:space="preserve"> </w:t>
+      </w:r>
+      <w:proofErr w:type="spellStart"/>
+      <w:r>
+        <w:rPr>
+          <w:lang w:eastAsia="pt-BR"/>
+        </w:rPr>
+        <w:t>card</w:t>
+      </w:r>
+      <w:proofErr w:type="spellEnd"/>
+      <w:r>
+        <w:rPr>
+          <w:lang w:eastAsia="pt-BR"/>
+        </w:rPr>
+        <w:t xml:space="preserve"> com ícone do Instagram para abrir a página oficial da Marcenaria Morais no Instagram em uma nova aba do navegador.</w:t>
       </w:r>
     </w:p>
     <w:p>
@@ -1329,7 +1771,7 @@
                     </pic:cNvPicPr>
                   </pic:nvPicPr>
                   <pic:blipFill>
-                    <a:blip r:embed="rId18">
+                    <a:blip r:embed="rId20">
                       <a:extLst>
                         <a:ext uri="{28A0092B-C50C-407E-A947-70E740481C1C}">
                           <a14:useLocalDpi xmlns:a14="http://schemas.microsoft.com/office/drawing/2010/main" val="0"/>
@@ -1376,13 +1818,55 @@
         <w:rPr>
           <w:lang w:eastAsia="pt-BR"/>
         </w:rPr>
-        <w:t xml:space="preserve">Botão para o whatsapp: </w:t>
-      </w:r>
-      <w:r>
-        <w:rPr>
-          <w:lang w:eastAsia="pt-BR"/>
-        </w:rPr>
-        <w:t>Clique no card com ícone do WhatsApp para abrir uma conversa direta com a empresa via WhatsApp (disponível em dispositivos móveis com app instalado).</w:t>
+        <w:t xml:space="preserve">Botão para o </w:t>
+      </w:r>
+      <w:proofErr w:type="spellStart"/>
+      <w:r>
+        <w:rPr>
+          <w:lang w:eastAsia="pt-BR"/>
+        </w:rPr>
+        <w:t>whatsapp</w:t>
+      </w:r>
+      <w:proofErr w:type="spellEnd"/>
+      <w:r>
+        <w:rPr>
+          <w:lang w:eastAsia="pt-BR"/>
+        </w:rPr>
+        <w:t xml:space="preserve">: </w:t>
+      </w:r>
+      <w:r>
+        <w:rPr>
+          <w:lang w:eastAsia="pt-BR"/>
+        </w:rPr>
+        <w:t xml:space="preserve">Clique no </w:t>
+      </w:r>
+      <w:proofErr w:type="spellStart"/>
+      <w:r>
+        <w:rPr>
+          <w:lang w:eastAsia="pt-BR"/>
+        </w:rPr>
+        <w:t>card</w:t>
+      </w:r>
+      <w:proofErr w:type="spellEnd"/>
+      <w:r>
+        <w:rPr>
+          <w:lang w:eastAsia="pt-BR"/>
+        </w:rPr>
+        <w:t xml:space="preserve"> com ícone do WhatsApp para abrir uma conversa direta com a empresa via WhatsApp (disponível em dispositivos móveis com </w:t>
+      </w:r>
+      <w:proofErr w:type="spellStart"/>
+      <w:r>
+        <w:rPr>
+          <w:lang w:eastAsia="pt-BR"/>
+        </w:rPr>
+        <w:t>app</w:t>
+      </w:r>
+      <w:proofErr w:type="spellEnd"/>
+      <w:r>
+        <w:rPr>
+          <w:lang w:eastAsia="pt-BR"/>
+        </w:rPr>
+        <w:t xml:space="preserve"> instalado).</w:t>
       </w:r>
     </w:p>
     <w:p>
@@ -1416,7 +1900,7 @@
                     </pic:cNvPicPr>
                   </pic:nvPicPr>
                   <pic:blipFill>
-                    <a:blip r:embed="rId19">
+                    <a:blip r:embed="rId21">
                       <a:extLst>
                         <a:ext uri="{28A0092B-C50C-407E-A947-70E740481C1C}">
                           <a14:useLocalDpi xmlns:a14="http://schemas.microsoft.com/office/drawing/2010/main" val="0"/>
@@ -1475,7 +1959,21 @@
         <w:rPr>
           <w:lang w:eastAsia="pt-BR"/>
         </w:rPr>
-        <w:t>Clique no link do footer para acessar</w:t>
+        <w:t xml:space="preserve">Clique no link do </w:t>
+      </w:r>
+      <w:proofErr w:type="spellStart"/>
+      <w:r>
+        <w:rPr>
+          <w:lang w:eastAsia="pt-BR"/>
+        </w:rPr>
+        <w:t>footer</w:t>
+      </w:r>
+      <w:proofErr w:type="spellEnd"/>
+      <w:r>
+        <w:rPr>
+          <w:lang w:eastAsia="pt-BR"/>
+        </w:rPr>
+        <w:t xml:space="preserve"> para acessar</w:t>
       </w:r>
       <w:r>
         <w:rPr>
@@ -1527,7 +2025,7 @@
                     </pic:cNvPicPr>
                   </pic:nvPicPr>
                   <pic:blipFill>
-                    <a:blip r:embed="rId20">
+                    <a:blip r:embed="rId22">
                       <a:extLst>
                         <a:ext uri="{28A0092B-C50C-407E-A947-70E740481C1C}">
                           <a14:useLocalDpi xmlns:a14="http://schemas.microsoft.com/office/drawing/2010/main" val="0"/>
@@ -1623,11 +2121,19 @@
           <w:lang w:eastAsia="pt-BR"/>
         </w:rPr>
       </w:pPr>
-      <w:r>
-        <w:rPr>
-          <w:lang w:eastAsia="pt-BR"/>
-        </w:rPr>
-        <w:t xml:space="preserve">Navbar: </w:t>
+      <w:proofErr w:type="spellStart"/>
+      <w:r>
+        <w:rPr>
+          <w:lang w:eastAsia="pt-BR"/>
+        </w:rPr>
+        <w:t>Navbar</w:t>
+      </w:r>
+      <w:proofErr w:type="spellEnd"/>
+      <w:r>
+        <w:rPr>
+          <w:lang w:eastAsia="pt-BR"/>
+        </w:rPr>
+        <w:t xml:space="preserve">: </w:t>
       </w:r>
       <w:r>
         <w:rPr>
@@ -1685,7 +2191,7 @@
                     </pic:cNvPicPr>
                   </pic:nvPicPr>
                   <pic:blipFill>
-                    <a:blip r:embed="rId21" cstate="print">
+                    <a:blip r:embed="rId23" cstate="print">
                       <a:extLst>
                         <a:ext uri="{28A0092B-C50C-407E-A947-70E740481C1C}">
                           <a14:useLocalDpi xmlns:a14="http://schemas.microsoft.com/office/drawing/2010/main" val="0"/>
@@ -1826,7 +2332,7 @@
                     </pic:cNvPicPr>
                   </pic:nvPicPr>
                   <pic:blipFill>
-                    <a:blip r:embed="rId22" cstate="print">
+                    <a:blip r:embed="rId24" cstate="print">
                       <a:extLst>
                         <a:ext uri="{28A0092B-C50C-407E-A947-70E740481C1C}">
                           <a14:useLocalDpi xmlns:a14="http://schemas.microsoft.com/office/drawing/2010/main" val="0"/>
@@ -1920,7 +2426,49 @@
         <w:rPr>
           <w:lang w:eastAsia="pt-BR"/>
         </w:rPr>
-        <w:t xml:space="preserve"> produtos em cards com imagem, nome e descrição resumida. Cada card é clicável para abrir um</w:t>
+        <w:t xml:space="preserve"> produtos em </w:t>
+      </w:r>
+      <w:proofErr w:type="spellStart"/>
+      <w:r>
+        <w:rPr>
+          <w:lang w:eastAsia="pt-BR"/>
+        </w:rPr>
+        <w:t>cards</w:t>
+      </w:r>
+      <w:proofErr w:type="spellEnd"/>
+      <w:r>
+        <w:rPr>
+          <w:lang w:eastAsia="pt-BR"/>
+        </w:rPr>
+        <w:t xml:space="preserve"> com imagem, nome e descrição resumida. Cada </w:t>
+      </w:r>
+      <w:proofErr w:type="spellStart"/>
+      <w:r>
+        <w:rPr>
+          <w:lang w:eastAsia="pt-BR"/>
+        </w:rPr>
+        <w:t>card</w:t>
+      </w:r>
+      <w:proofErr w:type="spellEnd"/>
+      <w:r>
+        <w:rPr>
+          <w:lang w:eastAsia="pt-BR"/>
+        </w:rPr>
+        <w:t xml:space="preserve"> é </w:t>
+      </w:r>
+      <w:proofErr w:type="spellStart"/>
+      <w:r>
+        <w:rPr>
+          <w:lang w:eastAsia="pt-BR"/>
+        </w:rPr>
+        <w:t>clicável</w:t>
+      </w:r>
+      <w:proofErr w:type="spellEnd"/>
+      <w:r>
+        <w:rPr>
+          <w:lang w:eastAsia="pt-BR"/>
+        </w:rPr>
+        <w:t xml:space="preserve"> para abrir um</w:t>
       </w:r>
       <w:r>
         <w:rPr>
@@ -1966,7 +2514,7 @@
                     </pic:cNvPicPr>
                   </pic:nvPicPr>
                   <pic:blipFill>
-                    <a:blip r:embed="rId23" cstate="print">
+                    <a:blip r:embed="rId25" cstate="print">
                       <a:extLst>
                         <a:ext uri="{28A0092B-C50C-407E-A947-70E740481C1C}">
                           <a14:useLocalDpi xmlns:a14="http://schemas.microsoft.com/office/drawing/2010/main" val="0"/>
@@ -2015,6 +2563,7 @@
           <w:lang w:eastAsia="pt-BR"/>
         </w:rPr>
       </w:pPr>
+      <w:proofErr w:type="spellStart"/>
       <w:r>
         <w:rPr>
           <w:lang w:eastAsia="pt-BR"/>
@@ -2028,6 +2577,7 @@
         </w:rPr>
         <w:t>ooter</w:t>
       </w:r>
+      <w:proofErr w:type="spellEnd"/>
       <w:r>
         <w:rPr>
           <w:lang w:eastAsia="pt-BR"/>
@@ -2072,7 +2622,7 @@
                     </pic:cNvPicPr>
                   </pic:nvPicPr>
                   <pic:blipFill>
-                    <a:blip r:embed="rId24" cstate="print">
+                    <a:blip r:embed="rId26" cstate="print">
                       <a:extLst>
                         <a:ext uri="{28A0092B-C50C-407E-A947-70E740481C1C}">
                           <a14:useLocalDpi xmlns:a14="http://schemas.microsoft.com/office/drawing/2010/main" val="0"/>
@@ -2115,6 +2665,7 @@
           <w:lang w:eastAsia="pt-BR"/>
         </w:rPr>
       </w:pPr>
+      <w:proofErr w:type="spellStart"/>
       <w:r>
         <w:rPr>
           <w:lang w:eastAsia="pt-BR"/>
@@ -2127,6 +2678,7 @@
         </w:rPr>
         <w:t>opup</w:t>
       </w:r>
+      <w:proofErr w:type="spellEnd"/>
       <w:r>
         <w:rPr>
           <w:lang w:eastAsia="pt-BR"/>
@@ -2195,7 +2747,7 @@
                     </pic:cNvPicPr>
                   </pic:nvPicPr>
                   <pic:blipFill>
-                    <a:blip r:embed="rId25">
+                    <a:blip r:embed="rId27">
                       <a:extLst>
                         <a:ext uri="{28A0092B-C50C-407E-A947-70E740481C1C}">
                           <a14:useLocalDpi xmlns:a14="http://schemas.microsoft.com/office/drawing/2010/main" val="0"/>
@@ -2333,7 +2885,7 @@
                     </pic:cNvPicPr>
                   </pic:nvPicPr>
                   <pic:blipFill>
-                    <a:blip r:embed="rId26">
+                    <a:blip r:embed="rId28">
                       <a:extLst>
                         <a:ext uri="{28A0092B-C50C-407E-A947-70E740481C1C}">
                           <a14:useLocalDpi xmlns:a14="http://schemas.microsoft.com/office/drawing/2010/main" val="0"/>
@@ -2468,7 +3020,7 @@
                     </pic:cNvPicPr>
                   </pic:nvPicPr>
                   <pic:blipFill>
-                    <a:blip r:embed="rId27">
+                    <a:blip r:embed="rId29">
                       <a:extLst>
                         <a:ext uri="{28A0092B-C50C-407E-A947-70E740481C1C}">
                           <a14:useLocalDpi xmlns:a14="http://schemas.microsoft.com/office/drawing/2010/main" val="0"/>
@@ -2536,11 +3088,19 @@
           <w:lang w:eastAsia="pt-BR"/>
         </w:rPr>
       </w:pPr>
-      <w:r>
-        <w:rPr>
-          <w:lang w:eastAsia="pt-BR"/>
-        </w:rPr>
-        <w:t>Cards de produtos</w:t>
+      <w:proofErr w:type="spellStart"/>
+      <w:r>
+        <w:rPr>
+          <w:lang w:eastAsia="pt-BR"/>
+        </w:rPr>
+        <w:t>Cards</w:t>
+      </w:r>
+      <w:proofErr w:type="spellEnd"/>
+      <w:r>
+        <w:rPr>
+          <w:lang w:eastAsia="pt-BR"/>
+        </w:rPr>
+        <w:t xml:space="preserve"> de produtos</w:t>
       </w:r>
       <w:r>
         <w:rPr>
@@ -2552,7 +3112,21 @@
         <w:rPr>
           <w:lang w:eastAsia="pt-BR"/>
         </w:rPr>
-        <w:t xml:space="preserve">Clique em qualquer card para abrir </w:t>
+        <w:t xml:space="preserve">Clique em qualquer </w:t>
+      </w:r>
+      <w:proofErr w:type="spellStart"/>
+      <w:r>
+        <w:rPr>
+          <w:lang w:eastAsia="pt-BR"/>
+        </w:rPr>
+        <w:t>card</w:t>
+      </w:r>
+      <w:proofErr w:type="spellEnd"/>
+      <w:r>
+        <w:rPr>
+          <w:lang w:eastAsia="pt-BR"/>
+        </w:rPr>
+        <w:t xml:space="preserve"> para abrir </w:t>
       </w:r>
       <w:r>
         <w:rPr>
@@ -2623,7 +3197,7 @@
                     </pic:cNvPicPr>
                   </pic:nvPicPr>
                   <pic:blipFill>
-                    <a:blip r:embed="rId28">
+                    <a:blip r:embed="rId30">
                       <a:extLst>
                         <a:ext uri="{28A0092B-C50C-407E-A947-70E740481C1C}">
                           <a14:useLocalDpi xmlns:a14="http://schemas.microsoft.com/office/drawing/2010/main" val="0"/>
@@ -2710,7 +3284,7 @@
                     </pic:cNvPicPr>
                   </pic:nvPicPr>
                   <pic:blipFill>
-                    <a:blip r:embed="rId29">
+                    <a:blip r:embed="rId31">
                       <a:extLst>
                         <a:ext uri="{28A0092B-C50C-407E-A947-70E740481C1C}">
                           <a14:useLocalDpi xmlns:a14="http://schemas.microsoft.com/office/drawing/2010/main" val="0"/>
@@ -2757,7 +3331,21 @@
         <w:rPr>
           <w:lang w:eastAsia="pt-BR"/>
         </w:rPr>
-        <w:t>Termos de Serviço: Clique no link do footer para acessar</w:t>
+        <w:t xml:space="preserve">Termos de Serviço: Clique no link do </w:t>
+      </w:r>
+      <w:proofErr w:type="spellStart"/>
+      <w:r>
+        <w:rPr>
+          <w:lang w:eastAsia="pt-BR"/>
+        </w:rPr>
+        <w:t>footer</w:t>
+      </w:r>
+      <w:proofErr w:type="spellEnd"/>
+      <w:r>
+        <w:rPr>
+          <w:lang w:eastAsia="pt-BR"/>
+        </w:rPr>
+        <w:t xml:space="preserve"> para acessar</w:t>
       </w:r>
       <w:r>
         <w:rPr>
@@ -2809,7 +3397,7 @@
                     </pic:cNvPicPr>
                   </pic:nvPicPr>
                   <pic:blipFill>
-                    <a:blip r:embed="rId30">
+                    <a:blip r:embed="rId32">
                       <a:extLst>
                         <a:ext uri="{28A0092B-C50C-407E-A947-70E740481C1C}">
                           <a14:useLocalDpi xmlns:a14="http://schemas.microsoft.com/office/drawing/2010/main" val="0"/>
@@ -2954,7 +3542,7 @@
                     </pic:cNvPicPr>
                   </pic:nvPicPr>
                   <pic:blipFill>
-                    <a:blip r:embed="rId31">
+                    <a:blip r:embed="rId33">
                       <a:extLst>
                         <a:ext uri="{28A0092B-C50C-407E-A947-70E740481C1C}">
                           <a14:useLocalDpi xmlns:a14="http://schemas.microsoft.com/office/drawing/2010/main" val="0"/>
@@ -2987,8 +3575,15 @@
       </w:r>
     </w:p>
     <w:sectPr>
+      <w:headerReference w:type="even" r:id="rId34"/>
+      <w:headerReference w:type="default" r:id="rId35"/>
+      <w:headerReference w:type="first" r:id="rId36"/>
       <w:pgSz w:w="11906" w:h="16838"/>
       <w:pgMar w:top="1417" w:right="1701" w:bottom="1417" w:left="1701" w:header="708" w:footer="708" w:gutter="0"/>
+      <w:pgBorders w:display="notFirstPage" w:offsetFrom="page">
+        <w:left w:val="single" w:sz="18" w:space="24" w:color="A02748"/>
+        <w:right w:val="single" w:sz="18" w:space="24" w:color="A02748"/>
+      </w:pgBorders>
       <w:cols w:space="708"/>
       <w:docGrid w:linePitch="360"/>
     </w:sectPr>
@@ -2996,8 +3591,88 @@
 </w:document>
 </file>
 
+<file path=word/endnotes.xml><?xml version="1.0" encoding="utf-8"?>
+<w:endnotes xmlns:wpc="http://schemas.microsoft.com/office/word/2010/wordprocessingCanvas" xmlns:cx="http://schemas.microsoft.com/office/drawing/2014/chartex" xmlns:mc="http://schemas.openxmlformats.org/markup-compatibility/2006" xmlns:o="urn:schemas-microsoft-com:office:office" xmlns:r="http://schemas.openxmlformats.org/officeDocument/2006/relationships" xmlns:m="http://schemas.openxmlformats.org/officeDocument/2006/math" xmlns:v="urn:schemas-microsoft-com:vml" xmlns:wp14="http://schemas.microsoft.com/office/word/2010/wordprocessingDrawing" xmlns:wp="http://schemas.openxmlformats.org/drawingml/2006/wordprocessingDrawing" xmlns:w10="urn:schemas-microsoft-com:office:word" xmlns:w="http://schemas.openxmlformats.org/wordprocessingml/2006/main" xmlns:w14="http://schemas.microsoft.com/office/word/2010/wordml" xmlns:w15="http://schemas.microsoft.com/office/word/2012/wordml" xmlns:w16se="http://schemas.microsoft.com/office/word/2015/wordml/symex" xmlns:wpg="http://schemas.microsoft.com/office/word/2010/wordprocessingGroup" xmlns:wpi="http://schemas.microsoft.com/office/word/2010/wordprocessingInk" xmlns:wne="http://schemas.microsoft.com/office/word/2006/wordml" xmlns:wps="http://schemas.microsoft.com/office/word/2010/wordprocessingShape" mc:Ignorable="w14 w15 w16se wp14">
+  <w:endnote w:type="separator" w:id="-1">
+    <w:p>
+      <w:pPr>
+        <w:spacing w:after="0" w:line="240" w:lineRule="auto"/>
+      </w:pPr>
+      <w:r>
+        <w:separator/>
+      </w:r>
+    </w:p>
+  </w:endnote>
+  <w:endnote w:type="continuationSeparator" w:id="0">
+    <w:p>
+      <w:pPr>
+        <w:spacing w:after="0" w:line="240" w:lineRule="auto"/>
+      </w:pPr>
+      <w:r>
+        <w:continuationSeparator/>
+      </w:r>
+    </w:p>
+  </w:endnote>
+</w:endnotes>
+</file>
+
+<file path=word/footnotes.xml><?xml version="1.0" encoding="utf-8"?>
+<w:footnotes xmlns:wpc="http://schemas.microsoft.com/office/word/2010/wordprocessingCanvas" xmlns:cx="http://schemas.microsoft.com/office/drawing/2014/chartex" xmlns:mc="http://schemas.openxmlformats.org/markup-compatibility/2006" xmlns:o="urn:schemas-microsoft-com:office:office" xmlns:r="http://schemas.openxmlformats.org/officeDocument/2006/relationships" xmlns:m="http://schemas.openxmlformats.org/officeDocument/2006/math" xmlns:v="urn:schemas-microsoft-com:vml" xmlns:wp14="http://schemas.microsoft.com/office/word/2010/wordprocessingDrawing" xmlns:wp="http://schemas.openxmlformats.org/drawingml/2006/wordprocessingDrawing" xmlns:w10="urn:schemas-microsoft-com:office:word" xmlns:w="http://schemas.openxmlformats.org/wordprocessingml/2006/main" xmlns:w14="http://schemas.microsoft.com/office/word/2010/wordml" xmlns:w15="http://schemas.microsoft.com/office/word/2012/wordml" xmlns:w16se="http://schemas.microsoft.com/office/word/2015/wordml/symex" xmlns:wpg="http://schemas.microsoft.com/office/word/2010/wordprocessingGroup" xmlns:wpi="http://schemas.microsoft.com/office/word/2010/wordprocessingInk" xmlns:wne="http://schemas.microsoft.com/office/word/2006/wordml" xmlns:wps="http://schemas.microsoft.com/office/word/2010/wordprocessingShape" mc:Ignorable="w14 w15 w16se wp14">
+  <w:footnote w:type="separator" w:id="-1">
+    <w:p>
+      <w:pPr>
+        <w:spacing w:after="0" w:line="240" w:lineRule="auto"/>
+      </w:pPr>
+      <w:r>
+        <w:separator/>
+      </w:r>
+    </w:p>
+  </w:footnote>
+  <w:footnote w:type="continuationSeparator" w:id="0">
+    <w:p>
+      <w:pPr>
+        <w:spacing w:after="0" w:line="240" w:lineRule="auto"/>
+      </w:pPr>
+      <w:r>
+        <w:continuationSeparator/>
+      </w:r>
+    </w:p>
+  </w:footnote>
+</w:footnotes>
+</file>
+
+<file path=word/header1.xml><?xml version="1.0" encoding="utf-8"?>
+<w:hdr xmlns:wpc="http://schemas.microsoft.com/office/word/2010/wordprocessingCanvas" xmlns:cx="http://schemas.microsoft.com/office/drawing/2014/chartex" xmlns:mc="http://schemas.openxmlformats.org/markup-compatibility/2006" xmlns:o="urn:schemas-microsoft-com:office:office" xmlns:r="http://schemas.openxmlformats.org/officeDocument/2006/relationships" xmlns:m="http://schemas.openxmlformats.org/officeDocument/2006/math" xmlns:v="urn:schemas-microsoft-com:vml" xmlns:wp14="http://schemas.microsoft.com/office/word/2010/wordprocessingDrawing" xmlns:wp="http://schemas.openxmlformats.org/drawingml/2006/wordprocessingDrawing" xmlns:w10="urn:schemas-microsoft-com:office:word" xmlns:w="http://schemas.openxmlformats.org/wordprocessingml/2006/main" xmlns:w14="http://schemas.microsoft.com/office/word/2010/wordml" xmlns:w15="http://schemas.microsoft.com/office/word/2012/wordml" xmlns:w16se="http://schemas.microsoft.com/office/word/2015/wordml/symex" xmlns:wpg="http://schemas.microsoft.com/office/word/2010/wordprocessingGroup" xmlns:wpi="http://schemas.microsoft.com/office/word/2010/wordprocessingInk" xmlns:wne="http://schemas.microsoft.com/office/word/2006/wordml" xmlns:wps="http://schemas.microsoft.com/office/word/2010/wordprocessingShape" mc:Ignorable="w14 w15 w16se wp14">
+  <w:p>
+    <w:pPr>
+      <w:pStyle w:val="Cabealho"/>
+    </w:pPr>
+  </w:p>
+</w:hdr>
+</file>
+
+<file path=word/header2.xml><?xml version="1.0" encoding="utf-8"?>
+<w:hdr xmlns:wpc="http://schemas.microsoft.com/office/word/2010/wordprocessingCanvas" xmlns:cx="http://schemas.microsoft.com/office/drawing/2014/chartex" xmlns:mc="http://schemas.openxmlformats.org/markup-compatibility/2006" xmlns:o="urn:schemas-microsoft-com:office:office" xmlns:r="http://schemas.openxmlformats.org/officeDocument/2006/relationships" xmlns:m="http://schemas.openxmlformats.org/officeDocument/2006/math" xmlns:v="urn:schemas-microsoft-com:vml" xmlns:wp14="http://schemas.microsoft.com/office/word/2010/wordprocessingDrawing" xmlns:wp="http://schemas.openxmlformats.org/drawingml/2006/wordprocessingDrawing" xmlns:w10="urn:schemas-microsoft-com:office:word" xmlns:w="http://schemas.openxmlformats.org/wordprocessingml/2006/main" xmlns:w14="http://schemas.microsoft.com/office/word/2010/wordml" xmlns:w15="http://schemas.microsoft.com/office/word/2012/wordml" xmlns:w16se="http://schemas.microsoft.com/office/word/2015/wordml/symex" xmlns:wpg="http://schemas.microsoft.com/office/word/2010/wordprocessingGroup" xmlns:wpi="http://schemas.microsoft.com/office/word/2010/wordprocessingInk" xmlns:wne="http://schemas.microsoft.com/office/word/2006/wordml" xmlns:wps="http://schemas.microsoft.com/office/word/2010/wordprocessingShape" mc:Ignorable="w14 w15 w16se wp14">
+  <w:p>
+    <w:pPr>
+      <w:pStyle w:val="Cabealho"/>
+    </w:pPr>
+  </w:p>
+</w:hdr>
+</file>
+
+<file path=word/header3.xml><?xml version="1.0" encoding="utf-8"?>
+<w:hdr xmlns:wpc="http://schemas.microsoft.com/office/word/2010/wordprocessingCanvas" xmlns:cx="http://schemas.microsoft.com/office/drawing/2014/chartex" xmlns:mc="http://schemas.openxmlformats.org/markup-compatibility/2006" xmlns:o="urn:schemas-microsoft-com:office:office" xmlns:r="http://schemas.openxmlformats.org/officeDocument/2006/relationships" xmlns:m="http://schemas.openxmlformats.org/officeDocument/2006/math" xmlns:v="urn:schemas-microsoft-com:vml" xmlns:wp14="http://schemas.microsoft.com/office/word/2010/wordprocessingDrawing" xmlns:wp="http://schemas.openxmlformats.org/drawingml/2006/wordprocessingDrawing" xmlns:w10="urn:schemas-microsoft-com:office:word" xmlns:w="http://schemas.openxmlformats.org/wordprocessingml/2006/main" xmlns:w14="http://schemas.microsoft.com/office/word/2010/wordml" xmlns:w15="http://schemas.microsoft.com/office/word/2012/wordml" xmlns:w16se="http://schemas.microsoft.com/office/word/2015/wordml/symex" xmlns:wpg="http://schemas.microsoft.com/office/word/2010/wordprocessingGroup" xmlns:wpi="http://schemas.microsoft.com/office/word/2010/wordprocessingInk" xmlns:wne="http://schemas.microsoft.com/office/word/2006/wordml" xmlns:wps="http://schemas.microsoft.com/office/word/2010/wordprocessingShape" mc:Ignorable="w14 w15 w16se wp14">
+  <w:p>
+    <w:pPr>
+      <w:pStyle w:val="Cabealho"/>
+    </w:pPr>
+  </w:p>
+</w:hdr>
+</file>
+
 <file path=word/numbering.xml><?xml version="1.0" encoding="utf-8"?>
-<w:numbering xmlns:wpc="http://schemas.microsoft.com/office/word/2010/wordprocessingCanvas" xmlns:cx="http://schemas.microsoft.com/office/drawing/2014/chartex" xmlns:cx1="http://schemas.microsoft.com/office/drawing/2015/9/8/chartex" xmlns:cx2="http://schemas.microsoft.com/office/drawing/2015/10/21/chartex" xmlns:cx3="http://schemas.microsoft.com/office/drawing/2016/5/9/chartex" xmlns:cx4="http://schemas.microsoft.com/office/drawing/2016/5/10/chartex" xmlns:cx5="http://schemas.microsoft.com/office/drawing/2016/5/11/chartex" xmlns:cx6="http://schemas.microsoft.com/office/drawing/2016/5/12/chartex" xmlns:cx7="http://schemas.microsoft.com/office/drawing/2016/5/13/chartex" xmlns:cx8="http://schemas.microsoft.com/office/drawing/2016/5/14/chartex" xmlns:mc="http://schemas.openxmlformats.org/markup-compatibility/2006" xmlns:aink="http://schemas.microsoft.com/office/drawing/2016/ink" xmlns:am3d="http://schemas.microsoft.com/office/drawing/2017/model3d" xmlns:o="urn:schemas-microsoft-com:office:office" xmlns:oel="http://schemas.microsoft.com/office/2019/extlst" xmlns:r="http://schemas.openxmlformats.org/officeDocument/2006/relationships" xmlns:m="http://schemas.openxmlformats.org/officeDocument/2006/math" xmlns:v="urn:schemas-microsoft-com:vml" xmlns:wp14="http://schemas.microsoft.com/office/word/2010/wordprocessingDrawing" xmlns:wp="http://schemas.openxmlformats.org/drawingml/2006/wordprocessingDrawing" xmlns:w10="urn:schemas-microsoft-com:office:word" xmlns:w="http://schemas.openxmlformats.org/wordprocessingml/2006/main" xmlns:w14="http://schemas.microsoft.com/office/word/2010/wordml" xmlns:w15="http://schemas.microsoft.com/office/word/2012/wordml" xmlns:w16cex="http://schemas.microsoft.com/office/word/2018/wordml/cex" xmlns:w16cid="http://schemas.microsoft.com/office/word/2016/wordml/cid" xmlns:w16="http://schemas.microsoft.com/office/word/2018/wordml" xmlns:w16du="http://schemas.microsoft.com/office/word/2023/wordml/word16du" xmlns:w16sdtdh="http://schemas.microsoft.com/office/word/2020/wordml/sdtdatahash" xmlns:w16sdtfl="http://schemas.microsoft.com/office/word/2024/wordml/sdtformatlock" xmlns:w16se="http://schemas.microsoft.com/office/word/2015/wordml/symex" xmlns:wpg="http://schemas.microsoft.com/office/word/2010/wordprocessingGroup" xmlns:wpi="http://schemas.microsoft.com/office/word/2010/wordprocessingInk" xmlns:wne="http://schemas.microsoft.com/office/word/2006/wordml" xmlns:wps="http://schemas.microsoft.com/office/word/2010/wordprocessingShape" mc:Ignorable="w14 w15 w16se w16cid w16 w16cex w16sdtdh w16sdtfl w16du wp14">
+<w:numbering xmlns:wpc="http://schemas.microsoft.com/office/word/2010/wordprocessingCanvas" xmlns:cx="http://schemas.microsoft.com/office/drawing/2014/chartex" xmlns:mc="http://schemas.openxmlformats.org/markup-compatibility/2006" xmlns:o="urn:schemas-microsoft-com:office:office" xmlns:r="http://schemas.openxmlformats.org/officeDocument/2006/relationships" xmlns:m="http://schemas.openxmlformats.org/officeDocument/2006/math" xmlns:v="urn:schemas-microsoft-com:vml" xmlns:wp14="http://schemas.microsoft.com/office/word/2010/wordprocessingDrawing" xmlns:wp="http://schemas.openxmlformats.org/drawingml/2006/wordprocessingDrawing" xmlns:w10="urn:schemas-microsoft-com:office:word" xmlns:w="http://schemas.openxmlformats.org/wordprocessingml/2006/main" xmlns:w14="http://schemas.microsoft.com/office/word/2010/wordml" xmlns:w15="http://schemas.microsoft.com/office/word/2012/wordml" xmlns:w16se="http://schemas.microsoft.com/office/word/2015/wordml/symex" xmlns:wpg="http://schemas.microsoft.com/office/word/2010/wordprocessingGroup" xmlns:wpi="http://schemas.microsoft.com/office/word/2010/wordprocessingInk" xmlns:wne="http://schemas.microsoft.com/office/word/2006/wordml" xmlns:wps="http://schemas.microsoft.com/office/word/2010/wordprocessingShape" mc:Ignorable="w14 w15 w16se wp14">
   <w:abstractNum w:abstractNumId="0" w15:restartNumberingAfterBreak="0">
     <w:nsid w:val="039C36E8"/>
     <w:multiLevelType w:val="hybridMultilevel"/>
@@ -3825,32 +4500,32 @@
       </w:rPr>
     </w:lvl>
   </w:abstractNum>
-  <w:num w:numId="1" w16cid:durableId="1378241822">
+  <w:num w:numId="1">
     <w:abstractNumId w:val="1"/>
   </w:num>
-  <w:num w:numId="2" w16cid:durableId="1406414395">
+  <w:num w:numId="2">
     <w:abstractNumId w:val="0"/>
   </w:num>
-  <w:num w:numId="3" w16cid:durableId="1311056748">
+  <w:num w:numId="3">
     <w:abstractNumId w:val="4"/>
   </w:num>
-  <w:num w:numId="4" w16cid:durableId="265773972">
+  <w:num w:numId="4">
     <w:abstractNumId w:val="6"/>
   </w:num>
-  <w:num w:numId="5" w16cid:durableId="350912397">
+  <w:num w:numId="5">
     <w:abstractNumId w:val="3"/>
   </w:num>
-  <w:num w:numId="6" w16cid:durableId="1554541956">
+  <w:num w:numId="6">
     <w:abstractNumId w:val="2"/>
   </w:num>
-  <w:num w:numId="7" w16cid:durableId="1992827682">
+  <w:num w:numId="7">
     <w:abstractNumId w:val="5"/>
   </w:num>
 </w:numbering>
 </file>
 
 <file path=word/styles.xml><?xml version="1.0" encoding="utf-8"?>
-<w:styles xmlns:mc="http://schemas.openxmlformats.org/markup-compatibility/2006" xmlns:r="http://schemas.openxmlformats.org/officeDocument/2006/relationships" xmlns:w="http://schemas.openxmlformats.org/wordprocessingml/2006/main" xmlns:w14="http://schemas.microsoft.com/office/word/2010/wordml" xmlns:w15="http://schemas.microsoft.com/office/word/2012/wordml" xmlns:w16cex="http://schemas.microsoft.com/office/word/2018/wordml/cex" xmlns:w16cid="http://schemas.microsoft.com/office/word/2016/wordml/cid" xmlns:w16="http://schemas.microsoft.com/office/word/2018/wordml" xmlns:w16du="http://schemas.microsoft.com/office/word/2023/wordml/word16du" xmlns:w16sdtdh="http://schemas.microsoft.com/office/word/2020/wordml/sdtdatahash" xmlns:w16sdtfl="http://schemas.microsoft.com/office/word/2024/wordml/sdtformatlock" xmlns:w16se="http://schemas.microsoft.com/office/word/2015/wordml/symex" mc:Ignorable="w14 w15 w16se w16cid w16 w16cex w16sdtdh w16sdtfl w16du">
+<w:styles xmlns:mc="http://schemas.openxmlformats.org/markup-compatibility/2006" xmlns:r="http://schemas.openxmlformats.org/officeDocument/2006/relationships" xmlns:w="http://schemas.openxmlformats.org/wordprocessingml/2006/main" xmlns:w14="http://schemas.microsoft.com/office/word/2010/wordml" xmlns:w15="http://schemas.microsoft.com/office/word/2012/wordml" xmlns:w16se="http://schemas.microsoft.com/office/word/2015/wordml/symex" mc:Ignorable="w14 w15 w16se">
   <w:docDefaults>
     <w:rPrDefault>
       <w:rPr>
@@ -3866,7 +4541,7 @@
       </w:pPr>
     </w:pPrDefault>
   </w:docDefaults>
-  <w:latentStyles w:defLockedState="0" w:defUIPriority="99" w:defSemiHidden="0" w:defUnhideWhenUsed="0" w:defQFormat="0" w:count="376">
+  <w:latentStyles w:defLockedState="0" w:defUIPriority="99" w:defSemiHidden="0" w:defUnhideWhenUsed="0" w:defQFormat="0" w:count="371">
     <w:lsdException w:name="Normal" w:uiPriority="0" w:qFormat="1"/>
     <w:lsdException w:name="heading 1" w:uiPriority="9" w:qFormat="1"/>
     <w:lsdException w:name="heading 2" w:semiHidden="1" w:uiPriority="9" w:unhideWhenUsed="1" w:qFormat="1"/>
@@ -4238,11 +4913,6 @@
     <w:lsdException w:name="List Table 5 Dark Accent 6" w:uiPriority="50"/>
     <w:lsdException w:name="List Table 6 Colorful Accent 6" w:uiPriority="51"/>
     <w:lsdException w:name="List Table 7 Colorful Accent 6" w:uiPriority="52"/>
-    <w:lsdException w:name="Mention" w:semiHidden="1" w:unhideWhenUsed="1"/>
-    <w:lsdException w:name="Smart Hyperlink" w:semiHidden="1" w:unhideWhenUsed="1"/>
-    <w:lsdException w:name="Hashtag" w:semiHidden="1" w:unhideWhenUsed="1"/>
-    <w:lsdException w:name="Unresolved Mention" w:semiHidden="1" w:unhideWhenUsed="1"/>
-    <w:lsdException w:name="Smart Link" w:semiHidden="1" w:unhideWhenUsed="1"/>
   </w:latentStyles>
   <w:style w:type="paragraph" w:default="1" w:styleId="Normal">
     <w:name w:val="Normal"/>
@@ -4305,6 +4975,7 @@
   <w:style w:type="character" w:default="1" w:styleId="Fontepargpadro">
     <w:name w:val="Default Paragraph Font"/>
     <w:uiPriority w:val="1"/>
+    <w:semiHidden/>
     <w:unhideWhenUsed/>
   </w:style>
   <w:style w:type="table" w:default="1" w:styleId="Tabelanormal">
@@ -4486,6 +5157,58 @@
       <w:ind w:left="720"/>
       <w:contextualSpacing/>
     </w:pPr>
+  </w:style>
+  <w:style w:type="paragraph" w:styleId="Cabealho">
+    <w:name w:val="header"/>
+    <w:basedOn w:val="Normal"/>
+    <w:link w:val="CabealhoChar"/>
+    <w:uiPriority w:val="99"/>
+    <w:unhideWhenUsed/>
+    <w:rsid w:val="004B364C"/>
+    <w:pPr>
+      <w:tabs>
+        <w:tab w:val="center" w:pos="4252"/>
+        <w:tab w:val="right" w:pos="8504"/>
+      </w:tabs>
+      <w:spacing w:after="0" w:line="240" w:lineRule="auto"/>
+    </w:pPr>
+  </w:style>
+  <w:style w:type="character" w:customStyle="1" w:styleId="CabealhoChar">
+    <w:name w:val="Cabeçalho Char"/>
+    <w:basedOn w:val="Fontepargpadro"/>
+    <w:link w:val="Cabealho"/>
+    <w:uiPriority w:val="99"/>
+    <w:rsid w:val="004B364C"/>
+    <w:rPr>
+      <w:rFonts w:ascii="Arial" w:hAnsi="Arial"/>
+      <w:sz w:val="24"/>
+    </w:rPr>
+  </w:style>
+  <w:style w:type="paragraph" w:styleId="Rodap">
+    <w:name w:val="footer"/>
+    <w:basedOn w:val="Normal"/>
+    <w:link w:val="RodapChar"/>
+    <w:uiPriority w:val="99"/>
+    <w:unhideWhenUsed/>
+    <w:rsid w:val="004B364C"/>
+    <w:pPr>
+      <w:tabs>
+        <w:tab w:val="center" w:pos="4252"/>
+        <w:tab w:val="right" w:pos="8504"/>
+      </w:tabs>
+      <w:spacing w:after="0" w:line="240" w:lineRule="auto"/>
+    </w:pPr>
+  </w:style>
+  <w:style w:type="character" w:customStyle="1" w:styleId="RodapChar">
+    <w:name w:val="Rodapé Char"/>
+    <w:basedOn w:val="Fontepargpadro"/>
+    <w:link w:val="Rodap"/>
+    <w:uiPriority w:val="99"/>
+    <w:rsid w:val="004B364C"/>
+    <w:rPr>
+      <w:rFonts w:ascii="Arial" w:hAnsi="Arial"/>
+      <w:sz w:val="24"/>
+    </w:rPr>
   </w:style>
 </w:styles>
 </file>
@@ -4756,7 +5479,7 @@
 </file>
 
 <file path=customXml/itemProps1.xml><?xml version="1.0" encoding="utf-8"?>
-<ds:datastoreItem xmlns:ds="http://schemas.openxmlformats.org/officeDocument/2006/customXml" ds:itemID="{DA8C7805-9757-483B-8EC4-DC8F3BAD4269}">
+<ds:datastoreItem xmlns:ds="http://schemas.openxmlformats.org/officeDocument/2006/customXml" ds:itemID="{02896FE1-F30F-4006-928A-F0CEB203761D}">
   <ds:schemaRefs>
     <ds:schemaRef ds:uri="http://schemas.openxmlformats.org/officeDocument/2006/bibliography"/>
   </ds:schemaRefs>

</xml_diff>

<commit_message>
espero que as penultimas alterações...
</commit_message>
<xml_diff>
--- a/Anotações/Manual_Site.docx
+++ b/Anotações/Manual_Site.docx
@@ -1,6 +1,6 @@
 
 <file path=word/document.xml><?xml version="1.0" encoding="utf-8"?>
-<w:document xmlns:wpc="http://schemas.microsoft.com/office/word/2010/wordprocessingCanvas" xmlns:cx="http://schemas.microsoft.com/office/drawing/2014/chartex" xmlns:mc="http://schemas.openxmlformats.org/markup-compatibility/2006" xmlns:o="urn:schemas-microsoft-com:office:office" xmlns:r="http://schemas.openxmlformats.org/officeDocument/2006/relationships" xmlns:m="http://schemas.openxmlformats.org/officeDocument/2006/math" xmlns:v="urn:schemas-microsoft-com:vml" xmlns:wp14="http://schemas.microsoft.com/office/word/2010/wordprocessingDrawing" xmlns:wp="http://schemas.openxmlformats.org/drawingml/2006/wordprocessingDrawing" xmlns:w10="urn:schemas-microsoft-com:office:word" xmlns:w="http://schemas.openxmlformats.org/wordprocessingml/2006/main" xmlns:w14="http://schemas.microsoft.com/office/word/2010/wordml" xmlns:w15="http://schemas.microsoft.com/office/word/2012/wordml" xmlns:w16se="http://schemas.microsoft.com/office/word/2015/wordml/symex" xmlns:wpg="http://schemas.microsoft.com/office/word/2010/wordprocessingGroup" xmlns:wpi="http://schemas.microsoft.com/office/word/2010/wordprocessingInk" xmlns:wne="http://schemas.microsoft.com/office/word/2006/wordml" xmlns:wps="http://schemas.microsoft.com/office/word/2010/wordprocessingShape" mc:Ignorable="w14 w15 w16se wp14">
+<w:document xmlns:wpc="http://schemas.microsoft.com/office/word/2010/wordprocessingCanvas" xmlns:cx="http://schemas.microsoft.com/office/drawing/2014/chartex" xmlns:cx1="http://schemas.microsoft.com/office/drawing/2015/9/8/chartex" xmlns:cx2="http://schemas.microsoft.com/office/drawing/2015/10/21/chartex" xmlns:cx3="http://schemas.microsoft.com/office/drawing/2016/5/9/chartex" xmlns:cx4="http://schemas.microsoft.com/office/drawing/2016/5/10/chartex" xmlns:cx5="http://schemas.microsoft.com/office/drawing/2016/5/11/chartex" xmlns:cx6="http://schemas.microsoft.com/office/drawing/2016/5/12/chartex" xmlns:cx7="http://schemas.microsoft.com/office/drawing/2016/5/13/chartex" xmlns:cx8="http://schemas.microsoft.com/office/drawing/2016/5/14/chartex" xmlns:mc="http://schemas.openxmlformats.org/markup-compatibility/2006" xmlns:aink="http://schemas.microsoft.com/office/drawing/2016/ink" xmlns:am3d="http://schemas.microsoft.com/office/drawing/2017/model3d" xmlns:o="urn:schemas-microsoft-com:office:office" xmlns:oel="http://schemas.microsoft.com/office/2019/extlst" xmlns:r="http://schemas.openxmlformats.org/officeDocument/2006/relationships" xmlns:m="http://schemas.openxmlformats.org/officeDocument/2006/math" xmlns:v="urn:schemas-microsoft-com:vml" xmlns:wp14="http://schemas.microsoft.com/office/word/2010/wordprocessingDrawing" xmlns:wp="http://schemas.openxmlformats.org/drawingml/2006/wordprocessingDrawing" xmlns:w10="urn:schemas-microsoft-com:office:word" xmlns:w="http://schemas.openxmlformats.org/wordprocessingml/2006/main" xmlns:w14="http://schemas.microsoft.com/office/word/2010/wordml" xmlns:w15="http://schemas.microsoft.com/office/word/2012/wordml" xmlns:w16cex="http://schemas.microsoft.com/office/word/2018/wordml/cex" xmlns:w16cid="http://schemas.microsoft.com/office/word/2016/wordml/cid" xmlns:w16="http://schemas.microsoft.com/office/word/2018/wordml" xmlns:w16du="http://schemas.microsoft.com/office/word/2023/wordml/word16du" xmlns:w16sdtdh="http://schemas.microsoft.com/office/word/2020/wordml/sdtdatahash" xmlns:w16sdtfl="http://schemas.microsoft.com/office/word/2024/wordml/sdtformatlock" xmlns:w16se="http://schemas.microsoft.com/office/word/2015/wordml/symex" xmlns:wpg="http://schemas.microsoft.com/office/word/2010/wordprocessingGroup" xmlns:wpi="http://schemas.microsoft.com/office/word/2010/wordprocessingInk" xmlns:wne="http://schemas.microsoft.com/office/word/2006/wordml" xmlns:wps="http://schemas.microsoft.com/office/word/2010/wordprocessingShape" mc:Ignorable="w14 w15 w16se w16cid w16 w16cex w16sdtdh w16sdtfl w16du wp14">
   <w:body>
     <w:p>
       <w:pPr>
@@ -9,7 +9,6 @@
           <w:lang w:eastAsia="pt-BR"/>
         </w:rPr>
       </w:pPr>
-      <w:bookmarkStart w:id="0" w:name="_GoBack"/>
       <w:r>
         <w:rPr>
           <w:noProof/>
@@ -18,7 +17,7 @@
         <mc:AlternateContent>
           <mc:Choice Requires="wps">
             <w:drawing>
-              <wp:anchor distT="0" distB="0" distL="114300" distR="114300" simplePos="0" relativeHeight="251659264" behindDoc="0" locked="0" layoutInCell="1" allowOverlap="1" wp14:anchorId="1BD66B75" wp14:editId="7A50FD74">
+              <wp:anchor distT="0" distB="0" distL="114300" distR="114300" simplePos="0" relativeHeight="251659264" behindDoc="0" locked="0" layoutInCell="1" allowOverlap="1" wp14:anchorId="1BD66B75" wp14:editId="5ED2A984">
                 <wp:simplePos x="0" y="0"/>
                 <wp:positionH relativeFrom="page">
                   <wp:posOffset>-559558</wp:posOffset>
@@ -44,7 +43,7 @@
                           <a:avLst/>
                         </a:prstGeom>
                         <a:solidFill>
-                          <a:srgbClr val="A02748"/>
+                          <a:srgbClr val="00012A"/>
                         </a:solidFill>
                         <a:ln>
                           <a:noFill/>
@@ -86,14 +85,13 @@
           </mc:Choice>
           <mc:Fallback>
             <w:pict>
-              <v:rect w14:anchorId="7E4FAC0A" id="Retângulo 1" o:spid="_x0000_s1026" style="position:absolute;margin-left:-44.05pt;margin-top:-70.85pt;width:72.35pt;height:855.4pt;z-index:251659264;visibility:visible;mso-wrap-style:square;mso-width-percent:0;mso-height-percent:0;mso-wrap-distance-left:9pt;mso-wrap-distance-top:0;mso-wrap-distance-right:9pt;mso-wrap-distance-bottom:0;mso-position-horizontal:absolute;mso-position-horizontal-relative:page;mso-position-vertical:absolute;mso-position-vertical-relative:text;mso-width-percent:0;mso-height-percent:0;mso-width-relative:margin;mso-height-relative:margin;v-text-anchor:middle" o:gfxdata="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" fillcolor="#a02748" stroked="f" strokeweight="1pt">
+              <v:rect w14:anchorId="05000C62" id="Retângulo 1" o:spid="_x0000_s1026" style="position:absolute;margin-left:-44.05pt;margin-top:-70.85pt;width:72.35pt;height:855.4pt;z-index:251659264;visibility:visible;mso-wrap-style:square;mso-width-percent:0;mso-height-percent:0;mso-wrap-distance-left:9pt;mso-wrap-distance-top:0;mso-wrap-distance-right:9pt;mso-wrap-distance-bottom:0;mso-position-horizontal:absolute;mso-position-horizontal-relative:page;mso-position-vertical:absolute;mso-position-vertical-relative:text;mso-width-percent:0;mso-height-percent:0;mso-width-relative:margin;mso-height-relative:margin;v-text-anchor:middle" o:gfxdata="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" fillcolor="#00012a" stroked="f" strokeweight="1pt">
                 <w10:wrap anchorx="page"/>
               </v:rect>
             </w:pict>
           </mc:Fallback>
         </mc:AlternateContent>
       </w:r>
-      <w:bookmarkEnd w:id="0"/>
       <w:r>
         <w:rPr>
           <w:noProof/>
@@ -102,7 +100,7 @@
         <mc:AlternateContent>
           <mc:Choice Requires="wps">
             <w:drawing>
-              <wp:anchor distT="0" distB="0" distL="114300" distR="114300" simplePos="0" relativeHeight="251662336" behindDoc="0" locked="0" layoutInCell="1" allowOverlap="1" wp14:anchorId="1F1AB489" wp14:editId="2F867171">
+              <wp:anchor distT="0" distB="0" distL="114300" distR="114300" simplePos="0" relativeHeight="251662336" behindDoc="0" locked="0" layoutInCell="1" allowOverlap="1" wp14:anchorId="1F1AB489" wp14:editId="52BE17A6">
                 <wp:simplePos x="0" y="0"/>
                 <wp:positionH relativeFrom="page">
                   <wp:posOffset>7192369</wp:posOffset>
@@ -128,7 +126,7 @@
                           <a:avLst/>
                         </a:prstGeom>
                         <a:solidFill>
-                          <a:srgbClr val="A02748"/>
+                          <a:srgbClr val="00012A"/>
                         </a:solidFill>
                         <a:ln>
                           <a:noFill/>
@@ -170,7 +168,7 @@
           </mc:Choice>
           <mc:Fallback>
             <w:pict>
-              <v:rect w14:anchorId="221F309C" id="Retângulo 5" o:spid="_x0000_s1026" style="position:absolute;margin-left:566.35pt;margin-top:-70.85pt;width:50.5pt;height:862.9pt;z-index:251662336;visibility:visible;mso-wrap-style:square;mso-width-percent:0;mso-height-percent:0;mso-wrap-distance-left:9pt;mso-wrap-distance-top:0;mso-wrap-distance-right:9pt;mso-wrap-distance-bottom:0;mso-position-horizontal:absolute;mso-position-horizontal-relative:page;mso-position-vertical:absolute;mso-position-vertical-relative:text;mso-width-percent:0;mso-height-percent:0;mso-width-relative:margin;mso-height-relative:margin;v-text-anchor:middle" o:gfxdata="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" fillcolor="#a02748" stroked="f" strokeweight="1pt">
+              <v:rect w14:anchorId="2F7D8C48" id="Retângulo 5" o:spid="_x0000_s1026" style="position:absolute;margin-left:566.35pt;margin-top:-70.85pt;width:50.5pt;height:862.9pt;z-index:251662336;visibility:visible;mso-wrap-style:square;mso-width-percent:0;mso-height-percent:0;mso-wrap-distance-left:9pt;mso-wrap-distance-top:0;mso-wrap-distance-right:9pt;mso-wrap-distance-bottom:0;mso-position-horizontal:absolute;mso-position-horizontal-relative:page;mso-position-vertical:absolute;mso-position-vertical-relative:text;mso-width-percent:0;mso-height-percent:0;mso-width-relative:margin;mso-height-relative:margin;v-text-anchor:middle" o:gfxdata="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" fillcolor="#00012a" stroked="f" strokeweight="1pt">
                 <w10:wrap anchorx="page"/>
               </v:rect>
             </w:pict>
@@ -185,7 +183,7 @@
         <mc:AlternateContent>
           <mc:Choice Requires="wps">
             <w:drawing>
-              <wp:anchor distT="0" distB="0" distL="114300" distR="114300" simplePos="0" relativeHeight="251661312" behindDoc="0" locked="0" layoutInCell="1" allowOverlap="1" wp14:anchorId="40FF0442" wp14:editId="3F34E98D">
+              <wp:anchor distT="0" distB="0" distL="114300" distR="114300" simplePos="0" relativeHeight="251661312" behindDoc="0" locked="0" layoutInCell="1" allowOverlap="1" wp14:anchorId="40FF0442" wp14:editId="0C00F893">
                 <wp:simplePos x="0" y="0"/>
                 <wp:positionH relativeFrom="page">
                   <wp:posOffset>7014949</wp:posOffset>
@@ -211,7 +209,7 @@
                           <a:avLst/>
                         </a:prstGeom>
                         <a:solidFill>
-                          <a:srgbClr val="EECBAD"/>
+                          <a:srgbClr val="ACABA9"/>
                         </a:solidFill>
                         <a:ln>
                           <a:noFill/>
@@ -253,7 +251,7 @@
           </mc:Choice>
           <mc:Fallback>
             <w:pict>
-              <v:rect w14:anchorId="0A0B43A5" id="Retângulo 4" o:spid="_x0000_s1026" style="position:absolute;margin-left:552.35pt;margin-top:-70.85pt;width:42.5pt;height:857.55pt;z-index:251661312;visibility:visible;mso-wrap-style:square;mso-width-percent:0;mso-height-percent:0;mso-wrap-distance-left:9pt;mso-wrap-distance-top:0;mso-wrap-distance-right:9pt;mso-wrap-distance-bottom:0;mso-position-horizontal:absolute;mso-position-horizontal-relative:page;mso-position-vertical:absolute;mso-position-vertical-relative:text;mso-width-percent:0;mso-height-percent:0;mso-width-relative:margin;mso-height-relative:margin;v-text-anchor:middle" o:gfxdata="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" fillcolor="#eecbad" stroked="f" strokeweight="1pt">
+              <v:rect w14:anchorId="5A4C7847" id="Retângulo 4" o:spid="_x0000_s1026" style="position:absolute;margin-left:552.35pt;margin-top:-70.85pt;width:42.5pt;height:857.55pt;z-index:251661312;visibility:visible;mso-wrap-style:square;mso-width-percent:0;mso-height-percent:0;mso-wrap-distance-left:9pt;mso-wrap-distance-top:0;mso-wrap-distance-right:9pt;mso-wrap-distance-bottom:0;mso-position-horizontal:absolute;mso-position-horizontal-relative:page;mso-position-vertical:absolute;mso-position-vertical-relative:text;mso-width-percent:0;mso-height-percent:0;mso-width-relative:margin;mso-height-relative:margin;v-text-anchor:middle" o:gfxdata="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" fillcolor="#acaba9" stroked="f" strokeweight="1pt">
                 <w10:wrap anchorx="page"/>
               </v:rect>
             </w:pict>
@@ -268,7 +266,7 @@
         <mc:AlternateContent>
           <mc:Choice Requires="wps">
             <w:drawing>
-              <wp:anchor distT="0" distB="0" distL="114300" distR="114300" simplePos="0" relativeHeight="251658239" behindDoc="0" locked="0" layoutInCell="1" allowOverlap="1" wp14:anchorId="415DE84F" wp14:editId="715981A1">
+              <wp:anchor distT="0" distB="0" distL="114300" distR="114300" simplePos="0" relativeHeight="251658239" behindDoc="0" locked="0" layoutInCell="1" allowOverlap="1" wp14:anchorId="415DE84F" wp14:editId="1A2802D2">
                 <wp:simplePos x="0" y="0"/>
                 <wp:positionH relativeFrom="page">
                   <wp:align>left</wp:align>
@@ -294,7 +292,7 @@
                           <a:avLst/>
                         </a:prstGeom>
                         <a:solidFill>
-                          <a:srgbClr val="EECBAD"/>
+                          <a:srgbClr val="ACABA9"/>
                         </a:solidFill>
                         <a:ln>
                           <a:noFill/>
@@ -336,7 +334,7 @@
           </mc:Choice>
           <mc:Fallback>
             <w:pict>
-              <v:rect w14:anchorId="456C38D3" id="Retângulo 2" o:spid="_x0000_s1026" style="position:absolute;margin-left:0;margin-top:-70.85pt;width:42.5pt;height:848.95pt;z-index:251658239;visibility:visible;mso-wrap-style:square;mso-width-percent:0;mso-height-percent:0;mso-wrap-distance-left:9pt;mso-wrap-distance-top:0;mso-wrap-distance-right:9pt;mso-wrap-distance-bottom:0;mso-position-horizontal:left;mso-position-horizontal-relative:page;mso-position-vertical:absolute;mso-position-vertical-relative:text;mso-width-percent:0;mso-height-percent:0;mso-width-relative:margin;mso-height-relative:margin;v-text-anchor:middle" o:gfxdata="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" fillcolor="#eecbad" stroked="f" strokeweight="1pt">
+              <v:rect w14:anchorId="2D249FE4" id="Retângulo 2" o:spid="_x0000_s1026" style="position:absolute;margin-left:0;margin-top:-70.85pt;width:42.5pt;height:848.95pt;z-index:251658239;visibility:visible;mso-wrap-style:square;mso-width-percent:0;mso-height-percent:0;mso-wrap-distance-left:9pt;mso-wrap-distance-top:0;mso-wrap-distance-right:9pt;mso-wrap-distance-bottom:0;mso-position-horizontal:left;mso-position-horizontal-relative:page;mso-position-vertical:absolute;mso-position-vertical-relative:text;mso-width-percent:0;mso-height-percent:0;mso-width-relative:margin;mso-height-relative:margin;v-text-anchor:middle" o:gfxdata="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" fillcolor="#acaba9" stroked="f" strokeweight="1pt">
                 <w10:wrap anchorx="page"/>
               </v:rect>
             </w:pict>
@@ -348,6 +346,8 @@
       <w:pPr>
         <w:pStyle w:val="Ttulo1"/>
         <w:rPr>
+          <w:sz w:val="32"/>
+          <w:szCs w:val="24"/>
           <w:lang w:eastAsia="pt-BR"/>
         </w:rPr>
       </w:pPr>
@@ -365,10 +365,10 @@
           <w:lang w:eastAsia="pt-BR"/>
         </w:rPr>
         <w:drawing>
-          <wp:inline distT="0" distB="0" distL="0" distR="0" wp14:anchorId="5AE1DDA7" wp14:editId="5A01877B">
-            <wp:extent cx="2880000" cy="2880000"/>
+          <wp:inline distT="0" distB="0" distL="0" distR="0" wp14:anchorId="11E860DC" wp14:editId="5869824A">
+            <wp:extent cx="3600000" cy="3600000"/>
             <wp:effectExtent l="0" t="0" r="0" b="0"/>
-            <wp:docPr id="1080377716" name="Imagem 2"/>
+            <wp:docPr id="1498980046" name="Imagem 5"/>
             <wp:cNvGraphicFramePr>
               <a:graphicFrameLocks xmlns:a="http://schemas.openxmlformats.org/drawingml/2006/main" noChangeAspect="1"/>
             </wp:cNvGraphicFramePr>
@@ -376,7 +376,7 @@
               <a:graphicData uri="http://schemas.openxmlformats.org/drawingml/2006/picture">
                 <pic:pic xmlns:pic="http://schemas.openxmlformats.org/drawingml/2006/picture">
                   <pic:nvPicPr>
-                    <pic:cNvPr id="0" name="Picture 2"/>
+                    <pic:cNvPr id="0" name="Picture 1"/>
                     <pic:cNvPicPr>
                       <a:picLocks noChangeAspect="1" noChangeArrowheads="1"/>
                     </pic:cNvPicPr>
@@ -397,7 +397,7 @@
                   <pic:spPr bwMode="auto">
                     <a:xfrm>
                       <a:off x="0" y="0"/>
-                      <a:ext cx="2880000" cy="2880000"/>
+                      <a:ext cx="3600000" cy="3600000"/>
                     </a:xfrm>
                     <a:prstGeom prst="rect">
                       <a:avLst/>
@@ -545,14 +545,14 @@
         <w:rPr>
           <w:lang w:eastAsia="pt-BR"/>
         </w:rPr>
-        <w:t>Sobre, Localização e Redes sociais</w:t>
+        <w:t>Sobre, Localização</w:t>
       </w:r>
       <w:proofErr w:type="gramEnd"/>
       <w:r>
         <w:rPr>
           <w:lang w:eastAsia="pt-BR"/>
         </w:rPr>
-        <w:t>). Funciona como menu de navegação principal.</w:t>
+        <w:t xml:space="preserve"> e Redes sociais). Funciona como menu de navegação principal.</w:t>
       </w:r>
     </w:p>
     <w:p>
@@ -569,10 +569,10 @@
           <w:lang w:eastAsia="pt-BR"/>
         </w:rPr>
         <w:drawing>
-          <wp:inline distT="0" distB="0" distL="0" distR="0" wp14:anchorId="67295DB0" wp14:editId="354E4479">
+          <wp:inline distT="0" distB="0" distL="0" distR="0" wp14:anchorId="07DD136C" wp14:editId="3CA4CED9">
             <wp:extent cx="4320000" cy="220952"/>
             <wp:effectExtent l="0" t="0" r="0" b="8255"/>
-            <wp:docPr id="1166357758" name="Imagem 3"/>
+            <wp:docPr id="1580644341" name="Imagem 5"/>
             <wp:cNvGraphicFramePr>
               <a:graphicFrameLocks xmlns:a="http://schemas.openxmlformats.org/drawingml/2006/main" noChangeAspect="1"/>
             </wp:cNvGraphicFramePr>
@@ -580,7 +580,7 @@
               <a:graphicData uri="http://schemas.openxmlformats.org/drawingml/2006/picture">
                 <pic:pic xmlns:pic="http://schemas.openxmlformats.org/drawingml/2006/picture">
                   <pic:nvPicPr>
-                    <pic:cNvPr id="0" name="Picture 2"/>
+                    <pic:cNvPr id="0" name="Picture 1"/>
                     <pic:cNvPicPr>
                       <a:picLocks noChangeAspect="1" noChangeArrowheads="1"/>
                     </pic:cNvPicPr>
@@ -656,10 +656,10 @@
           <w:lang w:eastAsia="pt-BR"/>
         </w:rPr>
         <w:drawing>
-          <wp:inline distT="0" distB="0" distL="0" distR="0" wp14:anchorId="68987BCD" wp14:editId="11884F13">
-            <wp:extent cx="4320000" cy="2087619"/>
-            <wp:effectExtent l="0" t="0" r="4445" b="8255"/>
-            <wp:docPr id="1420777782" name="Imagem 5"/>
+          <wp:inline distT="0" distB="0" distL="0" distR="0" wp14:anchorId="629ABCC8" wp14:editId="27928FD6">
+            <wp:extent cx="4320000" cy="1950476"/>
+            <wp:effectExtent l="0" t="0" r="4445" b="0"/>
+            <wp:docPr id="821098204" name="Imagem 6"/>
             <wp:cNvGraphicFramePr>
               <a:graphicFrameLocks xmlns:a="http://schemas.openxmlformats.org/drawingml/2006/main" noChangeAspect="1"/>
             </wp:cNvGraphicFramePr>
@@ -667,7 +667,7 @@
               <a:graphicData uri="http://schemas.openxmlformats.org/drawingml/2006/picture">
                 <pic:pic xmlns:pic="http://schemas.openxmlformats.org/drawingml/2006/picture">
                   <pic:nvPicPr>
-                    <pic:cNvPr id="0" name="Picture 4"/>
+                    <pic:cNvPr id="0" name="Picture 2"/>
                     <pic:cNvPicPr>
                       <a:picLocks noChangeAspect="1" noChangeArrowheads="1"/>
                     </pic:cNvPicPr>
@@ -688,7 +688,7 @@
                   <pic:spPr bwMode="auto">
                     <a:xfrm>
                       <a:off x="0" y="0"/>
-                      <a:ext cx="4320000" cy="2087619"/>
+                      <a:ext cx="4320000" cy="1950476"/>
                     </a:xfrm>
                     <a:prstGeom prst="rect">
                       <a:avLst/>
@@ -726,21 +726,7 @@
         <w:rPr>
           <w:lang w:eastAsia="pt-BR"/>
         </w:rPr>
-        <w:t xml:space="preserve">Três </w:t>
-      </w:r>
-      <w:proofErr w:type="spellStart"/>
-      <w:r>
-        <w:rPr>
-          <w:lang w:eastAsia="pt-BR"/>
-        </w:rPr>
-        <w:t>cards</w:t>
-      </w:r>
-      <w:proofErr w:type="spellEnd"/>
-      <w:r>
-        <w:rPr>
-          <w:lang w:eastAsia="pt-BR"/>
-        </w:rPr>
-        <w:t xml:space="preserve"> descritivos apresentando a Missão Visão e Valores</w:t>
+        <w:t>Três cards descritivos apresentando a Missão Visão e Valores</w:t>
       </w:r>
       <w:r>
         <w:rPr>
@@ -763,10 +749,10 @@
           <w:lang w:eastAsia="pt-BR"/>
         </w:rPr>
         <w:drawing>
-          <wp:inline distT="0" distB="0" distL="0" distR="0" wp14:anchorId="75A94630" wp14:editId="7235B5B1">
-            <wp:extent cx="4320000" cy="1013333"/>
+          <wp:inline distT="0" distB="0" distL="0" distR="0" wp14:anchorId="50EC7DCF" wp14:editId="2CA741C3">
+            <wp:extent cx="4320000" cy="1226667"/>
             <wp:effectExtent l="0" t="0" r="4445" b="0"/>
-            <wp:docPr id="823184943" name="Imagem 6"/>
+            <wp:docPr id="1404755862" name="Imagem 7"/>
             <wp:cNvGraphicFramePr>
               <a:graphicFrameLocks xmlns:a="http://schemas.openxmlformats.org/drawingml/2006/main" noChangeAspect="1"/>
             </wp:cNvGraphicFramePr>
@@ -774,7 +760,7 @@
               <a:graphicData uri="http://schemas.openxmlformats.org/drawingml/2006/picture">
                 <pic:pic xmlns:pic="http://schemas.openxmlformats.org/drawingml/2006/picture">
                   <pic:nvPicPr>
-                    <pic:cNvPr id="0" name="Picture 5"/>
+                    <pic:cNvPr id="0" name="Picture 3"/>
                     <pic:cNvPicPr>
                       <a:picLocks noChangeAspect="1" noChangeArrowheads="1"/>
                     </pic:cNvPicPr>
@@ -795,7 +781,7 @@
                   <pic:spPr bwMode="auto">
                     <a:xfrm>
                       <a:off x="0" y="0"/>
-                      <a:ext cx="4320000" cy="1013333"/>
+                      <a:ext cx="4320000" cy="1226667"/>
                     </a:xfrm>
                     <a:prstGeom prst="rect">
                       <a:avLst/>
@@ -867,9 +853,9 @@
           <w:lang w:eastAsia="pt-BR"/>
         </w:rPr>
         <w:drawing>
-          <wp:inline distT="0" distB="0" distL="0" distR="0" wp14:anchorId="46D3F9CC" wp14:editId="197D2D0B">
-            <wp:extent cx="4320000" cy="1500952"/>
-            <wp:effectExtent l="0" t="0" r="4445" b="4445"/>
+          <wp:inline distT="0" distB="0" distL="0" distR="0" wp14:anchorId="46D3F9CC" wp14:editId="1722C9E0">
+            <wp:extent cx="4320000" cy="1498826"/>
+            <wp:effectExtent l="0" t="0" r="4445" b="6350"/>
             <wp:docPr id="799963190" name="Imagem 7"/>
             <wp:cNvGraphicFramePr>
               <a:graphicFrameLocks xmlns:a="http://schemas.openxmlformats.org/drawingml/2006/main" noChangeAspect="1"/>
@@ -878,7 +864,7 @@
               <a:graphicData uri="http://schemas.openxmlformats.org/drawingml/2006/picture">
                 <pic:pic xmlns:pic="http://schemas.openxmlformats.org/drawingml/2006/picture">
                   <pic:nvPicPr>
-                    <pic:cNvPr id="0" name="Picture 6"/>
+                    <pic:cNvPr id="799963190" name="Imagem 7"/>
                     <pic:cNvPicPr>
                       <a:picLocks noChangeAspect="1" noChangeArrowheads="1"/>
                     </pic:cNvPicPr>
@@ -891,7 +877,6 @@
                         </a:ext>
                       </a:extLst>
                     </a:blip>
-                    <a:srcRect/>
                     <a:stretch>
                       <a:fillRect/>
                     </a:stretch>
@@ -899,7 +884,7 @@
                   <pic:spPr bwMode="auto">
                     <a:xfrm>
                       <a:off x="0" y="0"/>
-                      <a:ext cx="4320000" cy="1500952"/>
+                      <a:ext cx="4320000" cy="1498826"/>
                     </a:xfrm>
                     <a:prstGeom prst="rect">
                       <a:avLst/>
@@ -978,8 +963,8 @@
           <w:lang w:eastAsia="pt-BR"/>
         </w:rPr>
         <w:drawing>
-          <wp:inline distT="0" distB="0" distL="0" distR="0" wp14:anchorId="4E8C15C1" wp14:editId="030CB4B5">
-            <wp:extent cx="4320000" cy="1264762"/>
+          <wp:inline distT="0" distB="0" distL="0" distR="0" wp14:anchorId="4E8C15C1" wp14:editId="63679097">
+            <wp:extent cx="4320000" cy="1227894"/>
             <wp:effectExtent l="0" t="0" r="4445" b="0"/>
             <wp:docPr id="1180600531" name="Imagem 8"/>
             <wp:cNvGraphicFramePr>
@@ -989,7 +974,7 @@
               <a:graphicData uri="http://schemas.openxmlformats.org/drawingml/2006/picture">
                 <pic:pic xmlns:pic="http://schemas.openxmlformats.org/drawingml/2006/picture">
                   <pic:nvPicPr>
-                    <pic:cNvPr id="0" name="Picture 7"/>
+                    <pic:cNvPr id="1180600531" name="Imagem 8"/>
                     <pic:cNvPicPr>
                       <a:picLocks noChangeAspect="1" noChangeArrowheads="1"/>
                     </pic:cNvPicPr>
@@ -1002,7 +987,6 @@
                         </a:ext>
                       </a:extLst>
                     </a:blip>
-                    <a:srcRect/>
                     <a:stretch>
                       <a:fillRect/>
                     </a:stretch>
@@ -1010,7 +994,7 @@
                   <pic:spPr bwMode="auto">
                     <a:xfrm>
                       <a:off x="0" y="0"/>
-                      <a:ext cx="4320000" cy="1264762"/>
+                      <a:ext cx="4320000" cy="1227894"/>
                     </a:xfrm>
                     <a:prstGeom prst="rect">
                       <a:avLst/>
@@ -1048,21 +1032,7 @@
         <w:rPr>
           <w:lang w:eastAsia="pt-BR"/>
         </w:rPr>
-        <w:t xml:space="preserve">Seção com endereço completo, horários de funcionamento, telefone de contato e mapa interativo do Google </w:t>
-      </w:r>
-      <w:proofErr w:type="spellStart"/>
-      <w:r>
-        <w:rPr>
-          <w:lang w:eastAsia="pt-BR"/>
-        </w:rPr>
-        <w:t>Maps</w:t>
-      </w:r>
-      <w:proofErr w:type="spellEnd"/>
-      <w:r>
-        <w:rPr>
-          <w:lang w:eastAsia="pt-BR"/>
-        </w:rPr>
-        <w:t xml:space="preserve"> mostrando a localização exata.</w:t>
+        <w:t>Seção com endereço completo, horários de funcionamento, telefone de contato e mapa interativo do Google Maps mostrando a localização exata.</w:t>
       </w:r>
     </w:p>
     <w:p>
@@ -1079,9 +1049,9 @@
           <w:lang w:eastAsia="pt-BR"/>
         </w:rPr>
         <w:drawing>
-          <wp:inline distT="0" distB="0" distL="0" distR="0" wp14:anchorId="333E3CE3" wp14:editId="6F49F36E">
-            <wp:extent cx="4320000" cy="1622857"/>
-            <wp:effectExtent l="0" t="0" r="4445" b="0"/>
+          <wp:inline distT="0" distB="0" distL="0" distR="0" wp14:anchorId="333E3CE3" wp14:editId="6362E13B">
+            <wp:extent cx="4320000" cy="1618135"/>
+            <wp:effectExtent l="0" t="0" r="4445" b="1270"/>
             <wp:docPr id="592498787" name="Imagem 9"/>
             <wp:cNvGraphicFramePr>
               <a:graphicFrameLocks xmlns:a="http://schemas.openxmlformats.org/drawingml/2006/main" noChangeAspect="1"/>
@@ -1090,7 +1060,7 @@
               <a:graphicData uri="http://schemas.openxmlformats.org/drawingml/2006/picture">
                 <pic:pic xmlns:pic="http://schemas.openxmlformats.org/drawingml/2006/picture">
                   <pic:nvPicPr>
-                    <pic:cNvPr id="0" name="Picture 8"/>
+                    <pic:cNvPr id="592498787" name="Imagem 9"/>
                     <pic:cNvPicPr>
                       <a:picLocks noChangeAspect="1" noChangeArrowheads="1"/>
                     </pic:cNvPicPr>
@@ -1103,7 +1073,6 @@
                         </a:ext>
                       </a:extLst>
                     </a:blip>
-                    <a:srcRect/>
                     <a:stretch>
                       <a:fillRect/>
                     </a:stretch>
@@ -1111,7 +1080,7 @@
                   <pic:spPr bwMode="auto">
                     <a:xfrm>
                       <a:off x="0" y="0"/>
-                      <a:ext cx="4320000" cy="1622857"/>
+                      <a:ext cx="4320000" cy="1618135"/>
                     </a:xfrm>
                     <a:prstGeom prst="rect">
                       <a:avLst/>
@@ -1166,21 +1135,7 @@
         <w:rPr>
           <w:lang w:eastAsia="pt-BR"/>
         </w:rPr>
-        <w:t xml:space="preserve">Dois </w:t>
-      </w:r>
-      <w:proofErr w:type="spellStart"/>
-      <w:r>
-        <w:rPr>
-          <w:lang w:eastAsia="pt-BR"/>
-        </w:rPr>
-        <w:t>cards</w:t>
-      </w:r>
-      <w:proofErr w:type="spellEnd"/>
-      <w:r>
-        <w:rPr>
-          <w:lang w:eastAsia="pt-BR"/>
-        </w:rPr>
-        <w:t xml:space="preserve"> com botões ilustrados para Instagram e WhatsApp, permitindo acesso direto às plataformas de contato da empresa.</w:t>
+        <w:t>Dois cards com botões ilustrados para Instagram e WhatsApp, permitindo acesso direto às plataformas de contato da empresa.</w:t>
       </w:r>
     </w:p>
     <w:p>
@@ -1197,8 +1152,8 @@
           <w:lang w:eastAsia="pt-BR"/>
         </w:rPr>
         <w:drawing>
-          <wp:inline distT="0" distB="0" distL="0" distR="0" wp14:anchorId="474920C6" wp14:editId="1A66A80E">
-            <wp:extent cx="4320000" cy="1622857"/>
+          <wp:inline distT="0" distB="0" distL="0" distR="0" wp14:anchorId="474920C6" wp14:editId="4B7F0801">
+            <wp:extent cx="4320000" cy="1608193"/>
             <wp:effectExtent l="0" t="0" r="4445" b="0"/>
             <wp:docPr id="1449172012" name="Imagem 1"/>
             <wp:cNvGraphicFramePr>
@@ -1208,7 +1163,7 @@
               <a:graphicData uri="http://schemas.openxmlformats.org/drawingml/2006/picture">
                 <pic:pic xmlns:pic="http://schemas.openxmlformats.org/drawingml/2006/picture">
                   <pic:nvPicPr>
-                    <pic:cNvPr id="0" name="Picture 1"/>
+                    <pic:cNvPr id="1449172012" name="Imagem 1"/>
                     <pic:cNvPicPr>
                       <a:picLocks noChangeAspect="1" noChangeArrowheads="1"/>
                     </pic:cNvPicPr>
@@ -1221,7 +1176,6 @@
                         </a:ext>
                       </a:extLst>
                     </a:blip>
-                    <a:srcRect/>
                     <a:stretch>
                       <a:fillRect/>
                     </a:stretch>
@@ -1229,7 +1183,7 @@
                   <pic:spPr bwMode="auto">
                     <a:xfrm>
                       <a:off x="0" y="0"/>
-                      <a:ext cx="4320000" cy="1622857"/>
+                      <a:ext cx="4320000" cy="1608193"/>
                     </a:xfrm>
                     <a:prstGeom prst="rect">
                       <a:avLst/>
@@ -1292,9 +1246,9 @@
           <w:lang w:eastAsia="pt-BR"/>
         </w:rPr>
         <w:drawing>
-          <wp:inline distT="0" distB="0" distL="0" distR="0" wp14:anchorId="26F3162D" wp14:editId="71746C2B">
-            <wp:extent cx="4320000" cy="220952"/>
-            <wp:effectExtent l="0" t="0" r="0" b="8255"/>
+          <wp:inline distT="0" distB="0" distL="0" distR="0" wp14:anchorId="26F3162D" wp14:editId="52A97F21">
+            <wp:extent cx="4320000" cy="218734"/>
+            <wp:effectExtent l="0" t="0" r="0" b="0"/>
             <wp:docPr id="1995527049" name="Imagem 12"/>
             <wp:cNvGraphicFramePr>
               <a:graphicFrameLocks xmlns:a="http://schemas.openxmlformats.org/drawingml/2006/main" noChangeAspect="1"/>
@@ -1303,7 +1257,7 @@
               <a:graphicData uri="http://schemas.openxmlformats.org/drawingml/2006/picture">
                 <pic:pic xmlns:pic="http://schemas.openxmlformats.org/drawingml/2006/picture">
                   <pic:nvPicPr>
-                    <pic:cNvPr id="0" name="Picture 11"/>
+                    <pic:cNvPr id="1995527049" name="Imagem 12"/>
                     <pic:cNvPicPr>
                       <a:picLocks noChangeAspect="1" noChangeArrowheads="1"/>
                     </pic:cNvPicPr>
@@ -1316,7 +1270,6 @@
                         </a:ext>
                       </a:extLst>
                     </a:blip>
-                    <a:srcRect/>
                     <a:stretch>
                       <a:fillRect/>
                     </a:stretch>
@@ -1324,7 +1277,7 @@
                   <pic:spPr bwMode="auto">
                     <a:xfrm>
                       <a:off x="0" y="0"/>
-                      <a:ext cx="4320000" cy="220952"/>
+                      <a:ext cx="4320000" cy="218734"/>
                     </a:xfrm>
                     <a:prstGeom prst="rect">
                       <a:avLst/>
@@ -1434,9 +1387,9 @@
           <w:lang w:eastAsia="pt-BR"/>
         </w:rPr>
         <w:drawing>
-          <wp:inline distT="0" distB="0" distL="0" distR="0" wp14:anchorId="19A19BA9" wp14:editId="2B658A39">
-            <wp:extent cx="4320000" cy="244240"/>
-            <wp:effectExtent l="0" t="0" r="0" b="3810"/>
+          <wp:inline distT="0" distB="0" distL="0" distR="0" wp14:anchorId="19A19BA9" wp14:editId="578CE13B">
+            <wp:extent cx="4320000" cy="237985"/>
+            <wp:effectExtent l="0" t="0" r="0" b="0"/>
             <wp:docPr id="1925340159" name="Imagem 13"/>
             <wp:cNvGraphicFramePr>
               <a:graphicFrameLocks xmlns:a="http://schemas.openxmlformats.org/drawingml/2006/main" noChangeAspect="1"/>
@@ -1445,7 +1398,7 @@
               <a:graphicData uri="http://schemas.openxmlformats.org/drawingml/2006/picture">
                 <pic:pic xmlns:pic="http://schemas.openxmlformats.org/drawingml/2006/picture">
                   <pic:nvPicPr>
-                    <pic:cNvPr id="0" name="Picture 12"/>
+                    <pic:cNvPr id="1925340159" name="Imagem 13"/>
                     <pic:cNvPicPr>
                       <a:picLocks noChangeAspect="1" noChangeArrowheads="1"/>
                     </pic:cNvPicPr>
@@ -1458,7 +1411,6 @@
                         </a:ext>
                       </a:extLst>
                     </a:blip>
-                    <a:srcRect/>
                     <a:stretch>
                       <a:fillRect/>
                     </a:stretch>
@@ -1466,7 +1418,7 @@
                   <pic:spPr bwMode="auto">
                     <a:xfrm>
                       <a:off x="0" y="0"/>
-                      <a:ext cx="4320000" cy="244240"/>
+                      <a:ext cx="4320000" cy="237985"/>
                     </a:xfrm>
                     <a:prstGeom prst="rect">
                       <a:avLst/>
@@ -1521,9 +1473,9 @@
           <w:lang w:eastAsia="pt-BR"/>
         </w:rPr>
         <w:drawing>
-          <wp:inline distT="0" distB="0" distL="0" distR="0" wp14:anchorId="3530AED8" wp14:editId="01BF665A">
-            <wp:extent cx="1440000" cy="611223"/>
-            <wp:effectExtent l="0" t="0" r="8255" b="0"/>
+          <wp:inline distT="0" distB="0" distL="0" distR="0" wp14:anchorId="3530AED8" wp14:editId="054D9A34">
+            <wp:extent cx="1440000" cy="569032"/>
+            <wp:effectExtent l="0" t="0" r="8255" b="2540"/>
             <wp:docPr id="1173346884" name="Imagem 14"/>
             <wp:cNvGraphicFramePr>
               <a:graphicFrameLocks xmlns:a="http://schemas.openxmlformats.org/drawingml/2006/main" noChangeAspect="1"/>
@@ -1532,7 +1484,7 @@
               <a:graphicData uri="http://schemas.openxmlformats.org/drawingml/2006/picture">
                 <pic:pic xmlns:pic="http://schemas.openxmlformats.org/drawingml/2006/picture">
                   <pic:nvPicPr>
-                    <pic:cNvPr id="0" name="Picture 13"/>
+                    <pic:cNvPr id="1173346884" name="Imagem 14"/>
                     <pic:cNvPicPr>
                       <a:picLocks noChangeAspect="1" noChangeArrowheads="1"/>
                     </pic:cNvPicPr>
@@ -1545,7 +1497,6 @@
                         </a:ext>
                       </a:extLst>
                     </a:blip>
-                    <a:srcRect/>
                     <a:stretch>
                       <a:fillRect/>
                     </a:stretch>
@@ -1553,7 +1504,7 @@
                   <pic:spPr bwMode="auto">
                     <a:xfrm>
                       <a:off x="0" y="0"/>
-                      <a:ext cx="1440000" cy="611223"/>
+                      <a:ext cx="1440000" cy="569032"/>
                     </a:xfrm>
                     <a:prstGeom prst="rect">
                       <a:avLst/>
@@ -1620,9 +1571,9 @@
           <w:lang w:eastAsia="pt-BR"/>
         </w:rPr>
         <w:drawing>
-          <wp:inline distT="0" distB="0" distL="0" distR="0" wp14:anchorId="638E3F04" wp14:editId="1A36913D">
-            <wp:extent cx="4320000" cy="3510954"/>
-            <wp:effectExtent l="0" t="0" r="4445" b="0"/>
+          <wp:inline distT="0" distB="0" distL="0" distR="0" wp14:anchorId="638E3F04" wp14:editId="7D98BC0B">
+            <wp:extent cx="4320000" cy="3177628"/>
+            <wp:effectExtent l="0" t="0" r="4445" b="3810"/>
             <wp:docPr id="238480979" name="Imagem 15"/>
             <wp:cNvGraphicFramePr>
               <a:graphicFrameLocks xmlns:a="http://schemas.openxmlformats.org/drawingml/2006/main" noChangeAspect="1"/>
@@ -1631,7 +1582,7 @@
               <a:graphicData uri="http://schemas.openxmlformats.org/drawingml/2006/picture">
                 <pic:pic xmlns:pic="http://schemas.openxmlformats.org/drawingml/2006/picture">
                   <pic:nvPicPr>
-                    <pic:cNvPr id="0" name="Picture 14"/>
+                    <pic:cNvPr id="238480979" name="Imagem 15"/>
                     <pic:cNvPicPr>
                       <a:picLocks noChangeAspect="1" noChangeArrowheads="1"/>
                     </pic:cNvPicPr>
@@ -1644,7 +1595,6 @@
                         </a:ext>
                       </a:extLst>
                     </a:blip>
-                    <a:srcRect/>
                     <a:stretch>
                       <a:fillRect/>
                     </a:stretch>
@@ -1652,7 +1602,7 @@
                   <pic:spPr bwMode="auto">
                     <a:xfrm>
                       <a:off x="0" y="0"/>
-                      <a:ext cx="4320000" cy="3510954"/>
+                      <a:ext cx="4320000" cy="3177628"/>
                     </a:xfrm>
                     <a:prstGeom prst="rect">
                       <a:avLst/>
@@ -1723,21 +1673,7 @@
         <w:rPr>
           <w:lang w:eastAsia="pt-BR"/>
         </w:rPr>
-        <w:t xml:space="preserve"> </w:t>
-      </w:r>
-      <w:proofErr w:type="spellStart"/>
-      <w:r>
-        <w:rPr>
-          <w:lang w:eastAsia="pt-BR"/>
-        </w:rPr>
-        <w:t>card</w:t>
-      </w:r>
-      <w:proofErr w:type="spellEnd"/>
-      <w:r>
-        <w:rPr>
-          <w:lang w:eastAsia="pt-BR"/>
-        </w:rPr>
-        <w:t xml:space="preserve"> com ícone do Instagram para abrir a página oficial da Marcenaria Morais no Instagram em uma nova aba do navegador.</w:t>
+        <w:t xml:space="preserve"> card com ícone do Instagram para abrir a página oficial da Marcenaria Morais no Instagram em uma nova aba do navegador.</w:t>
       </w:r>
     </w:p>
     <w:p>
@@ -1818,55 +1754,13 @@
         <w:rPr>
           <w:lang w:eastAsia="pt-BR"/>
         </w:rPr>
-        <w:t xml:space="preserve">Botão para o </w:t>
-      </w:r>
-      <w:proofErr w:type="spellStart"/>
-      <w:r>
-        <w:rPr>
-          <w:lang w:eastAsia="pt-BR"/>
-        </w:rPr>
-        <w:t>whatsapp</w:t>
-      </w:r>
-      <w:proofErr w:type="spellEnd"/>
-      <w:r>
-        <w:rPr>
-          <w:lang w:eastAsia="pt-BR"/>
-        </w:rPr>
-        <w:t xml:space="preserve">: </w:t>
-      </w:r>
-      <w:r>
-        <w:rPr>
-          <w:lang w:eastAsia="pt-BR"/>
-        </w:rPr>
-        <w:t xml:space="preserve">Clique no </w:t>
-      </w:r>
-      <w:proofErr w:type="spellStart"/>
-      <w:r>
-        <w:rPr>
-          <w:lang w:eastAsia="pt-BR"/>
-        </w:rPr>
-        <w:t>card</w:t>
-      </w:r>
-      <w:proofErr w:type="spellEnd"/>
-      <w:r>
-        <w:rPr>
-          <w:lang w:eastAsia="pt-BR"/>
-        </w:rPr>
-        <w:t xml:space="preserve"> com ícone do WhatsApp para abrir uma conversa direta com a empresa via WhatsApp (disponível em dispositivos móveis com </w:t>
-      </w:r>
-      <w:proofErr w:type="spellStart"/>
-      <w:r>
-        <w:rPr>
-          <w:lang w:eastAsia="pt-BR"/>
-        </w:rPr>
-        <w:t>app</w:t>
-      </w:r>
-      <w:proofErr w:type="spellEnd"/>
-      <w:r>
-        <w:rPr>
-          <w:lang w:eastAsia="pt-BR"/>
-        </w:rPr>
-        <w:t xml:space="preserve"> instalado).</w:t>
+        <w:t xml:space="preserve">Botão para o whatsapp: </w:t>
+      </w:r>
+      <w:r>
+        <w:rPr>
+          <w:lang w:eastAsia="pt-BR"/>
+        </w:rPr>
+        <w:t>Clique no card com ícone do WhatsApp para abrir uma conversa direta com a empresa via WhatsApp (disponível em dispositivos móveis com app instalado).</w:t>
       </w:r>
     </w:p>
     <w:p>
@@ -2008,9 +1902,9 @@
           <w:lang w:eastAsia="pt-BR"/>
         </w:rPr>
         <w:drawing>
-          <wp:inline distT="0" distB="0" distL="0" distR="0" wp14:anchorId="48A5B6FF" wp14:editId="1E22025C">
-            <wp:extent cx="4320000" cy="537642"/>
-            <wp:effectExtent l="0" t="0" r="4445" b="0"/>
+          <wp:inline distT="0" distB="0" distL="0" distR="0" wp14:anchorId="48A5B6FF" wp14:editId="3884BE7F">
+            <wp:extent cx="4182675" cy="537642"/>
+            <wp:effectExtent l="0" t="0" r="0" b="0"/>
             <wp:docPr id="1791388982" name="Imagem 18"/>
             <wp:cNvGraphicFramePr>
               <a:graphicFrameLocks xmlns:a="http://schemas.openxmlformats.org/drawingml/2006/main" noChangeAspect="1"/>
@@ -2019,7 +1913,7 @@
               <a:graphicData uri="http://schemas.openxmlformats.org/drawingml/2006/picture">
                 <pic:pic xmlns:pic="http://schemas.openxmlformats.org/drawingml/2006/picture">
                   <pic:nvPicPr>
-                    <pic:cNvPr id="0" name="Picture 17"/>
+                    <pic:cNvPr id="1791388982" name="Imagem 18"/>
                     <pic:cNvPicPr>
                       <a:picLocks noChangeAspect="1" noChangeArrowheads="1"/>
                     </pic:cNvPicPr>
@@ -2032,7 +1926,6 @@
                         </a:ext>
                       </a:extLst>
                     </a:blip>
-                    <a:srcRect/>
                     <a:stretch>
                       <a:fillRect/>
                     </a:stretch>
@@ -2040,7 +1933,7 @@
                   <pic:spPr bwMode="auto">
                     <a:xfrm>
                       <a:off x="0" y="0"/>
-                      <a:ext cx="4320000" cy="537642"/>
+                      <a:ext cx="4182675" cy="537642"/>
                     </a:xfrm>
                     <a:prstGeom prst="rect">
                       <a:avLst/>
@@ -2174,8 +2067,8 @@
           <w:lang w:eastAsia="pt-BR"/>
         </w:rPr>
         <w:drawing>
-          <wp:inline distT="0" distB="0" distL="0" distR="0" wp14:anchorId="4AF65A50" wp14:editId="7D4DC402">
-            <wp:extent cx="4320000" cy="220952"/>
+          <wp:inline distT="0" distB="0" distL="0" distR="0" wp14:anchorId="4AF65A50" wp14:editId="1D61453D">
+            <wp:extent cx="4266828" cy="220952"/>
             <wp:effectExtent l="0" t="0" r="0" b="8255"/>
             <wp:docPr id="152315513" name="Imagem 6"/>
             <wp:cNvGraphicFramePr>
@@ -2185,7 +2078,7 @@
               <a:graphicData uri="http://schemas.openxmlformats.org/drawingml/2006/picture">
                 <pic:pic xmlns:pic="http://schemas.openxmlformats.org/drawingml/2006/picture">
                   <pic:nvPicPr>
-                    <pic:cNvPr id="0" name="Picture 6"/>
+                    <pic:cNvPr id="152315513" name="Imagem 6"/>
                     <pic:cNvPicPr>
                       <a:picLocks noChangeAspect="1" noChangeArrowheads="1"/>
                     </pic:cNvPicPr>
@@ -2198,7 +2091,6 @@
                         </a:ext>
                       </a:extLst>
                     </a:blip>
-                    <a:srcRect/>
                     <a:stretch>
                       <a:fillRect/>
                     </a:stretch>
@@ -2206,7 +2098,7 @@
                   <pic:spPr bwMode="auto">
                     <a:xfrm>
                       <a:off x="0" y="0"/>
-                      <a:ext cx="4320000" cy="220952"/>
+                      <a:ext cx="4266828" cy="220952"/>
                     </a:xfrm>
                     <a:prstGeom prst="rect">
                       <a:avLst/>
@@ -2315,9 +2207,9 @@
           <w:lang w:eastAsia="pt-BR"/>
         </w:rPr>
         <w:drawing>
-          <wp:inline distT="0" distB="0" distL="0" distR="0" wp14:anchorId="51A74DD8" wp14:editId="2820619E">
-            <wp:extent cx="4320000" cy="998095"/>
-            <wp:effectExtent l="0" t="0" r="4445" b="0"/>
+          <wp:inline distT="0" distB="0" distL="0" distR="0" wp14:anchorId="51A74DD8" wp14:editId="4D750583">
+            <wp:extent cx="4320000" cy="944533"/>
+            <wp:effectExtent l="0" t="0" r="4445" b="8255"/>
             <wp:docPr id="149566114" name="Imagem 5"/>
             <wp:cNvGraphicFramePr>
               <a:graphicFrameLocks xmlns:a="http://schemas.openxmlformats.org/drawingml/2006/main" noChangeAspect="1"/>
@@ -2326,7 +2218,7 @@
               <a:graphicData uri="http://schemas.openxmlformats.org/drawingml/2006/picture">
                 <pic:pic xmlns:pic="http://schemas.openxmlformats.org/drawingml/2006/picture">
                   <pic:nvPicPr>
-                    <pic:cNvPr id="0" name="Picture 5"/>
+                    <pic:cNvPr id="149566114" name="Imagem 5"/>
                     <pic:cNvPicPr>
                       <a:picLocks noChangeAspect="1" noChangeArrowheads="1"/>
                     </pic:cNvPicPr>
@@ -2339,7 +2231,6 @@
                         </a:ext>
                       </a:extLst>
                     </a:blip>
-                    <a:srcRect/>
                     <a:stretch>
                       <a:fillRect/>
                     </a:stretch>
@@ -2347,7 +2238,7 @@
                   <pic:spPr bwMode="auto">
                     <a:xfrm>
                       <a:off x="0" y="0"/>
-                      <a:ext cx="4320000" cy="998095"/>
+                      <a:ext cx="4320000" cy="944533"/>
                     </a:xfrm>
                     <a:prstGeom prst="rect">
                       <a:avLst/>
@@ -2426,49 +2317,7 @@
         <w:rPr>
           <w:lang w:eastAsia="pt-BR"/>
         </w:rPr>
-        <w:t xml:space="preserve"> produtos em </w:t>
-      </w:r>
-      <w:proofErr w:type="spellStart"/>
-      <w:r>
-        <w:rPr>
-          <w:lang w:eastAsia="pt-BR"/>
-        </w:rPr>
-        <w:t>cards</w:t>
-      </w:r>
-      <w:proofErr w:type="spellEnd"/>
-      <w:r>
-        <w:rPr>
-          <w:lang w:eastAsia="pt-BR"/>
-        </w:rPr>
-        <w:t xml:space="preserve"> com imagem, nome e descrição resumida. Cada </w:t>
-      </w:r>
-      <w:proofErr w:type="spellStart"/>
-      <w:r>
-        <w:rPr>
-          <w:lang w:eastAsia="pt-BR"/>
-        </w:rPr>
-        <w:t>card</w:t>
-      </w:r>
-      <w:proofErr w:type="spellEnd"/>
-      <w:r>
-        <w:rPr>
-          <w:lang w:eastAsia="pt-BR"/>
-        </w:rPr>
-        <w:t xml:space="preserve"> é </w:t>
-      </w:r>
-      <w:proofErr w:type="spellStart"/>
-      <w:r>
-        <w:rPr>
-          <w:lang w:eastAsia="pt-BR"/>
-        </w:rPr>
-        <w:t>clicável</w:t>
-      </w:r>
-      <w:proofErr w:type="spellEnd"/>
-      <w:r>
-        <w:rPr>
-          <w:lang w:eastAsia="pt-BR"/>
-        </w:rPr>
-        <w:t xml:space="preserve"> para abrir um</w:t>
+        <w:t xml:space="preserve"> produtos em cards com imagem, nome e descrição resumida. Cada card é clicável para abrir um</w:t>
       </w:r>
       <w:r>
         <w:rPr>
@@ -2497,9 +2346,9 @@
           <w:lang w:eastAsia="pt-BR"/>
         </w:rPr>
         <w:drawing>
-          <wp:inline distT="0" distB="0" distL="0" distR="0" wp14:anchorId="7F59FD85" wp14:editId="1737FB1D">
-            <wp:extent cx="4320000" cy="6529524"/>
-            <wp:effectExtent l="0" t="0" r="4445" b="5080"/>
+          <wp:inline distT="0" distB="0" distL="0" distR="0" wp14:anchorId="7F59FD85" wp14:editId="1AB283BF">
+            <wp:extent cx="4274317" cy="6529524"/>
+            <wp:effectExtent l="0" t="0" r="0" b="5080"/>
             <wp:docPr id="1705184272" name="Imagem 7"/>
             <wp:cNvGraphicFramePr>
               <a:graphicFrameLocks xmlns:a="http://schemas.openxmlformats.org/drawingml/2006/main" noChangeAspect="1"/>
@@ -2508,7 +2357,7 @@
               <a:graphicData uri="http://schemas.openxmlformats.org/drawingml/2006/picture">
                 <pic:pic xmlns:pic="http://schemas.openxmlformats.org/drawingml/2006/picture">
                   <pic:nvPicPr>
-                    <pic:cNvPr id="0" name="Picture 7"/>
+                    <pic:cNvPr id="1705184272" name="Imagem 7"/>
                     <pic:cNvPicPr>
                       <a:picLocks noChangeAspect="1" noChangeArrowheads="1"/>
                     </pic:cNvPicPr>
@@ -2521,7 +2370,6 @@
                         </a:ext>
                       </a:extLst>
                     </a:blip>
-                    <a:srcRect/>
                     <a:stretch>
                       <a:fillRect/>
                     </a:stretch>
@@ -2529,7 +2377,7 @@
                   <pic:spPr bwMode="auto">
                     <a:xfrm>
                       <a:off x="0" y="0"/>
-                      <a:ext cx="4320000" cy="6529524"/>
+                      <a:ext cx="4274317" cy="6529524"/>
                     </a:xfrm>
                     <a:prstGeom prst="rect">
                       <a:avLst/>
@@ -2605,9 +2453,9 @@
           <w:lang w:eastAsia="pt-BR"/>
         </w:rPr>
         <w:drawing>
-          <wp:inline distT="0" distB="0" distL="0" distR="0" wp14:anchorId="068A9E17" wp14:editId="165EB402">
-            <wp:extent cx="4320000" cy="220952"/>
-            <wp:effectExtent l="0" t="0" r="0" b="8255"/>
+          <wp:inline distT="0" distB="0" distL="0" distR="0" wp14:anchorId="068A9E17" wp14:editId="0E8EE34C">
+            <wp:extent cx="4320000" cy="218734"/>
+            <wp:effectExtent l="0" t="0" r="0" b="0"/>
             <wp:docPr id="1576847926" name="Imagem 8"/>
             <wp:cNvGraphicFramePr>
               <a:graphicFrameLocks xmlns:a="http://schemas.openxmlformats.org/drawingml/2006/main" noChangeAspect="1"/>
@@ -2616,7 +2464,7 @@
               <a:graphicData uri="http://schemas.openxmlformats.org/drawingml/2006/picture">
                 <pic:pic xmlns:pic="http://schemas.openxmlformats.org/drawingml/2006/picture">
                   <pic:nvPicPr>
-                    <pic:cNvPr id="0" name="Picture 8"/>
+                    <pic:cNvPr id="1576847926" name="Imagem 8"/>
                     <pic:cNvPicPr>
                       <a:picLocks noChangeAspect="1" noChangeArrowheads="1"/>
                     </pic:cNvPicPr>
@@ -2629,7 +2477,6 @@
                         </a:ext>
                       </a:extLst>
                     </a:blip>
-                    <a:srcRect/>
                     <a:stretch>
                       <a:fillRect/>
                     </a:stretch>
@@ -2637,7 +2484,7 @@
                   <pic:spPr bwMode="auto">
                     <a:xfrm>
                       <a:off x="0" y="0"/>
-                      <a:ext cx="4320000" cy="220952"/>
+                      <a:ext cx="4320000" cy="218734"/>
                     </a:xfrm>
                     <a:prstGeom prst="rect">
                       <a:avLst/>
@@ -2730,9 +2577,9 @@
           <w:lang w:eastAsia="pt-BR"/>
         </w:rPr>
         <w:drawing>
-          <wp:inline distT="0" distB="0" distL="0" distR="0" wp14:anchorId="1C5E099E" wp14:editId="3FB80FF8">
-            <wp:extent cx="4320000" cy="2335548"/>
-            <wp:effectExtent l="0" t="0" r="4445" b="7620"/>
+          <wp:inline distT="0" distB="0" distL="0" distR="0" wp14:anchorId="1C5E099E" wp14:editId="5D53E0C9">
+            <wp:extent cx="4313479" cy="2335548"/>
+            <wp:effectExtent l="0" t="0" r="0" b="7620"/>
             <wp:docPr id="299695399" name="Imagem 9"/>
             <wp:cNvGraphicFramePr>
               <a:graphicFrameLocks xmlns:a="http://schemas.openxmlformats.org/drawingml/2006/main" noChangeAspect="1"/>
@@ -2741,7 +2588,7 @@
               <a:graphicData uri="http://schemas.openxmlformats.org/drawingml/2006/picture">
                 <pic:pic xmlns:pic="http://schemas.openxmlformats.org/drawingml/2006/picture">
                   <pic:nvPicPr>
-                    <pic:cNvPr id="0" name="Picture 9"/>
+                    <pic:cNvPr id="299695399" name="Imagem 9"/>
                     <pic:cNvPicPr>
                       <a:picLocks noChangeAspect="1" noChangeArrowheads="1"/>
                     </pic:cNvPicPr>
@@ -2754,7 +2601,6 @@
                         </a:ext>
                       </a:extLst>
                     </a:blip>
-                    <a:srcRect/>
                     <a:stretch>
                       <a:fillRect/>
                     </a:stretch>
@@ -2762,7 +2608,7 @@
                   <pic:spPr bwMode="auto">
                     <a:xfrm>
                       <a:off x="0" y="0"/>
-                      <a:ext cx="4320000" cy="2335548"/>
+                      <a:ext cx="4313479" cy="2335548"/>
                     </a:xfrm>
                     <a:prstGeom prst="rect">
                       <a:avLst/>
@@ -2868,9 +2714,9 @@
           <w:lang w:eastAsia="pt-BR"/>
         </w:rPr>
         <w:drawing>
-          <wp:inline distT="0" distB="0" distL="0" distR="0" wp14:anchorId="546BF58B" wp14:editId="3F15D1DC">
-            <wp:extent cx="1800000" cy="1302439"/>
-            <wp:effectExtent l="0" t="0" r="0" b="0"/>
+          <wp:inline distT="0" distB="0" distL="0" distR="0" wp14:anchorId="546BF58B" wp14:editId="18CEF6AD">
+            <wp:extent cx="1800000" cy="1218045"/>
+            <wp:effectExtent l="0" t="0" r="0" b="1270"/>
             <wp:docPr id="540877148" name="Imagem 10"/>
             <wp:cNvGraphicFramePr>
               <a:graphicFrameLocks xmlns:a="http://schemas.openxmlformats.org/drawingml/2006/main" noChangeAspect="1"/>
@@ -2879,7 +2725,7 @@
               <a:graphicData uri="http://schemas.openxmlformats.org/drawingml/2006/picture">
                 <pic:pic xmlns:pic="http://schemas.openxmlformats.org/drawingml/2006/picture">
                   <pic:nvPicPr>
-                    <pic:cNvPr id="0" name="Picture 10"/>
+                    <pic:cNvPr id="540877148" name="Imagem 10"/>
                     <pic:cNvPicPr>
                       <a:picLocks noChangeAspect="1" noChangeArrowheads="1"/>
                     </pic:cNvPicPr>
@@ -2892,7 +2738,6 @@
                         </a:ext>
                       </a:extLst>
                     </a:blip>
-                    <a:srcRect/>
                     <a:stretch>
                       <a:fillRect/>
                     </a:stretch>
@@ -2900,7 +2745,7 @@
                   <pic:spPr bwMode="auto">
                     <a:xfrm>
                       <a:off x="0" y="0"/>
-                      <a:ext cx="1800000" cy="1302439"/>
+                      <a:ext cx="1800000" cy="1218045"/>
                     </a:xfrm>
                     <a:prstGeom prst="rect">
                       <a:avLst/>
@@ -3003,9 +2848,9 @@
           <w:lang w:eastAsia="pt-BR"/>
         </w:rPr>
         <w:drawing>
-          <wp:inline distT="0" distB="0" distL="0" distR="0" wp14:anchorId="6B3D49D8" wp14:editId="449426F5">
-            <wp:extent cx="4320000" cy="2491429"/>
-            <wp:effectExtent l="0" t="0" r="4445" b="4445"/>
+          <wp:inline distT="0" distB="0" distL="0" distR="0" wp14:anchorId="6B3D49D8" wp14:editId="627432BE">
+            <wp:extent cx="4036231" cy="2491429"/>
+            <wp:effectExtent l="0" t="0" r="2540" b="4445"/>
             <wp:docPr id="1548074228" name="Imagem 11"/>
             <wp:cNvGraphicFramePr>
               <a:graphicFrameLocks xmlns:a="http://schemas.openxmlformats.org/drawingml/2006/main" noChangeAspect="1"/>
@@ -3014,7 +2859,7 @@
               <a:graphicData uri="http://schemas.openxmlformats.org/drawingml/2006/picture">
                 <pic:pic xmlns:pic="http://schemas.openxmlformats.org/drawingml/2006/picture">
                   <pic:nvPicPr>
-                    <pic:cNvPr id="0" name="Picture 11"/>
+                    <pic:cNvPr id="1548074228" name="Imagem 11"/>
                     <pic:cNvPicPr>
                       <a:picLocks noChangeAspect="1" noChangeArrowheads="1"/>
                     </pic:cNvPicPr>
@@ -3027,7 +2872,6 @@
                         </a:ext>
                       </a:extLst>
                     </a:blip>
-                    <a:srcRect/>
                     <a:stretch>
                       <a:fillRect/>
                     </a:stretch>
@@ -3035,7 +2879,7 @@
                   <pic:spPr bwMode="auto">
                     <a:xfrm>
                       <a:off x="0" y="0"/>
-                      <a:ext cx="4320000" cy="2491429"/>
+                      <a:ext cx="4036231" cy="2491429"/>
                     </a:xfrm>
                     <a:prstGeom prst="rect">
                       <a:avLst/>
@@ -3088,19 +2932,11 @@
           <w:lang w:eastAsia="pt-BR"/>
         </w:rPr>
       </w:pPr>
-      <w:proofErr w:type="spellStart"/>
-      <w:r>
-        <w:rPr>
-          <w:lang w:eastAsia="pt-BR"/>
-        </w:rPr>
-        <w:t>Cards</w:t>
-      </w:r>
-      <w:proofErr w:type="spellEnd"/>
-      <w:r>
-        <w:rPr>
-          <w:lang w:eastAsia="pt-BR"/>
-        </w:rPr>
-        <w:t xml:space="preserve"> de produtos</w:t>
+      <w:r>
+        <w:rPr>
+          <w:lang w:eastAsia="pt-BR"/>
+        </w:rPr>
+        <w:t>Cards de produtos</w:t>
       </w:r>
       <w:r>
         <w:rPr>
@@ -3112,21 +2948,7 @@
         <w:rPr>
           <w:lang w:eastAsia="pt-BR"/>
         </w:rPr>
-        <w:t xml:space="preserve">Clique em qualquer </w:t>
-      </w:r>
-      <w:proofErr w:type="spellStart"/>
-      <w:r>
-        <w:rPr>
-          <w:lang w:eastAsia="pt-BR"/>
-        </w:rPr>
-        <w:t>card</w:t>
-      </w:r>
-      <w:proofErr w:type="spellEnd"/>
-      <w:r>
-        <w:rPr>
-          <w:lang w:eastAsia="pt-BR"/>
-        </w:rPr>
-        <w:t xml:space="preserve"> para abrir </w:t>
+        <w:t xml:space="preserve">Clique em qualquer card para abrir </w:t>
       </w:r>
       <w:r>
         <w:rPr>
@@ -3180,9 +3002,9 @@
           <w:lang w:eastAsia="pt-BR"/>
         </w:rPr>
         <w:drawing>
-          <wp:inline distT="0" distB="0" distL="0" distR="0" wp14:anchorId="23AF7941" wp14:editId="39462F6F">
-            <wp:extent cx="2880000" cy="3246546"/>
-            <wp:effectExtent l="0" t="0" r="0" b="0"/>
+          <wp:inline distT="0" distB="0" distL="0" distR="0" wp14:anchorId="23AF7941" wp14:editId="3BBED8E1">
+            <wp:extent cx="2851182" cy="3246546"/>
+            <wp:effectExtent l="0" t="0" r="6350" b="0"/>
             <wp:docPr id="837784552" name="Imagem 1"/>
             <wp:cNvGraphicFramePr>
               <a:graphicFrameLocks xmlns:a="http://schemas.openxmlformats.org/drawingml/2006/main" noChangeAspect="1"/>
@@ -3191,7 +3013,7 @@
               <a:graphicData uri="http://schemas.openxmlformats.org/drawingml/2006/picture">
                 <pic:pic xmlns:pic="http://schemas.openxmlformats.org/drawingml/2006/picture">
                   <pic:nvPicPr>
-                    <pic:cNvPr id="0" name="Picture 1"/>
+                    <pic:cNvPr id="837784552" name="Imagem 1"/>
                     <pic:cNvPicPr>
                       <a:picLocks noChangeAspect="1" noChangeArrowheads="1"/>
                     </pic:cNvPicPr>
@@ -3204,7 +3026,6 @@
                         </a:ext>
                       </a:extLst>
                     </a:blip>
-                    <a:srcRect/>
                     <a:stretch>
                       <a:fillRect/>
                     </a:stretch>
@@ -3212,7 +3033,7 @@
                   <pic:spPr bwMode="auto">
                     <a:xfrm>
                       <a:off x="0" y="0"/>
-                      <a:ext cx="2880000" cy="3246546"/>
+                      <a:ext cx="2851182" cy="3246546"/>
                     </a:xfrm>
                     <a:prstGeom prst="rect">
                       <a:avLst/>
@@ -3267,9 +3088,9 @@
           <w:lang w:eastAsia="pt-BR"/>
         </w:rPr>
         <w:drawing>
-          <wp:inline distT="0" distB="0" distL="0" distR="0" wp14:anchorId="4EE1AA1D" wp14:editId="62033B57">
-            <wp:extent cx="3600000" cy="1075978"/>
-            <wp:effectExtent l="0" t="0" r="635" b="0"/>
+          <wp:inline distT="0" distB="0" distL="0" distR="0" wp14:anchorId="4EE1AA1D" wp14:editId="20DD59E2">
+            <wp:extent cx="3600000" cy="1057500"/>
+            <wp:effectExtent l="0" t="0" r="635" b="9525"/>
             <wp:docPr id="1356889848" name="Imagem 12"/>
             <wp:cNvGraphicFramePr>
               <a:graphicFrameLocks xmlns:a="http://schemas.openxmlformats.org/drawingml/2006/main" noChangeAspect="1"/>
@@ -3278,7 +3099,7 @@
               <a:graphicData uri="http://schemas.openxmlformats.org/drawingml/2006/picture">
                 <pic:pic xmlns:pic="http://schemas.openxmlformats.org/drawingml/2006/picture">
                   <pic:nvPicPr>
-                    <pic:cNvPr id="0" name="Picture 12"/>
+                    <pic:cNvPr id="1356889848" name="Imagem 12"/>
                     <pic:cNvPicPr>
                       <a:picLocks noChangeAspect="1" noChangeArrowheads="1"/>
                     </pic:cNvPicPr>
@@ -3291,7 +3112,6 @@
                         </a:ext>
                       </a:extLst>
                     </a:blip>
-                    <a:srcRect/>
                     <a:stretch>
                       <a:fillRect/>
                     </a:stretch>
@@ -3299,7 +3119,7 @@
                   <pic:spPr bwMode="auto">
                     <a:xfrm>
                       <a:off x="0" y="0"/>
-                      <a:ext cx="3600000" cy="1075978"/>
+                      <a:ext cx="3600000" cy="1057500"/>
                     </a:xfrm>
                     <a:prstGeom prst="rect">
                       <a:avLst/>
@@ -3380,9 +3200,9 @@
           <w:lang w:eastAsia="pt-BR"/>
         </w:rPr>
         <w:drawing>
-          <wp:inline distT="0" distB="0" distL="0" distR="0" wp14:anchorId="5CC1147A" wp14:editId="52E2D421">
-            <wp:extent cx="4320000" cy="543848"/>
-            <wp:effectExtent l="0" t="0" r="4445" b="8890"/>
+          <wp:inline distT="0" distB="0" distL="0" distR="0" wp14:anchorId="5CC1147A" wp14:editId="3CCFE4F2">
+            <wp:extent cx="4172473" cy="543848"/>
+            <wp:effectExtent l="0" t="0" r="0" b="8890"/>
             <wp:docPr id="1548495109" name="Imagem 13"/>
             <wp:cNvGraphicFramePr>
               <a:graphicFrameLocks xmlns:a="http://schemas.openxmlformats.org/drawingml/2006/main" noChangeAspect="1"/>
@@ -3391,7 +3211,7 @@
               <a:graphicData uri="http://schemas.openxmlformats.org/drawingml/2006/picture">
                 <pic:pic xmlns:pic="http://schemas.openxmlformats.org/drawingml/2006/picture">
                   <pic:nvPicPr>
-                    <pic:cNvPr id="0" name="Picture 13"/>
+                    <pic:cNvPr id="1548495109" name="Imagem 13"/>
                     <pic:cNvPicPr>
                       <a:picLocks noChangeAspect="1" noChangeArrowheads="1"/>
                     </pic:cNvPicPr>
@@ -3404,7 +3224,6 @@
                         </a:ext>
                       </a:extLst>
                     </a:blip>
-                    <a:srcRect/>
                     <a:stretch>
                       <a:fillRect/>
                     </a:stretch>
@@ -3412,7 +3231,7 @@
                   <pic:spPr bwMode="auto">
                     <a:xfrm>
                       <a:off x="0" y="0"/>
-                      <a:ext cx="4320000" cy="543848"/>
+                      <a:ext cx="4172473" cy="543848"/>
                     </a:xfrm>
                     <a:prstGeom prst="rect">
                       <a:avLst/>
@@ -3525,9 +3344,9 @@
           <w:lang w:eastAsia="pt-BR"/>
         </w:rPr>
         <w:drawing>
-          <wp:inline distT="0" distB="0" distL="0" distR="0" wp14:anchorId="330951A3" wp14:editId="4EFD27EF">
-            <wp:extent cx="3600000" cy="3274286"/>
-            <wp:effectExtent l="0" t="0" r="635" b="2540"/>
+          <wp:inline distT="0" distB="0" distL="0" distR="0" wp14:anchorId="330951A3" wp14:editId="73339860">
+            <wp:extent cx="3597672" cy="3274286"/>
+            <wp:effectExtent l="0" t="0" r="3175" b="2540"/>
             <wp:docPr id="1961135017" name="Imagem 14"/>
             <wp:cNvGraphicFramePr>
               <a:graphicFrameLocks xmlns:a="http://schemas.openxmlformats.org/drawingml/2006/main" noChangeAspect="1"/>
@@ -3536,7 +3355,7 @@
               <a:graphicData uri="http://schemas.openxmlformats.org/drawingml/2006/picture">
                 <pic:pic xmlns:pic="http://schemas.openxmlformats.org/drawingml/2006/picture">
                   <pic:nvPicPr>
-                    <pic:cNvPr id="0" name="Picture 14"/>
+                    <pic:cNvPr id="1961135017" name="Imagem 14"/>
                     <pic:cNvPicPr>
                       <a:picLocks noChangeAspect="1" noChangeArrowheads="1"/>
                     </pic:cNvPicPr>
@@ -3549,7 +3368,6 @@
                         </a:ext>
                       </a:extLst>
                     </a:blip>
-                    <a:srcRect/>
                     <a:stretch>
                       <a:fillRect/>
                     </a:stretch>
@@ -3557,7 +3375,7 @@
                   <pic:spPr bwMode="auto">
                     <a:xfrm>
                       <a:off x="0" y="0"/>
-                      <a:ext cx="3600000" cy="3274286"/>
+                      <a:ext cx="3597672" cy="3274286"/>
                     </a:xfrm>
                     <a:prstGeom prst="rect">
                       <a:avLst/>
@@ -3581,8 +3399,8 @@
       <w:pgSz w:w="11906" w:h="16838"/>
       <w:pgMar w:top="1417" w:right="1701" w:bottom="1417" w:left="1701" w:header="708" w:footer="708" w:gutter="0"/>
       <w:pgBorders w:display="notFirstPage" w:offsetFrom="page">
-        <w:left w:val="single" w:sz="18" w:space="24" w:color="A02748"/>
-        <w:right w:val="single" w:sz="18" w:space="24" w:color="A02748"/>
+        <w:left w:val="single" w:sz="18" w:space="24" w:color="00012A"/>
+        <w:right w:val="single" w:sz="18" w:space="24" w:color="00012A"/>
       </w:pgBorders>
       <w:cols w:space="708"/>
       <w:docGrid w:linePitch="360"/>
@@ -3592,7 +3410,7 @@
 </file>
 
 <file path=word/endnotes.xml><?xml version="1.0" encoding="utf-8"?>
-<w:endnotes xmlns:wpc="http://schemas.microsoft.com/office/word/2010/wordprocessingCanvas" xmlns:cx="http://schemas.microsoft.com/office/drawing/2014/chartex" xmlns:mc="http://schemas.openxmlformats.org/markup-compatibility/2006" xmlns:o="urn:schemas-microsoft-com:office:office" xmlns:r="http://schemas.openxmlformats.org/officeDocument/2006/relationships" xmlns:m="http://schemas.openxmlformats.org/officeDocument/2006/math" xmlns:v="urn:schemas-microsoft-com:vml" xmlns:wp14="http://schemas.microsoft.com/office/word/2010/wordprocessingDrawing" xmlns:wp="http://schemas.openxmlformats.org/drawingml/2006/wordprocessingDrawing" xmlns:w10="urn:schemas-microsoft-com:office:word" xmlns:w="http://schemas.openxmlformats.org/wordprocessingml/2006/main" xmlns:w14="http://schemas.microsoft.com/office/word/2010/wordml" xmlns:w15="http://schemas.microsoft.com/office/word/2012/wordml" xmlns:w16se="http://schemas.microsoft.com/office/word/2015/wordml/symex" xmlns:wpg="http://schemas.microsoft.com/office/word/2010/wordprocessingGroup" xmlns:wpi="http://schemas.microsoft.com/office/word/2010/wordprocessingInk" xmlns:wne="http://schemas.microsoft.com/office/word/2006/wordml" xmlns:wps="http://schemas.microsoft.com/office/word/2010/wordprocessingShape" mc:Ignorable="w14 w15 w16se wp14">
+<w:endnotes xmlns:wpc="http://schemas.microsoft.com/office/word/2010/wordprocessingCanvas" xmlns:cx="http://schemas.microsoft.com/office/drawing/2014/chartex" xmlns:cx1="http://schemas.microsoft.com/office/drawing/2015/9/8/chartex" xmlns:cx2="http://schemas.microsoft.com/office/drawing/2015/10/21/chartex" xmlns:cx3="http://schemas.microsoft.com/office/drawing/2016/5/9/chartex" xmlns:cx4="http://schemas.microsoft.com/office/drawing/2016/5/10/chartex" xmlns:cx5="http://schemas.microsoft.com/office/drawing/2016/5/11/chartex" xmlns:cx6="http://schemas.microsoft.com/office/drawing/2016/5/12/chartex" xmlns:cx7="http://schemas.microsoft.com/office/drawing/2016/5/13/chartex" xmlns:cx8="http://schemas.microsoft.com/office/drawing/2016/5/14/chartex" xmlns:mc="http://schemas.openxmlformats.org/markup-compatibility/2006" xmlns:aink="http://schemas.microsoft.com/office/drawing/2016/ink" xmlns:am3d="http://schemas.microsoft.com/office/drawing/2017/model3d" xmlns:o="urn:schemas-microsoft-com:office:office" xmlns:oel="http://schemas.microsoft.com/office/2019/extlst" xmlns:r="http://schemas.openxmlformats.org/officeDocument/2006/relationships" xmlns:m="http://schemas.openxmlformats.org/officeDocument/2006/math" xmlns:v="urn:schemas-microsoft-com:vml" xmlns:wp14="http://schemas.microsoft.com/office/word/2010/wordprocessingDrawing" xmlns:wp="http://schemas.openxmlformats.org/drawingml/2006/wordprocessingDrawing" xmlns:w10="urn:schemas-microsoft-com:office:word" xmlns:w="http://schemas.openxmlformats.org/wordprocessingml/2006/main" xmlns:w14="http://schemas.microsoft.com/office/word/2010/wordml" xmlns:w15="http://schemas.microsoft.com/office/word/2012/wordml" xmlns:w16cex="http://schemas.microsoft.com/office/word/2018/wordml/cex" xmlns:w16cid="http://schemas.microsoft.com/office/word/2016/wordml/cid" xmlns:w16="http://schemas.microsoft.com/office/word/2018/wordml" xmlns:w16du="http://schemas.microsoft.com/office/word/2023/wordml/word16du" xmlns:w16sdtdh="http://schemas.microsoft.com/office/word/2020/wordml/sdtdatahash" xmlns:w16sdtfl="http://schemas.microsoft.com/office/word/2024/wordml/sdtformatlock" xmlns:w16se="http://schemas.microsoft.com/office/word/2015/wordml/symex" xmlns:wpg="http://schemas.microsoft.com/office/word/2010/wordprocessingGroup" xmlns:wpi="http://schemas.microsoft.com/office/word/2010/wordprocessingInk" xmlns:wne="http://schemas.microsoft.com/office/word/2006/wordml" xmlns:wps="http://schemas.microsoft.com/office/word/2010/wordprocessingShape" mc:Ignorable="w14 w15 w16se w16cid w16 w16cex w16sdtdh w16sdtfl w16du wp14">
   <w:endnote w:type="separator" w:id="-1">
     <w:p>
       <w:pPr>
@@ -3617,7 +3435,7 @@
 </file>
 
 <file path=word/footnotes.xml><?xml version="1.0" encoding="utf-8"?>
-<w:footnotes xmlns:wpc="http://schemas.microsoft.com/office/word/2010/wordprocessingCanvas" xmlns:cx="http://schemas.microsoft.com/office/drawing/2014/chartex" xmlns:mc="http://schemas.openxmlformats.org/markup-compatibility/2006" xmlns:o="urn:schemas-microsoft-com:office:office" xmlns:r="http://schemas.openxmlformats.org/officeDocument/2006/relationships" xmlns:m="http://schemas.openxmlformats.org/officeDocument/2006/math" xmlns:v="urn:schemas-microsoft-com:vml" xmlns:wp14="http://schemas.microsoft.com/office/word/2010/wordprocessingDrawing" xmlns:wp="http://schemas.openxmlformats.org/drawingml/2006/wordprocessingDrawing" xmlns:w10="urn:schemas-microsoft-com:office:word" xmlns:w="http://schemas.openxmlformats.org/wordprocessingml/2006/main" xmlns:w14="http://schemas.microsoft.com/office/word/2010/wordml" xmlns:w15="http://schemas.microsoft.com/office/word/2012/wordml" xmlns:w16se="http://schemas.microsoft.com/office/word/2015/wordml/symex" xmlns:wpg="http://schemas.microsoft.com/office/word/2010/wordprocessingGroup" xmlns:wpi="http://schemas.microsoft.com/office/word/2010/wordprocessingInk" xmlns:wne="http://schemas.microsoft.com/office/word/2006/wordml" xmlns:wps="http://schemas.microsoft.com/office/word/2010/wordprocessingShape" mc:Ignorable="w14 w15 w16se wp14">
+<w:footnotes xmlns:wpc="http://schemas.microsoft.com/office/word/2010/wordprocessingCanvas" xmlns:cx="http://schemas.microsoft.com/office/drawing/2014/chartex" xmlns:cx1="http://schemas.microsoft.com/office/drawing/2015/9/8/chartex" xmlns:cx2="http://schemas.microsoft.com/office/drawing/2015/10/21/chartex" xmlns:cx3="http://schemas.microsoft.com/office/drawing/2016/5/9/chartex" xmlns:cx4="http://schemas.microsoft.com/office/drawing/2016/5/10/chartex" xmlns:cx5="http://schemas.microsoft.com/office/drawing/2016/5/11/chartex" xmlns:cx6="http://schemas.microsoft.com/office/drawing/2016/5/12/chartex" xmlns:cx7="http://schemas.microsoft.com/office/drawing/2016/5/13/chartex" xmlns:cx8="http://schemas.microsoft.com/office/drawing/2016/5/14/chartex" xmlns:mc="http://schemas.openxmlformats.org/markup-compatibility/2006" xmlns:aink="http://schemas.microsoft.com/office/drawing/2016/ink" xmlns:am3d="http://schemas.microsoft.com/office/drawing/2017/model3d" xmlns:o="urn:schemas-microsoft-com:office:office" xmlns:oel="http://schemas.microsoft.com/office/2019/extlst" xmlns:r="http://schemas.openxmlformats.org/officeDocument/2006/relationships" xmlns:m="http://schemas.openxmlformats.org/officeDocument/2006/math" xmlns:v="urn:schemas-microsoft-com:vml" xmlns:wp14="http://schemas.microsoft.com/office/word/2010/wordprocessingDrawing" xmlns:wp="http://schemas.openxmlformats.org/drawingml/2006/wordprocessingDrawing" xmlns:w10="urn:schemas-microsoft-com:office:word" xmlns:w="http://schemas.openxmlformats.org/wordprocessingml/2006/main" xmlns:w14="http://schemas.microsoft.com/office/word/2010/wordml" xmlns:w15="http://schemas.microsoft.com/office/word/2012/wordml" xmlns:w16cex="http://schemas.microsoft.com/office/word/2018/wordml/cex" xmlns:w16cid="http://schemas.microsoft.com/office/word/2016/wordml/cid" xmlns:w16="http://schemas.microsoft.com/office/word/2018/wordml" xmlns:w16du="http://schemas.microsoft.com/office/word/2023/wordml/word16du" xmlns:w16sdtdh="http://schemas.microsoft.com/office/word/2020/wordml/sdtdatahash" xmlns:w16sdtfl="http://schemas.microsoft.com/office/word/2024/wordml/sdtformatlock" xmlns:w16se="http://schemas.microsoft.com/office/word/2015/wordml/symex" xmlns:wpg="http://schemas.microsoft.com/office/word/2010/wordprocessingGroup" xmlns:wpi="http://schemas.microsoft.com/office/word/2010/wordprocessingInk" xmlns:wne="http://schemas.microsoft.com/office/word/2006/wordml" xmlns:wps="http://schemas.microsoft.com/office/word/2010/wordprocessingShape" mc:Ignorable="w14 w15 w16se w16cid w16 w16cex w16sdtdh w16sdtfl w16du wp14">
   <w:footnote w:type="separator" w:id="-1">
     <w:p>
       <w:pPr>
@@ -3642,7 +3460,7 @@
 </file>
 
 <file path=word/header1.xml><?xml version="1.0" encoding="utf-8"?>
-<w:hdr xmlns:wpc="http://schemas.microsoft.com/office/word/2010/wordprocessingCanvas" xmlns:cx="http://schemas.microsoft.com/office/drawing/2014/chartex" xmlns:mc="http://schemas.openxmlformats.org/markup-compatibility/2006" xmlns:o="urn:schemas-microsoft-com:office:office" xmlns:r="http://schemas.openxmlformats.org/officeDocument/2006/relationships" xmlns:m="http://schemas.openxmlformats.org/officeDocument/2006/math" xmlns:v="urn:schemas-microsoft-com:vml" xmlns:wp14="http://schemas.microsoft.com/office/word/2010/wordprocessingDrawing" xmlns:wp="http://schemas.openxmlformats.org/drawingml/2006/wordprocessingDrawing" xmlns:w10="urn:schemas-microsoft-com:office:word" xmlns:w="http://schemas.openxmlformats.org/wordprocessingml/2006/main" xmlns:w14="http://schemas.microsoft.com/office/word/2010/wordml" xmlns:w15="http://schemas.microsoft.com/office/word/2012/wordml" xmlns:w16se="http://schemas.microsoft.com/office/word/2015/wordml/symex" xmlns:wpg="http://schemas.microsoft.com/office/word/2010/wordprocessingGroup" xmlns:wpi="http://schemas.microsoft.com/office/word/2010/wordprocessingInk" xmlns:wne="http://schemas.microsoft.com/office/word/2006/wordml" xmlns:wps="http://schemas.microsoft.com/office/word/2010/wordprocessingShape" mc:Ignorable="w14 w15 w16se wp14">
+<w:hdr xmlns:wpc="http://schemas.microsoft.com/office/word/2010/wordprocessingCanvas" xmlns:cx="http://schemas.microsoft.com/office/drawing/2014/chartex" xmlns:cx1="http://schemas.microsoft.com/office/drawing/2015/9/8/chartex" xmlns:cx2="http://schemas.microsoft.com/office/drawing/2015/10/21/chartex" xmlns:cx3="http://schemas.microsoft.com/office/drawing/2016/5/9/chartex" xmlns:cx4="http://schemas.microsoft.com/office/drawing/2016/5/10/chartex" xmlns:cx5="http://schemas.microsoft.com/office/drawing/2016/5/11/chartex" xmlns:cx6="http://schemas.microsoft.com/office/drawing/2016/5/12/chartex" xmlns:cx7="http://schemas.microsoft.com/office/drawing/2016/5/13/chartex" xmlns:cx8="http://schemas.microsoft.com/office/drawing/2016/5/14/chartex" xmlns:mc="http://schemas.openxmlformats.org/markup-compatibility/2006" xmlns:aink="http://schemas.microsoft.com/office/drawing/2016/ink" xmlns:am3d="http://schemas.microsoft.com/office/drawing/2017/model3d" xmlns:o="urn:schemas-microsoft-com:office:office" xmlns:oel="http://schemas.microsoft.com/office/2019/extlst" xmlns:r="http://schemas.openxmlformats.org/officeDocument/2006/relationships" xmlns:m="http://schemas.openxmlformats.org/officeDocument/2006/math" xmlns:v="urn:schemas-microsoft-com:vml" xmlns:wp14="http://schemas.microsoft.com/office/word/2010/wordprocessingDrawing" xmlns:wp="http://schemas.openxmlformats.org/drawingml/2006/wordprocessingDrawing" xmlns:w10="urn:schemas-microsoft-com:office:word" xmlns:w="http://schemas.openxmlformats.org/wordprocessingml/2006/main" xmlns:w14="http://schemas.microsoft.com/office/word/2010/wordml" xmlns:w15="http://schemas.microsoft.com/office/word/2012/wordml" xmlns:w16cex="http://schemas.microsoft.com/office/word/2018/wordml/cex" xmlns:w16cid="http://schemas.microsoft.com/office/word/2016/wordml/cid" xmlns:w16="http://schemas.microsoft.com/office/word/2018/wordml" xmlns:w16du="http://schemas.microsoft.com/office/word/2023/wordml/word16du" xmlns:w16sdtdh="http://schemas.microsoft.com/office/word/2020/wordml/sdtdatahash" xmlns:w16sdtfl="http://schemas.microsoft.com/office/word/2024/wordml/sdtformatlock" xmlns:w16se="http://schemas.microsoft.com/office/word/2015/wordml/symex" xmlns:wpg="http://schemas.microsoft.com/office/word/2010/wordprocessingGroup" xmlns:wpi="http://schemas.microsoft.com/office/word/2010/wordprocessingInk" xmlns:wne="http://schemas.microsoft.com/office/word/2006/wordml" xmlns:wps="http://schemas.microsoft.com/office/word/2010/wordprocessingShape" mc:Ignorable="w14 w15 w16se w16cid w16 w16cex w16sdtdh w16sdtfl w16du wp14">
   <w:p>
     <w:pPr>
       <w:pStyle w:val="Cabealho"/>
@@ -3652,7 +3470,7 @@
 </file>
 
 <file path=word/header2.xml><?xml version="1.0" encoding="utf-8"?>
-<w:hdr xmlns:wpc="http://schemas.microsoft.com/office/word/2010/wordprocessingCanvas" xmlns:cx="http://schemas.microsoft.com/office/drawing/2014/chartex" xmlns:mc="http://schemas.openxmlformats.org/markup-compatibility/2006" xmlns:o="urn:schemas-microsoft-com:office:office" xmlns:r="http://schemas.openxmlformats.org/officeDocument/2006/relationships" xmlns:m="http://schemas.openxmlformats.org/officeDocument/2006/math" xmlns:v="urn:schemas-microsoft-com:vml" xmlns:wp14="http://schemas.microsoft.com/office/word/2010/wordprocessingDrawing" xmlns:wp="http://schemas.openxmlformats.org/drawingml/2006/wordprocessingDrawing" xmlns:w10="urn:schemas-microsoft-com:office:word" xmlns:w="http://schemas.openxmlformats.org/wordprocessingml/2006/main" xmlns:w14="http://schemas.microsoft.com/office/word/2010/wordml" xmlns:w15="http://schemas.microsoft.com/office/word/2012/wordml" xmlns:w16se="http://schemas.microsoft.com/office/word/2015/wordml/symex" xmlns:wpg="http://schemas.microsoft.com/office/word/2010/wordprocessingGroup" xmlns:wpi="http://schemas.microsoft.com/office/word/2010/wordprocessingInk" xmlns:wne="http://schemas.microsoft.com/office/word/2006/wordml" xmlns:wps="http://schemas.microsoft.com/office/word/2010/wordprocessingShape" mc:Ignorable="w14 w15 w16se wp14">
+<w:hdr xmlns:wpc="http://schemas.microsoft.com/office/word/2010/wordprocessingCanvas" xmlns:cx="http://schemas.microsoft.com/office/drawing/2014/chartex" xmlns:cx1="http://schemas.microsoft.com/office/drawing/2015/9/8/chartex" xmlns:cx2="http://schemas.microsoft.com/office/drawing/2015/10/21/chartex" xmlns:cx3="http://schemas.microsoft.com/office/drawing/2016/5/9/chartex" xmlns:cx4="http://schemas.microsoft.com/office/drawing/2016/5/10/chartex" xmlns:cx5="http://schemas.microsoft.com/office/drawing/2016/5/11/chartex" xmlns:cx6="http://schemas.microsoft.com/office/drawing/2016/5/12/chartex" xmlns:cx7="http://schemas.microsoft.com/office/drawing/2016/5/13/chartex" xmlns:cx8="http://schemas.microsoft.com/office/drawing/2016/5/14/chartex" xmlns:mc="http://schemas.openxmlformats.org/markup-compatibility/2006" xmlns:aink="http://schemas.microsoft.com/office/drawing/2016/ink" xmlns:am3d="http://schemas.microsoft.com/office/drawing/2017/model3d" xmlns:o="urn:schemas-microsoft-com:office:office" xmlns:oel="http://schemas.microsoft.com/office/2019/extlst" xmlns:r="http://schemas.openxmlformats.org/officeDocument/2006/relationships" xmlns:m="http://schemas.openxmlformats.org/officeDocument/2006/math" xmlns:v="urn:schemas-microsoft-com:vml" xmlns:wp14="http://schemas.microsoft.com/office/word/2010/wordprocessingDrawing" xmlns:wp="http://schemas.openxmlformats.org/drawingml/2006/wordprocessingDrawing" xmlns:w10="urn:schemas-microsoft-com:office:word" xmlns:w="http://schemas.openxmlformats.org/wordprocessingml/2006/main" xmlns:w14="http://schemas.microsoft.com/office/word/2010/wordml" xmlns:w15="http://schemas.microsoft.com/office/word/2012/wordml" xmlns:w16cex="http://schemas.microsoft.com/office/word/2018/wordml/cex" xmlns:w16cid="http://schemas.microsoft.com/office/word/2016/wordml/cid" xmlns:w16="http://schemas.microsoft.com/office/word/2018/wordml" xmlns:w16du="http://schemas.microsoft.com/office/word/2023/wordml/word16du" xmlns:w16sdtdh="http://schemas.microsoft.com/office/word/2020/wordml/sdtdatahash" xmlns:w16sdtfl="http://schemas.microsoft.com/office/word/2024/wordml/sdtformatlock" xmlns:w16se="http://schemas.microsoft.com/office/word/2015/wordml/symex" xmlns:wpg="http://schemas.microsoft.com/office/word/2010/wordprocessingGroup" xmlns:wpi="http://schemas.microsoft.com/office/word/2010/wordprocessingInk" xmlns:wne="http://schemas.microsoft.com/office/word/2006/wordml" xmlns:wps="http://schemas.microsoft.com/office/word/2010/wordprocessingShape" mc:Ignorable="w14 w15 w16se w16cid w16 w16cex w16sdtdh w16sdtfl w16du wp14">
   <w:p>
     <w:pPr>
       <w:pStyle w:val="Cabealho"/>
@@ -3662,7 +3480,7 @@
 </file>
 
 <file path=word/header3.xml><?xml version="1.0" encoding="utf-8"?>
-<w:hdr xmlns:wpc="http://schemas.microsoft.com/office/word/2010/wordprocessingCanvas" xmlns:cx="http://schemas.microsoft.com/office/drawing/2014/chartex" xmlns:mc="http://schemas.openxmlformats.org/markup-compatibility/2006" xmlns:o="urn:schemas-microsoft-com:office:office" xmlns:r="http://schemas.openxmlformats.org/officeDocument/2006/relationships" xmlns:m="http://schemas.openxmlformats.org/officeDocument/2006/math" xmlns:v="urn:schemas-microsoft-com:vml" xmlns:wp14="http://schemas.microsoft.com/office/word/2010/wordprocessingDrawing" xmlns:wp="http://schemas.openxmlformats.org/drawingml/2006/wordprocessingDrawing" xmlns:w10="urn:schemas-microsoft-com:office:word" xmlns:w="http://schemas.openxmlformats.org/wordprocessingml/2006/main" xmlns:w14="http://schemas.microsoft.com/office/word/2010/wordml" xmlns:w15="http://schemas.microsoft.com/office/word/2012/wordml" xmlns:w16se="http://schemas.microsoft.com/office/word/2015/wordml/symex" xmlns:wpg="http://schemas.microsoft.com/office/word/2010/wordprocessingGroup" xmlns:wpi="http://schemas.microsoft.com/office/word/2010/wordprocessingInk" xmlns:wne="http://schemas.microsoft.com/office/word/2006/wordml" xmlns:wps="http://schemas.microsoft.com/office/word/2010/wordprocessingShape" mc:Ignorable="w14 w15 w16se wp14">
+<w:hdr xmlns:wpc="http://schemas.microsoft.com/office/word/2010/wordprocessingCanvas" xmlns:cx="http://schemas.microsoft.com/office/drawing/2014/chartex" xmlns:cx1="http://schemas.microsoft.com/office/drawing/2015/9/8/chartex" xmlns:cx2="http://schemas.microsoft.com/office/drawing/2015/10/21/chartex" xmlns:cx3="http://schemas.microsoft.com/office/drawing/2016/5/9/chartex" xmlns:cx4="http://schemas.microsoft.com/office/drawing/2016/5/10/chartex" xmlns:cx5="http://schemas.microsoft.com/office/drawing/2016/5/11/chartex" xmlns:cx6="http://schemas.microsoft.com/office/drawing/2016/5/12/chartex" xmlns:cx7="http://schemas.microsoft.com/office/drawing/2016/5/13/chartex" xmlns:cx8="http://schemas.microsoft.com/office/drawing/2016/5/14/chartex" xmlns:mc="http://schemas.openxmlformats.org/markup-compatibility/2006" xmlns:aink="http://schemas.microsoft.com/office/drawing/2016/ink" xmlns:am3d="http://schemas.microsoft.com/office/drawing/2017/model3d" xmlns:o="urn:schemas-microsoft-com:office:office" xmlns:oel="http://schemas.microsoft.com/office/2019/extlst" xmlns:r="http://schemas.openxmlformats.org/officeDocument/2006/relationships" xmlns:m="http://schemas.openxmlformats.org/officeDocument/2006/math" xmlns:v="urn:schemas-microsoft-com:vml" xmlns:wp14="http://schemas.microsoft.com/office/word/2010/wordprocessingDrawing" xmlns:wp="http://schemas.openxmlformats.org/drawingml/2006/wordprocessingDrawing" xmlns:w10="urn:schemas-microsoft-com:office:word" xmlns:w="http://schemas.openxmlformats.org/wordprocessingml/2006/main" xmlns:w14="http://schemas.microsoft.com/office/word/2010/wordml" xmlns:w15="http://schemas.microsoft.com/office/word/2012/wordml" xmlns:w16cex="http://schemas.microsoft.com/office/word/2018/wordml/cex" xmlns:w16cid="http://schemas.microsoft.com/office/word/2016/wordml/cid" xmlns:w16="http://schemas.microsoft.com/office/word/2018/wordml" xmlns:w16du="http://schemas.microsoft.com/office/word/2023/wordml/word16du" xmlns:w16sdtdh="http://schemas.microsoft.com/office/word/2020/wordml/sdtdatahash" xmlns:w16sdtfl="http://schemas.microsoft.com/office/word/2024/wordml/sdtformatlock" xmlns:w16se="http://schemas.microsoft.com/office/word/2015/wordml/symex" xmlns:wpg="http://schemas.microsoft.com/office/word/2010/wordprocessingGroup" xmlns:wpi="http://schemas.microsoft.com/office/word/2010/wordprocessingInk" xmlns:wne="http://schemas.microsoft.com/office/word/2006/wordml" xmlns:wps="http://schemas.microsoft.com/office/word/2010/wordprocessingShape" mc:Ignorable="w14 w15 w16se w16cid w16 w16cex w16sdtdh w16sdtfl w16du wp14">
   <w:p>
     <w:pPr>
       <w:pStyle w:val="Cabealho"/>
@@ -3672,7 +3490,7 @@
 </file>
 
 <file path=word/numbering.xml><?xml version="1.0" encoding="utf-8"?>
-<w:numbering xmlns:wpc="http://schemas.microsoft.com/office/word/2010/wordprocessingCanvas" xmlns:cx="http://schemas.microsoft.com/office/drawing/2014/chartex" xmlns:mc="http://schemas.openxmlformats.org/markup-compatibility/2006" xmlns:o="urn:schemas-microsoft-com:office:office" xmlns:r="http://schemas.openxmlformats.org/officeDocument/2006/relationships" xmlns:m="http://schemas.openxmlformats.org/officeDocument/2006/math" xmlns:v="urn:schemas-microsoft-com:vml" xmlns:wp14="http://schemas.microsoft.com/office/word/2010/wordprocessingDrawing" xmlns:wp="http://schemas.openxmlformats.org/drawingml/2006/wordprocessingDrawing" xmlns:w10="urn:schemas-microsoft-com:office:word" xmlns:w="http://schemas.openxmlformats.org/wordprocessingml/2006/main" xmlns:w14="http://schemas.microsoft.com/office/word/2010/wordml" xmlns:w15="http://schemas.microsoft.com/office/word/2012/wordml" xmlns:w16se="http://schemas.microsoft.com/office/word/2015/wordml/symex" xmlns:wpg="http://schemas.microsoft.com/office/word/2010/wordprocessingGroup" xmlns:wpi="http://schemas.microsoft.com/office/word/2010/wordprocessingInk" xmlns:wne="http://schemas.microsoft.com/office/word/2006/wordml" xmlns:wps="http://schemas.microsoft.com/office/word/2010/wordprocessingShape" mc:Ignorable="w14 w15 w16se wp14">
+<w:numbering xmlns:wpc="http://schemas.microsoft.com/office/word/2010/wordprocessingCanvas" xmlns:cx="http://schemas.microsoft.com/office/drawing/2014/chartex" xmlns:cx1="http://schemas.microsoft.com/office/drawing/2015/9/8/chartex" xmlns:cx2="http://schemas.microsoft.com/office/drawing/2015/10/21/chartex" xmlns:cx3="http://schemas.microsoft.com/office/drawing/2016/5/9/chartex" xmlns:cx4="http://schemas.microsoft.com/office/drawing/2016/5/10/chartex" xmlns:cx5="http://schemas.microsoft.com/office/drawing/2016/5/11/chartex" xmlns:cx6="http://schemas.microsoft.com/office/drawing/2016/5/12/chartex" xmlns:cx7="http://schemas.microsoft.com/office/drawing/2016/5/13/chartex" xmlns:cx8="http://schemas.microsoft.com/office/drawing/2016/5/14/chartex" xmlns:mc="http://schemas.openxmlformats.org/markup-compatibility/2006" xmlns:aink="http://schemas.microsoft.com/office/drawing/2016/ink" xmlns:am3d="http://schemas.microsoft.com/office/drawing/2017/model3d" xmlns:o="urn:schemas-microsoft-com:office:office" xmlns:oel="http://schemas.microsoft.com/office/2019/extlst" xmlns:r="http://schemas.openxmlformats.org/officeDocument/2006/relationships" xmlns:m="http://schemas.openxmlformats.org/officeDocument/2006/math" xmlns:v="urn:schemas-microsoft-com:vml" xmlns:wp14="http://schemas.microsoft.com/office/word/2010/wordprocessingDrawing" xmlns:wp="http://schemas.openxmlformats.org/drawingml/2006/wordprocessingDrawing" xmlns:w10="urn:schemas-microsoft-com:office:word" xmlns:w="http://schemas.openxmlformats.org/wordprocessingml/2006/main" xmlns:w14="http://schemas.microsoft.com/office/word/2010/wordml" xmlns:w15="http://schemas.microsoft.com/office/word/2012/wordml" xmlns:w16cex="http://schemas.microsoft.com/office/word/2018/wordml/cex" xmlns:w16cid="http://schemas.microsoft.com/office/word/2016/wordml/cid" xmlns:w16="http://schemas.microsoft.com/office/word/2018/wordml" xmlns:w16du="http://schemas.microsoft.com/office/word/2023/wordml/word16du" xmlns:w16sdtdh="http://schemas.microsoft.com/office/word/2020/wordml/sdtdatahash" xmlns:w16sdtfl="http://schemas.microsoft.com/office/word/2024/wordml/sdtformatlock" xmlns:w16se="http://schemas.microsoft.com/office/word/2015/wordml/symex" xmlns:wpg="http://schemas.microsoft.com/office/word/2010/wordprocessingGroup" xmlns:wpi="http://schemas.microsoft.com/office/word/2010/wordprocessingInk" xmlns:wne="http://schemas.microsoft.com/office/word/2006/wordml" xmlns:wps="http://schemas.microsoft.com/office/word/2010/wordprocessingShape" mc:Ignorable="w14 w15 w16se w16cid w16 w16cex w16sdtdh w16sdtfl w16du wp14">
   <w:abstractNum w:abstractNumId="0" w15:restartNumberingAfterBreak="0">
     <w:nsid w:val="039C36E8"/>
     <w:multiLevelType w:val="hybridMultilevel"/>
@@ -4500,32 +4318,32 @@
       </w:rPr>
     </w:lvl>
   </w:abstractNum>
-  <w:num w:numId="1">
+  <w:num w:numId="1" w16cid:durableId="669020668">
     <w:abstractNumId w:val="1"/>
   </w:num>
-  <w:num w:numId="2">
+  <w:num w:numId="2" w16cid:durableId="1356153461">
     <w:abstractNumId w:val="0"/>
   </w:num>
-  <w:num w:numId="3">
+  <w:num w:numId="3" w16cid:durableId="1280985823">
     <w:abstractNumId w:val="4"/>
   </w:num>
-  <w:num w:numId="4">
+  <w:num w:numId="4" w16cid:durableId="1780755098">
     <w:abstractNumId w:val="6"/>
   </w:num>
-  <w:num w:numId="5">
+  <w:num w:numId="5" w16cid:durableId="842666193">
     <w:abstractNumId w:val="3"/>
   </w:num>
-  <w:num w:numId="6">
+  <w:num w:numId="6" w16cid:durableId="841624849">
     <w:abstractNumId w:val="2"/>
   </w:num>
-  <w:num w:numId="7">
+  <w:num w:numId="7" w16cid:durableId="1590235269">
     <w:abstractNumId w:val="5"/>
   </w:num>
 </w:numbering>
 </file>
 
 <file path=word/styles.xml><?xml version="1.0" encoding="utf-8"?>
-<w:styles xmlns:mc="http://schemas.openxmlformats.org/markup-compatibility/2006" xmlns:r="http://schemas.openxmlformats.org/officeDocument/2006/relationships" xmlns:w="http://schemas.openxmlformats.org/wordprocessingml/2006/main" xmlns:w14="http://schemas.microsoft.com/office/word/2010/wordml" xmlns:w15="http://schemas.microsoft.com/office/word/2012/wordml" xmlns:w16se="http://schemas.microsoft.com/office/word/2015/wordml/symex" mc:Ignorable="w14 w15 w16se">
+<w:styles xmlns:mc="http://schemas.openxmlformats.org/markup-compatibility/2006" xmlns:r="http://schemas.openxmlformats.org/officeDocument/2006/relationships" xmlns:w="http://schemas.openxmlformats.org/wordprocessingml/2006/main" xmlns:w14="http://schemas.microsoft.com/office/word/2010/wordml" xmlns:w15="http://schemas.microsoft.com/office/word/2012/wordml" xmlns:w16cex="http://schemas.microsoft.com/office/word/2018/wordml/cex" xmlns:w16cid="http://schemas.microsoft.com/office/word/2016/wordml/cid" xmlns:w16="http://schemas.microsoft.com/office/word/2018/wordml" xmlns:w16du="http://schemas.microsoft.com/office/word/2023/wordml/word16du" xmlns:w16sdtdh="http://schemas.microsoft.com/office/word/2020/wordml/sdtdatahash" xmlns:w16sdtfl="http://schemas.microsoft.com/office/word/2024/wordml/sdtformatlock" xmlns:w16se="http://schemas.microsoft.com/office/word/2015/wordml/symex" mc:Ignorable="w14 w15 w16se w16cid w16 w16cex w16sdtdh w16sdtfl w16du">
   <w:docDefaults>
     <w:rPrDefault>
       <w:rPr>
@@ -4541,7 +4359,7 @@
       </w:pPr>
     </w:pPrDefault>
   </w:docDefaults>
-  <w:latentStyles w:defLockedState="0" w:defUIPriority="99" w:defSemiHidden="0" w:defUnhideWhenUsed="0" w:defQFormat="0" w:count="371">
+  <w:latentStyles w:defLockedState="0" w:defUIPriority="99" w:defSemiHidden="0" w:defUnhideWhenUsed="0" w:defQFormat="0" w:count="376">
     <w:lsdException w:name="Normal" w:uiPriority="0" w:qFormat="1"/>
     <w:lsdException w:name="heading 1" w:uiPriority="9" w:qFormat="1"/>
     <w:lsdException w:name="heading 2" w:semiHidden="1" w:uiPriority="9" w:unhideWhenUsed="1" w:qFormat="1"/>
@@ -4913,6 +4731,11 @@
     <w:lsdException w:name="List Table 5 Dark Accent 6" w:uiPriority="50"/>
     <w:lsdException w:name="List Table 6 Colorful Accent 6" w:uiPriority="51"/>
     <w:lsdException w:name="List Table 7 Colorful Accent 6" w:uiPriority="52"/>
+    <w:lsdException w:name="Mention" w:semiHidden="1" w:unhideWhenUsed="1"/>
+    <w:lsdException w:name="Smart Hyperlink" w:semiHidden="1" w:unhideWhenUsed="1"/>
+    <w:lsdException w:name="Hashtag" w:semiHidden="1" w:unhideWhenUsed="1"/>
+    <w:lsdException w:name="Unresolved Mention" w:semiHidden="1" w:unhideWhenUsed="1"/>
+    <w:lsdException w:name="Smart Link" w:semiHidden="1" w:unhideWhenUsed="1"/>
   </w:latentStyles>
   <w:style w:type="paragraph" w:default="1" w:styleId="Normal">
     <w:name w:val="Normal"/>

</xml_diff>

<commit_message>
alteração no manual que eu tinha esquecido de alterar
</commit_message>
<xml_diff>
--- a/Anotações/Manual_Site.docx
+++ b/Anotações/Manual_Site.docx
@@ -853,9 +853,9 @@
           <w:lang w:eastAsia="pt-BR"/>
         </w:rPr>
         <w:drawing>
-          <wp:inline distT="0" distB="0" distL="0" distR="0" wp14:anchorId="46D3F9CC" wp14:editId="1722C9E0">
-            <wp:extent cx="4320000" cy="1498826"/>
-            <wp:effectExtent l="0" t="0" r="4445" b="6350"/>
+          <wp:inline distT="0" distB="0" distL="0" distR="0" wp14:anchorId="46D3F9CC" wp14:editId="7BD5B18C">
+            <wp:extent cx="4320000" cy="1471484"/>
+            <wp:effectExtent l="0" t="0" r="4445" b="0"/>
             <wp:docPr id="799963190" name="Imagem 7"/>
             <wp:cNvGraphicFramePr>
               <a:graphicFrameLocks xmlns:a="http://schemas.openxmlformats.org/drawingml/2006/main" noChangeAspect="1"/>
@@ -884,7 +884,7 @@
                   <pic:spPr bwMode="auto">
                     <a:xfrm>
                       <a:off x="0" y="0"/>
-                      <a:ext cx="4320000" cy="1498826"/>
+                      <a:ext cx="4320000" cy="1471484"/>
                     </a:xfrm>
                     <a:prstGeom prst="rect">
                       <a:avLst/>
@@ -1246,7 +1246,7 @@
           <w:lang w:eastAsia="pt-BR"/>
         </w:rPr>
         <w:drawing>
-          <wp:inline distT="0" distB="0" distL="0" distR="0" wp14:anchorId="26F3162D" wp14:editId="52A97F21">
+          <wp:inline distT="0" distB="0" distL="0" distR="0" wp14:anchorId="26F3162D" wp14:editId="79DBAF01">
             <wp:extent cx="4320000" cy="218734"/>
             <wp:effectExtent l="0" t="0" r="0" b="0"/>
             <wp:docPr id="1995527049" name="Imagem 12"/>
@@ -2067,9 +2067,9 @@
           <w:lang w:eastAsia="pt-BR"/>
         </w:rPr>
         <w:drawing>
-          <wp:inline distT="0" distB="0" distL="0" distR="0" wp14:anchorId="4AF65A50" wp14:editId="1D61453D">
-            <wp:extent cx="4266828" cy="220952"/>
-            <wp:effectExtent l="0" t="0" r="0" b="8255"/>
+          <wp:inline distT="0" distB="0" distL="0" distR="0" wp14:anchorId="4AF65A50" wp14:editId="5C170305">
+            <wp:extent cx="4266828" cy="216041"/>
+            <wp:effectExtent l="0" t="0" r="635" b="0"/>
             <wp:docPr id="152315513" name="Imagem 6"/>
             <wp:cNvGraphicFramePr>
               <a:graphicFrameLocks xmlns:a="http://schemas.openxmlformats.org/drawingml/2006/main" noChangeAspect="1"/>
@@ -2098,7 +2098,7 @@
                   <pic:spPr bwMode="auto">
                     <a:xfrm>
                       <a:off x="0" y="0"/>
-                      <a:ext cx="4266828" cy="220952"/>
+                      <a:ext cx="4266828" cy="216041"/>
                     </a:xfrm>
                     <a:prstGeom prst="rect">
                       <a:avLst/>
@@ -2453,7 +2453,7 @@
           <w:lang w:eastAsia="pt-BR"/>
         </w:rPr>
         <w:drawing>
-          <wp:inline distT="0" distB="0" distL="0" distR="0" wp14:anchorId="068A9E17" wp14:editId="0E8EE34C">
+          <wp:inline distT="0" distB="0" distL="0" distR="0" wp14:anchorId="068A9E17" wp14:editId="6FCB0F4D">
             <wp:extent cx="4320000" cy="218734"/>
             <wp:effectExtent l="0" t="0" r="0" b="0"/>
             <wp:docPr id="1576847926" name="Imagem 8"/>
@@ -2697,7 +2697,19 @@
         <w:rPr>
           <w:lang w:eastAsia="pt-BR"/>
         </w:rPr>
-        <w:t>Clique na logo no topo esquerdo para retornar à página inicial a qualquer momento.</w:t>
+        <w:t xml:space="preserve">Clique na logo no topo esquerdo </w:t>
+      </w:r>
+      <w:r>
+        <w:rPr>
+          <w:lang w:eastAsia="pt-BR"/>
+        </w:rPr>
+        <w:t xml:space="preserve">ou no link no topo direito </w:t>
+      </w:r>
+      <w:r>
+        <w:rPr>
+          <w:lang w:eastAsia="pt-BR"/>
+        </w:rPr>
+        <w:t>para retornar à página inicial a qualquer momento.</w:t>
       </w:r>
     </w:p>
     <w:p>
@@ -2714,10 +2726,10 @@
           <w:lang w:eastAsia="pt-BR"/>
         </w:rPr>
         <w:drawing>
-          <wp:inline distT="0" distB="0" distL="0" distR="0" wp14:anchorId="546BF58B" wp14:editId="18CEF6AD">
+          <wp:inline distT="0" distB="0" distL="0" distR="0" wp14:anchorId="73A0A8BC" wp14:editId="10B6072C">
             <wp:extent cx="1800000" cy="1218045"/>
             <wp:effectExtent l="0" t="0" r="0" b="1270"/>
-            <wp:docPr id="540877148" name="Imagem 10"/>
+            <wp:docPr id="1611266237" name="Imagem 10" descr="Desenho de um círculo&#10;&#10;O conteúdo gerado por IA pode estar incorreto."/>
             <wp:cNvGraphicFramePr>
               <a:graphicFrameLocks xmlns:a="http://schemas.openxmlformats.org/drawingml/2006/main" noChangeAspect="1"/>
             </wp:cNvGraphicFramePr>
@@ -2725,7 +2737,7 @@
               <a:graphicData uri="http://schemas.openxmlformats.org/drawingml/2006/picture">
                 <pic:pic xmlns:pic="http://schemas.openxmlformats.org/drawingml/2006/picture">
                   <pic:nvPicPr>
-                    <pic:cNvPr id="540877148" name="Imagem 10"/>
+                    <pic:cNvPr id="1611266237" name="Imagem 10" descr="Desenho de um círculo&#10;&#10;O conteúdo gerado por IA pode estar incorreto."/>
                     <pic:cNvPicPr>
                       <a:picLocks noChangeAspect="1" noChangeArrowheads="1"/>
                     </pic:cNvPicPr>
@@ -2761,6 +2773,65 @@
           </wp:inline>
         </w:drawing>
       </w:r>
+      <w:r>
+        <w:rPr>
+          <w:lang w:eastAsia="pt-BR"/>
+        </w:rPr>
+        <w:tab/>
+      </w:r>
+      <w:r>
+        <w:rPr>
+          <w:noProof/>
+          <w:lang w:eastAsia="pt-BR"/>
+        </w:rPr>
+        <w:drawing>
+          <wp:inline distT="0" distB="0" distL="0" distR="0" wp14:anchorId="546BF58B" wp14:editId="18B78B19">
+            <wp:extent cx="1439507" cy="1218045"/>
+            <wp:effectExtent l="0" t="0" r="8890" b="1270"/>
+            <wp:docPr id="540877148" name="Imagem 10"/>
+            <wp:cNvGraphicFramePr>
+              <a:graphicFrameLocks xmlns:a="http://schemas.openxmlformats.org/drawingml/2006/main" noChangeAspect="1"/>
+            </wp:cNvGraphicFramePr>
+            <a:graphic xmlns:a="http://schemas.openxmlformats.org/drawingml/2006/main">
+              <a:graphicData uri="http://schemas.openxmlformats.org/drawingml/2006/picture">
+                <pic:pic xmlns:pic="http://schemas.openxmlformats.org/drawingml/2006/picture">
+                  <pic:nvPicPr>
+                    <pic:cNvPr id="540877148" name="Imagem 10"/>
+                    <pic:cNvPicPr>
+                      <a:picLocks noChangeAspect="1" noChangeArrowheads="1"/>
+                    </pic:cNvPicPr>
+                  </pic:nvPicPr>
+                  <pic:blipFill>
+                    <a:blip r:embed="rId29">
+                      <a:extLst>
+                        <a:ext uri="{28A0092B-C50C-407E-A947-70E740481C1C}">
+                          <a14:useLocalDpi xmlns:a14="http://schemas.microsoft.com/office/drawing/2010/main" val="0"/>
+                        </a:ext>
+                      </a:extLst>
+                    </a:blip>
+                    <a:stretch>
+                      <a:fillRect/>
+                    </a:stretch>
+                  </pic:blipFill>
+                  <pic:spPr bwMode="auto">
+                    <a:xfrm>
+                      <a:off x="0" y="0"/>
+                      <a:ext cx="1439507" cy="1218045"/>
+                    </a:xfrm>
+                    <a:prstGeom prst="rect">
+                      <a:avLst/>
+                    </a:prstGeom>
+                    <a:noFill/>
+                    <a:ln>
+                      <a:noFill/>
+                    </a:ln>
+                  </pic:spPr>
+                </pic:pic>
+              </a:graphicData>
+            </a:graphic>
+          </wp:inline>
+        </w:drawing>
+      </w:r>
     </w:p>
     <w:p>
       <w:pPr>
@@ -2865,7 +2936,7 @@
                     </pic:cNvPicPr>
                   </pic:nvPicPr>
                   <pic:blipFill>
-                    <a:blip r:embed="rId29">
+                    <a:blip r:embed="rId30">
                       <a:extLst>
                         <a:ext uri="{28A0092B-C50C-407E-A947-70E740481C1C}">
                           <a14:useLocalDpi xmlns:a14="http://schemas.microsoft.com/office/drawing/2010/main" val="0"/>
@@ -3019,7 +3090,7 @@
                     </pic:cNvPicPr>
                   </pic:nvPicPr>
                   <pic:blipFill>
-                    <a:blip r:embed="rId30">
+                    <a:blip r:embed="rId31">
                       <a:extLst>
                         <a:ext uri="{28A0092B-C50C-407E-A947-70E740481C1C}">
                           <a14:useLocalDpi xmlns:a14="http://schemas.microsoft.com/office/drawing/2010/main" val="0"/>
@@ -3105,7 +3176,7 @@
                     </pic:cNvPicPr>
                   </pic:nvPicPr>
                   <pic:blipFill>
-                    <a:blip r:embed="rId31">
+                    <a:blip r:embed="rId32">
                       <a:extLst>
                         <a:ext uri="{28A0092B-C50C-407E-A947-70E740481C1C}">
                           <a14:useLocalDpi xmlns:a14="http://schemas.microsoft.com/office/drawing/2010/main" val="0"/>
@@ -3217,7 +3288,7 @@
                     </pic:cNvPicPr>
                   </pic:nvPicPr>
                   <pic:blipFill>
-                    <a:blip r:embed="rId32">
+                    <a:blip r:embed="rId33">
                       <a:extLst>
                         <a:ext uri="{28A0092B-C50C-407E-A947-70E740481C1C}">
                           <a14:useLocalDpi xmlns:a14="http://schemas.microsoft.com/office/drawing/2010/main" val="0"/>
@@ -3361,7 +3432,7 @@
                     </pic:cNvPicPr>
                   </pic:nvPicPr>
                   <pic:blipFill>
-                    <a:blip r:embed="rId33">
+                    <a:blip r:embed="rId34">
                       <a:extLst>
                         <a:ext uri="{28A0092B-C50C-407E-A947-70E740481C1C}">
                           <a14:useLocalDpi xmlns:a14="http://schemas.microsoft.com/office/drawing/2010/main" val="0"/>
@@ -3393,9 +3464,9 @@
       </w:r>
     </w:p>
     <w:sectPr>
-      <w:headerReference w:type="even" r:id="rId34"/>
-      <w:headerReference w:type="default" r:id="rId35"/>
-      <w:headerReference w:type="first" r:id="rId36"/>
+      <w:headerReference w:type="even" r:id="rId35"/>
+      <w:headerReference w:type="default" r:id="rId36"/>
+      <w:headerReference w:type="first" r:id="rId37"/>
       <w:pgSz w:w="11906" w:h="16838"/>
       <w:pgMar w:top="1417" w:right="1701" w:bottom="1417" w:left="1701" w:header="708" w:footer="708" w:gutter="0"/>
       <w:pgBorders w:display="notFirstPage" w:offsetFrom="page">

</xml_diff>

<commit_message>
ACHO QUE AGORA ACABOU DE VEZ... ja que a entrega é amanhã né hehehe
</commit_message>
<xml_diff>
--- a/Anotações/Manual_Site.docx
+++ b/Anotações/Manual_Site.docx
@@ -514,19 +514,11 @@
           <w:lang w:eastAsia="pt-BR"/>
         </w:rPr>
       </w:pPr>
-      <w:proofErr w:type="spellStart"/>
-      <w:r>
-        <w:rPr>
-          <w:lang w:eastAsia="pt-BR"/>
-        </w:rPr>
-        <w:t>Navbar</w:t>
-      </w:r>
-      <w:proofErr w:type="spellEnd"/>
-      <w:r>
-        <w:rPr>
-          <w:lang w:eastAsia="pt-BR"/>
-        </w:rPr>
-        <w:t xml:space="preserve">: </w:t>
+      <w:r>
+        <w:rPr>
+          <w:lang w:eastAsia="pt-BR"/>
+        </w:rPr>
+        <w:t xml:space="preserve">Navbar: </w:t>
       </w:r>
       <w:r>
         <w:rPr>
@@ -1138,9 +1130,9 @@
           <w:lang w:eastAsia="pt-BR"/>
         </w:rPr>
         <w:drawing>
-          <wp:inline distT="0" distB="0" distL="0" distR="0" wp14:anchorId="474920C6" wp14:editId="4B7F0801">
-            <wp:extent cx="4320000" cy="1608193"/>
-            <wp:effectExtent l="0" t="0" r="4445" b="0"/>
+          <wp:inline distT="0" distB="0" distL="0" distR="0" wp14:anchorId="474920C6" wp14:editId="245BE95B">
+            <wp:extent cx="3953379" cy="1608193"/>
+            <wp:effectExtent l="0" t="0" r="0" b="0"/>
             <wp:docPr id="1449172012" name="Imagem 1"/>
             <wp:cNvGraphicFramePr>
               <a:graphicFrameLocks xmlns:a="http://schemas.openxmlformats.org/drawingml/2006/main" noChangeAspect="1"/>
@@ -1169,7 +1161,7 @@
                   <pic:spPr bwMode="auto">
                     <a:xfrm>
                       <a:off x="0" y="0"/>
-                      <a:ext cx="4320000" cy="1608193"/>
+                      <a:ext cx="3953379" cy="1608193"/>
                     </a:xfrm>
                     <a:prstGeom prst="rect">
                       <a:avLst/>
@@ -1197,25 +1189,29 @@
           <w:lang w:eastAsia="pt-BR"/>
         </w:rPr>
       </w:pPr>
-      <w:proofErr w:type="spellStart"/>
-      <w:r>
-        <w:rPr>
-          <w:lang w:eastAsia="pt-BR"/>
-        </w:rPr>
-        <w:t>Footer</w:t>
-      </w:r>
-      <w:proofErr w:type="spellEnd"/>
-      <w:r>
-        <w:rPr>
-          <w:lang w:eastAsia="pt-BR"/>
-        </w:rPr>
-        <w:t xml:space="preserve">: </w:t>
-      </w:r>
-      <w:r>
-        <w:rPr>
-          <w:lang w:eastAsia="pt-BR"/>
-        </w:rPr>
-        <w:t>Barra fixa na base da página com informações de copyright, ano e link para "Termos de Serviço" para conformidade legal.</w:t>
+      <w:r>
+        <w:rPr>
+          <w:lang w:eastAsia="pt-BR"/>
+        </w:rPr>
+        <w:t xml:space="preserve">Footer: </w:t>
+      </w:r>
+      <w:r>
+        <w:rPr>
+          <w:lang w:eastAsia="pt-BR"/>
+        </w:rPr>
+        <w:t xml:space="preserve">Barra fixa na base da página com informações de copyright, ano e link para </w:t>
+      </w:r>
+      <w:r>
+        <w:rPr>
+          <w:lang w:eastAsia="pt-BR"/>
+        </w:rPr>
+        <w:t>os desenvolvedores</w:t>
+      </w:r>
+      <w:r>
+        <w:rPr>
+          <w:lang w:eastAsia="pt-BR"/>
+        </w:rPr>
+        <w:t>.</w:t>
       </w:r>
     </w:p>
     <w:p>
@@ -1232,8 +1228,8 @@
           <w:lang w:eastAsia="pt-BR"/>
         </w:rPr>
         <w:drawing>
-          <wp:inline distT="0" distB="0" distL="0" distR="0" wp14:anchorId="26F3162D" wp14:editId="4B8DC126">
-            <wp:extent cx="4320000" cy="218734"/>
+          <wp:inline distT="0" distB="0" distL="0" distR="0" wp14:anchorId="26F3162D" wp14:editId="41A813CE">
+            <wp:extent cx="4319996" cy="218734"/>
             <wp:effectExtent l="0" t="0" r="0" b="0"/>
             <wp:docPr id="1995527049" name="Imagem 12"/>
             <wp:cNvGraphicFramePr>
@@ -1263,7 +1259,7 @@
                   <pic:spPr bwMode="auto">
                     <a:xfrm>
                       <a:off x="0" y="0"/>
-                      <a:ext cx="4320000" cy="218734"/>
+                      <a:ext cx="4319996" cy="218734"/>
                     </a:xfrm>
                     <a:prstGeom prst="rect">
                       <a:avLst/>
@@ -1338,19 +1334,11 @@
           <w:lang w:eastAsia="pt-BR"/>
         </w:rPr>
       </w:pPr>
-      <w:proofErr w:type="spellStart"/>
-      <w:r>
-        <w:rPr>
-          <w:lang w:eastAsia="pt-BR"/>
-        </w:rPr>
-        <w:t>Navbar</w:t>
-      </w:r>
-      <w:proofErr w:type="spellEnd"/>
-      <w:r>
-        <w:rPr>
-          <w:lang w:eastAsia="pt-BR"/>
-        </w:rPr>
-        <w:t xml:space="preserve">: </w:t>
+      <w:r>
+        <w:rPr>
+          <w:lang w:eastAsia="pt-BR"/>
+        </w:rPr>
+        <w:t xml:space="preserve">Navbar: </w:t>
       </w:r>
       <w:r>
         <w:rPr>
@@ -1459,10 +1447,10 @@
           <w:lang w:eastAsia="pt-BR"/>
         </w:rPr>
         <w:drawing>
-          <wp:inline distT="0" distB="0" distL="0" distR="0" wp14:anchorId="3530AED8" wp14:editId="054D9A34">
+          <wp:inline distT="0" distB="0" distL="0" distR="0" wp14:anchorId="5B3ED1A6" wp14:editId="04091A6B">
             <wp:extent cx="1440000" cy="569032"/>
             <wp:effectExtent l="0" t="0" r="8255" b="2540"/>
-            <wp:docPr id="1173346884" name="Imagem 14"/>
+            <wp:docPr id="759814110" name="Imagem 14" descr="Interface gráfica do usuário, Site&#10;&#10;O conteúdo gerado por IA pode estar incorreto."/>
             <wp:cNvGraphicFramePr>
               <a:graphicFrameLocks xmlns:a="http://schemas.openxmlformats.org/drawingml/2006/main" noChangeAspect="1"/>
             </wp:cNvGraphicFramePr>
@@ -1470,7 +1458,7 @@
               <a:graphicData uri="http://schemas.openxmlformats.org/drawingml/2006/picture">
                 <pic:pic xmlns:pic="http://schemas.openxmlformats.org/drawingml/2006/picture">
                   <pic:nvPicPr>
-                    <pic:cNvPr id="1173346884" name="Imagem 14"/>
+                    <pic:cNvPr id="759814110" name="Imagem 14" descr="Interface gráfica do usuário, Site&#10;&#10;O conteúdo gerado por IA pode estar incorreto."/>
                     <pic:cNvPicPr>
                       <a:picLocks noChangeAspect="1" noChangeArrowheads="1"/>
                     </pic:cNvPicPr>
@@ -1506,6 +1494,65 @@
           </wp:inline>
         </w:drawing>
       </w:r>
+      <w:r>
+        <w:rPr>
+          <w:lang w:eastAsia="pt-BR"/>
+        </w:rPr>
+        <w:tab/>
+      </w:r>
+      <w:r>
+        <w:rPr>
+          <w:noProof/>
+          <w:lang w:eastAsia="pt-BR"/>
+        </w:rPr>
+        <w:drawing>
+          <wp:inline distT="0" distB="0" distL="0" distR="0" wp14:anchorId="3530AED8" wp14:editId="16CC9620">
+            <wp:extent cx="1800000" cy="874163"/>
+            <wp:effectExtent l="0" t="0" r="0" b="2540"/>
+            <wp:docPr id="1173346884" name="Imagem 14"/>
+            <wp:cNvGraphicFramePr>
+              <a:graphicFrameLocks xmlns:a="http://schemas.openxmlformats.org/drawingml/2006/main" noChangeAspect="1"/>
+            </wp:cNvGraphicFramePr>
+            <a:graphic xmlns:a="http://schemas.openxmlformats.org/drawingml/2006/main">
+              <a:graphicData uri="http://schemas.openxmlformats.org/drawingml/2006/picture">
+                <pic:pic xmlns:pic="http://schemas.openxmlformats.org/drawingml/2006/picture">
+                  <pic:nvPicPr>
+                    <pic:cNvPr id="1173346884" name="Imagem 14"/>
+                    <pic:cNvPicPr>
+                      <a:picLocks noChangeAspect="1" noChangeArrowheads="1"/>
+                    </pic:cNvPicPr>
+                  </pic:nvPicPr>
+                  <pic:blipFill>
+                    <a:blip r:embed="rId19" cstate="print">
+                      <a:extLst>
+                        <a:ext uri="{28A0092B-C50C-407E-A947-70E740481C1C}">
+                          <a14:useLocalDpi xmlns:a14="http://schemas.microsoft.com/office/drawing/2010/main" val="0"/>
+                        </a:ext>
+                      </a:extLst>
+                    </a:blip>
+                    <a:stretch>
+                      <a:fillRect/>
+                    </a:stretch>
+                  </pic:blipFill>
+                  <pic:spPr bwMode="auto">
+                    <a:xfrm>
+                      <a:off x="0" y="0"/>
+                      <a:ext cx="1800000" cy="874163"/>
+                    </a:xfrm>
+                    <a:prstGeom prst="rect">
+                      <a:avLst/>
+                    </a:prstGeom>
+                    <a:noFill/>
+                    <a:ln>
+                      <a:noFill/>
+                    </a:ln>
+                  </pic:spPr>
+                </pic:pic>
+              </a:graphicData>
+            </a:graphic>
+          </wp:inline>
+        </w:drawing>
+      </w:r>
     </w:p>
     <w:p>
       <w:pPr>
@@ -1574,7 +1621,7 @@
                     </pic:cNvPicPr>
                   </pic:nvPicPr>
                   <pic:blipFill>
-                    <a:blip r:embed="rId19">
+                    <a:blip r:embed="rId20">
                       <a:extLst>
                         <a:ext uri="{28A0092B-C50C-407E-A947-70E740481C1C}">
                           <a14:useLocalDpi xmlns:a14="http://schemas.microsoft.com/office/drawing/2010/main" val="0"/>
@@ -1627,21 +1674,7 @@
           <w:lang w:eastAsia="pt-BR"/>
         </w:rPr>
         <w:lastRenderedPageBreak/>
-        <w:t xml:space="preserve">Botão para o </w:t>
-      </w:r>
-      <w:proofErr w:type="spellStart"/>
-      <w:r>
-        <w:rPr>
-          <w:lang w:eastAsia="pt-BR"/>
-        </w:rPr>
-        <w:t>instagram</w:t>
-      </w:r>
-      <w:proofErr w:type="spellEnd"/>
-      <w:r>
-        <w:rPr>
-          <w:lang w:eastAsia="pt-BR"/>
-        </w:rPr>
-        <w:t xml:space="preserve">: </w:t>
+        <w:t xml:space="preserve">Botão para o instagram: </w:t>
       </w:r>
       <w:r>
         <w:rPr>
@@ -1693,7 +1726,7 @@
                     </pic:cNvPicPr>
                   </pic:nvPicPr>
                   <pic:blipFill>
-                    <a:blip r:embed="rId20">
+                    <a:blip r:embed="rId21">
                       <a:extLst>
                         <a:ext uri="{28A0092B-C50C-407E-A947-70E740481C1C}">
                           <a14:useLocalDpi xmlns:a14="http://schemas.microsoft.com/office/drawing/2010/main" val="0"/>
@@ -1792,7 +1825,7 @@
                     </pic:cNvPicPr>
                   </pic:nvPicPr>
                   <pic:blipFill>
-                    <a:blip r:embed="rId21">
+                    <a:blip r:embed="rId22">
                       <a:extLst>
                         <a:ext uri="{28A0092B-C50C-407E-A947-70E740481C1C}">
                           <a14:useLocalDpi xmlns:a14="http://schemas.microsoft.com/office/drawing/2010/main" val="0"/>
@@ -1852,7 +1885,7 @@
                     </pic:cNvPicPr>
                   </pic:nvPicPr>
                   <pic:blipFill>
-                    <a:blip r:embed="rId22">
+                    <a:blip r:embed="rId23">
                       <a:extLst>
                         <a:ext uri="{28A0092B-C50C-407E-A947-70E740481C1C}">
                           <a14:useLocalDpi xmlns:a14="http://schemas.microsoft.com/office/drawing/2010/main" val="0"/>
@@ -1898,51 +1931,25 @@
         <w:rPr>
           <w:lang w:eastAsia="pt-BR"/>
         </w:rPr>
-        <w:t>Termos de Serviço</w:t>
-      </w:r>
-      <w:r>
-        <w:rPr>
-          <w:lang w:eastAsia="pt-BR"/>
-        </w:rPr>
-        <w:t xml:space="preserve">: </w:t>
-      </w:r>
-      <w:r>
-        <w:rPr>
-          <w:lang w:eastAsia="pt-BR"/>
-        </w:rPr>
-        <w:t xml:space="preserve">Clique no link do </w:t>
-      </w:r>
-      <w:proofErr w:type="spellStart"/>
-      <w:r>
-        <w:rPr>
-          <w:lang w:eastAsia="pt-BR"/>
-        </w:rPr>
-        <w:t>footer</w:t>
-      </w:r>
-      <w:proofErr w:type="spellEnd"/>
-      <w:r>
-        <w:rPr>
-          <w:lang w:eastAsia="pt-BR"/>
-        </w:rPr>
-        <w:t xml:space="preserve"> para acessar</w:t>
-      </w:r>
-      <w:r>
-        <w:rPr>
-          <w:lang w:eastAsia="pt-BR"/>
-        </w:rPr>
-        <w:t xml:space="preserve"> informações de </w:t>
-      </w:r>
-      <w:r>
-        <w:rPr>
-          <w:lang w:eastAsia="pt-BR"/>
-        </w:rPr>
-        <w:t>c</w:t>
-      </w:r>
-      <w:r>
-        <w:rPr>
-          <w:lang w:eastAsia="pt-BR"/>
-        </w:rPr>
-        <w:t>onformidade legal.</w:t>
+        <w:t>Desenvolvedores: Clique no link do footer para acessar</w:t>
+      </w:r>
+      <w:r>
+        <w:rPr>
+          <w:lang w:eastAsia="pt-BR"/>
+        </w:rPr>
+        <w:t xml:space="preserve"> informações </w:t>
+      </w:r>
+      <w:r>
+        <w:rPr>
+          <w:lang w:eastAsia="pt-BR"/>
+        </w:rPr>
+        <w:t>dos desenvolvedores</w:t>
+      </w:r>
+      <w:r>
+        <w:rPr>
+          <w:lang w:eastAsia="pt-BR"/>
+        </w:rPr>
+        <w:t>.</w:t>
       </w:r>
     </w:p>
     <w:p>
@@ -1959,9 +1966,9 @@
           <w:lang w:eastAsia="pt-BR"/>
         </w:rPr>
         <w:drawing>
-          <wp:inline distT="0" distB="0" distL="0" distR="0" wp14:anchorId="48A5B6FF" wp14:editId="3884BE7F">
-            <wp:extent cx="4182675" cy="537642"/>
-            <wp:effectExtent l="0" t="0" r="0" b="0"/>
+          <wp:inline distT="0" distB="0" distL="0" distR="0" wp14:anchorId="48A5B6FF" wp14:editId="76CB7564">
+            <wp:extent cx="3081843" cy="537642"/>
+            <wp:effectExtent l="0" t="0" r="4445" b="0"/>
             <wp:docPr id="1791388982" name="Imagem 18"/>
             <wp:cNvGraphicFramePr>
               <a:graphicFrameLocks xmlns:a="http://schemas.openxmlformats.org/drawingml/2006/main" noChangeAspect="1"/>
@@ -1976,7 +1983,7 @@
                     </pic:cNvPicPr>
                   </pic:nvPicPr>
                   <pic:blipFill>
-                    <a:blip r:embed="rId23">
+                    <a:blip r:embed="rId24">
                       <a:extLst>
                         <a:ext uri="{28A0092B-C50C-407E-A947-70E740481C1C}">
                           <a14:useLocalDpi xmlns:a14="http://schemas.microsoft.com/office/drawing/2010/main" val="0"/>
@@ -1990,7 +1997,7 @@
                   <pic:spPr bwMode="auto">
                     <a:xfrm>
                       <a:off x="0" y="0"/>
-                      <a:ext cx="4182675" cy="537642"/>
+                      <a:ext cx="3081843" cy="537642"/>
                     </a:xfrm>
                     <a:prstGeom prst="rect">
                       <a:avLst/>
@@ -2071,19 +2078,11 @@
           <w:lang w:eastAsia="pt-BR"/>
         </w:rPr>
       </w:pPr>
-      <w:proofErr w:type="spellStart"/>
-      <w:r>
-        <w:rPr>
-          <w:lang w:eastAsia="pt-BR"/>
-        </w:rPr>
-        <w:t>Navbar</w:t>
-      </w:r>
-      <w:proofErr w:type="spellEnd"/>
-      <w:r>
-        <w:rPr>
-          <w:lang w:eastAsia="pt-BR"/>
-        </w:rPr>
-        <w:t xml:space="preserve">: </w:t>
+      <w:r>
+        <w:rPr>
+          <w:lang w:eastAsia="pt-BR"/>
+        </w:rPr>
+        <w:t xml:space="preserve">Navbar: </w:t>
       </w:r>
       <w:r>
         <w:rPr>
@@ -2141,7 +2140,7 @@
                     </pic:cNvPicPr>
                   </pic:nvPicPr>
                   <pic:blipFill>
-                    <a:blip r:embed="rId24" cstate="print">
+                    <a:blip r:embed="rId25" cstate="print">
                       <a:extLst>
                         <a:ext uri="{28A0092B-C50C-407E-A947-70E740481C1C}">
                           <a14:useLocalDpi xmlns:a14="http://schemas.microsoft.com/office/drawing/2010/main" val="0"/>
@@ -2281,7 +2280,7 @@
                     </pic:cNvPicPr>
                   </pic:nvPicPr>
                   <pic:blipFill>
-                    <a:blip r:embed="rId25" cstate="print">
+                    <a:blip r:embed="rId26" cstate="print">
                       <a:extLst>
                         <a:ext uri="{28A0092B-C50C-407E-A947-70E740481C1C}">
                           <a14:useLocalDpi xmlns:a14="http://schemas.microsoft.com/office/drawing/2010/main" val="0"/>
@@ -2420,7 +2419,7 @@
                     </pic:cNvPicPr>
                   </pic:nvPicPr>
                   <pic:blipFill>
-                    <a:blip r:embed="rId26" cstate="print">
+                    <a:blip r:embed="rId27" cstate="print">
                       <a:extLst>
                         <a:ext uri="{28A0092B-C50C-407E-A947-70E740481C1C}">
                           <a14:useLocalDpi xmlns:a14="http://schemas.microsoft.com/office/drawing/2010/main" val="0"/>
@@ -2468,7 +2467,6 @@
           <w:lang w:eastAsia="pt-BR"/>
         </w:rPr>
       </w:pPr>
-      <w:proofErr w:type="spellStart"/>
       <w:r>
         <w:rPr>
           <w:lang w:eastAsia="pt-BR"/>
@@ -2482,7 +2480,6 @@
         </w:rPr>
         <w:t>ooter</w:t>
       </w:r>
-      <w:proofErr w:type="spellEnd"/>
       <w:r>
         <w:rPr>
           <w:lang w:eastAsia="pt-BR"/>
@@ -2493,7 +2490,13 @@
         <w:rPr>
           <w:lang w:eastAsia="pt-BR"/>
         </w:rPr>
-        <w:t>Barra fixa na base com copyright e link para "Termos de Serviço".</w:t>
+        <w:t xml:space="preserve">Barra fixa na base com copyright e link para </w:t>
+      </w:r>
+      <w:r>
+        <w:rPr>
+          <w:lang w:eastAsia="pt-BR"/>
+        </w:rPr>
+        <w:t>os desenvolvedores.</w:t>
       </w:r>
     </w:p>
     <w:p>
@@ -2510,8 +2513,8 @@
           <w:lang w:eastAsia="pt-BR"/>
         </w:rPr>
         <w:drawing>
-          <wp:inline distT="0" distB="0" distL="0" distR="0" wp14:anchorId="068A9E17" wp14:editId="502F8F00">
-            <wp:extent cx="4320000" cy="218734"/>
+          <wp:inline distT="0" distB="0" distL="0" distR="0" wp14:anchorId="068A9E17" wp14:editId="5ED11983">
+            <wp:extent cx="4319996" cy="218734"/>
             <wp:effectExtent l="0" t="0" r="0" b="0"/>
             <wp:docPr id="1576847926" name="Imagem 8"/>
             <wp:cNvGraphicFramePr>
@@ -2527,7 +2530,7 @@
                     </pic:cNvPicPr>
                   </pic:nvPicPr>
                   <pic:blipFill>
-                    <a:blip r:embed="rId27" cstate="print">
+                    <a:blip r:embed="rId16" cstate="print">
                       <a:extLst>
                         <a:ext uri="{28A0092B-C50C-407E-A947-70E740481C1C}">
                           <a14:useLocalDpi xmlns:a14="http://schemas.microsoft.com/office/drawing/2010/main" val="0"/>
@@ -2541,7 +2544,7 @@
                   <pic:spPr bwMode="auto">
                     <a:xfrm>
                       <a:off x="0" y="0"/>
-                      <a:ext cx="4320000" cy="218734"/>
+                      <a:ext cx="4319996" cy="218734"/>
                     </a:xfrm>
                     <a:prstGeom prst="rect">
                       <a:avLst/>
@@ -2569,7 +2572,6 @@
           <w:lang w:eastAsia="pt-BR"/>
         </w:rPr>
       </w:pPr>
-      <w:proofErr w:type="spellStart"/>
       <w:r>
         <w:rPr>
           <w:lang w:eastAsia="pt-BR"/>
@@ -2582,7 +2584,6 @@
         </w:rPr>
         <w:t>opup</w:t>
       </w:r>
-      <w:proofErr w:type="spellEnd"/>
       <w:r>
         <w:rPr>
           <w:lang w:eastAsia="pt-BR"/>
@@ -3279,39 +3280,31 @@
         <w:rPr>
           <w:lang w:eastAsia="pt-BR"/>
         </w:rPr>
-        <w:t xml:space="preserve">Termos de Serviço: Clique no link do </w:t>
-      </w:r>
-      <w:proofErr w:type="spellStart"/>
-      <w:r>
-        <w:rPr>
-          <w:lang w:eastAsia="pt-BR"/>
-        </w:rPr>
-        <w:t>footer</w:t>
-      </w:r>
-      <w:proofErr w:type="spellEnd"/>
-      <w:r>
-        <w:rPr>
-          <w:lang w:eastAsia="pt-BR"/>
-        </w:rPr>
-        <w:t xml:space="preserve"> para acessar</w:t>
-      </w:r>
-      <w:r>
-        <w:rPr>
-          <w:lang w:eastAsia="pt-BR"/>
-        </w:rPr>
-        <w:t xml:space="preserve"> informações de </w:t>
-      </w:r>
-      <w:r>
-        <w:rPr>
-          <w:lang w:eastAsia="pt-BR"/>
-        </w:rPr>
-        <w:t>c</w:t>
-      </w:r>
-      <w:r>
-        <w:rPr>
-          <w:lang w:eastAsia="pt-BR"/>
-        </w:rPr>
-        <w:t>onformidade legal.</w:t>
+        <w:t>Desenvolvedores</w:t>
+      </w:r>
+      <w:r>
+        <w:rPr>
+          <w:lang w:eastAsia="pt-BR"/>
+        </w:rPr>
+        <w:t>: Clique no link do footer para acessar</w:t>
+      </w:r>
+      <w:r>
+        <w:rPr>
+          <w:lang w:eastAsia="pt-BR"/>
+        </w:rPr>
+        <w:t xml:space="preserve"> informações </w:t>
+      </w:r>
+      <w:r>
+        <w:rPr>
+          <w:lang w:eastAsia="pt-BR"/>
+        </w:rPr>
+        <w:t>dos desenvolvedores</w:t>
+      </w:r>
+      <w:r>
+        <w:rPr>
+          <w:lang w:eastAsia="pt-BR"/>
+        </w:rPr>
+        <w:t>.</w:t>
       </w:r>
     </w:p>
     <w:p>
@@ -3328,9 +3321,9 @@
           <w:lang w:eastAsia="pt-BR"/>
         </w:rPr>
         <w:drawing>
-          <wp:inline distT="0" distB="0" distL="0" distR="0" wp14:anchorId="5CC1147A" wp14:editId="3CCFE4F2">
-            <wp:extent cx="4172473" cy="543848"/>
-            <wp:effectExtent l="0" t="0" r="0" b="8890"/>
+          <wp:inline distT="0" distB="0" distL="0" distR="0" wp14:anchorId="5CC1147A" wp14:editId="5A97FDF4">
+            <wp:extent cx="3117417" cy="543848"/>
+            <wp:effectExtent l="0" t="0" r="6985" b="8890"/>
             <wp:docPr id="1548495109" name="Imagem 13"/>
             <wp:cNvGraphicFramePr>
               <a:graphicFrameLocks xmlns:a="http://schemas.openxmlformats.org/drawingml/2006/main" noChangeAspect="1"/>
@@ -3340,6 +3333,150 @@
                 <pic:pic xmlns:pic="http://schemas.openxmlformats.org/drawingml/2006/picture">
                   <pic:nvPicPr>
                     <pic:cNvPr id="1548495109" name="Imagem 13"/>
+                    <pic:cNvPicPr>
+                      <a:picLocks noChangeAspect="1" noChangeArrowheads="1"/>
+                    </pic:cNvPicPr>
+                  </pic:nvPicPr>
+                  <pic:blipFill>
+                    <a:blip r:embed="rId24">
+                      <a:extLst>
+                        <a:ext uri="{28A0092B-C50C-407E-A947-70E740481C1C}">
+                          <a14:useLocalDpi xmlns:a14="http://schemas.microsoft.com/office/drawing/2010/main" val="0"/>
+                        </a:ext>
+                      </a:extLst>
+                    </a:blip>
+                    <a:stretch>
+                      <a:fillRect/>
+                    </a:stretch>
+                  </pic:blipFill>
+                  <pic:spPr bwMode="auto">
+                    <a:xfrm>
+                      <a:off x="0" y="0"/>
+                      <a:ext cx="3117417" cy="543848"/>
+                    </a:xfrm>
+                    <a:prstGeom prst="rect">
+                      <a:avLst/>
+                    </a:prstGeom>
+                    <a:noFill/>
+                    <a:ln>
+                      <a:noFill/>
+                    </a:ln>
+                  </pic:spPr>
+                </pic:pic>
+              </a:graphicData>
+            </a:graphic>
+          </wp:inline>
+        </w:drawing>
+      </w:r>
+    </w:p>
+    <w:p>
+      <w:pPr>
+        <w:ind w:firstLine="0"/>
+        <w:rPr>
+          <w:lang w:eastAsia="pt-BR"/>
+        </w:rPr>
+      </w:pPr>
+      <w:r>
+        <w:rPr>
+          <w:lang w:eastAsia="pt-BR"/>
+        </w:rPr>
+        <w:br w:type="page"/>
+      </w:r>
+    </w:p>
+    <w:p>
+      <w:pPr>
+        <w:pStyle w:val="PargrafodaLista"/>
+        <w:numPr>
+          <w:ilvl w:val="0"/>
+          <w:numId w:val="5"/>
+        </w:numPr>
+        <w:rPr>
+          <w:lang w:eastAsia="pt-BR"/>
+        </w:rPr>
+      </w:pPr>
+      <w:r>
+        <w:rPr>
+          <w:lang w:eastAsia="pt-BR"/>
+        </w:rPr>
+        <w:lastRenderedPageBreak/>
+        <w:t xml:space="preserve">Carrossel: </w:t>
+      </w:r>
+      <w:r>
+        <w:rPr>
+          <w:lang w:eastAsia="pt-BR"/>
+        </w:rPr>
+        <w:t>G</w:t>
+      </w:r>
+      <w:r>
+        <w:rPr>
+          <w:lang w:eastAsia="pt-BR"/>
+        </w:rPr>
+        <w:t>aleria de imagens</w:t>
+      </w:r>
+      <w:r>
+        <w:rPr>
+          <w:lang w:eastAsia="pt-BR"/>
+        </w:rPr>
+        <w:t xml:space="preserve"> d</w:t>
+      </w:r>
+      <w:r>
+        <w:rPr>
+          <w:lang w:eastAsia="pt-BR"/>
+        </w:rPr>
+        <w:t xml:space="preserve">entro </w:t>
+      </w:r>
+      <w:r>
+        <w:rPr>
+          <w:lang w:eastAsia="pt-BR"/>
+        </w:rPr>
+        <w:t>da janela de informações</w:t>
+      </w:r>
+      <w:r>
+        <w:rPr>
+          <w:lang w:eastAsia="pt-BR"/>
+        </w:rPr>
+        <w:t>, use os botões com setas nas laterais da imagem para navegar entre as diferentes fotos do produto. Ao final do carrossel, os bot</w:t>
+      </w:r>
+      <w:r>
+        <w:rPr>
+          <w:rFonts w:cs="Arial"/>
+          <w:lang w:eastAsia="pt-BR"/>
+        </w:rPr>
+        <w:t>õ</w:t>
+      </w:r>
+      <w:r>
+        <w:rPr>
+          <w:lang w:eastAsia="pt-BR"/>
+        </w:rPr>
+        <w:t>es se desabilitam automaticamente.</w:t>
+      </w:r>
+    </w:p>
+    <w:p>
+      <w:pPr>
+        <w:ind w:firstLine="0"/>
+        <w:jc w:val="center"/>
+        <w:rPr>
+          <w:lang w:eastAsia="pt-BR"/>
+        </w:rPr>
+      </w:pPr>
+      <w:r>
+        <w:rPr>
+          <w:noProof/>
+          <w:lang w:eastAsia="pt-BR"/>
+        </w:rPr>
+        <w:drawing>
+          <wp:inline distT="0" distB="0" distL="0" distR="0" wp14:anchorId="330951A3" wp14:editId="73339860">
+            <wp:extent cx="3597672" cy="3274286"/>
+            <wp:effectExtent l="0" t="0" r="3175" b="2540"/>
+            <wp:docPr id="1961135017" name="Imagem 14"/>
+            <wp:cNvGraphicFramePr>
+              <a:graphicFrameLocks xmlns:a="http://schemas.openxmlformats.org/drawingml/2006/main" noChangeAspect="1"/>
+            </wp:cNvGraphicFramePr>
+            <a:graphic xmlns:a="http://schemas.openxmlformats.org/drawingml/2006/main">
+              <a:graphicData uri="http://schemas.openxmlformats.org/drawingml/2006/picture">
+                <pic:pic xmlns:pic="http://schemas.openxmlformats.org/drawingml/2006/picture">
+                  <pic:nvPicPr>
+                    <pic:cNvPr id="1961135017" name="Imagem 14"/>
                     <pic:cNvPicPr>
                       <a:picLocks noChangeAspect="1" noChangeArrowheads="1"/>
                     </pic:cNvPicPr>
@@ -3359,7 +3496,7 @@
                   <pic:spPr bwMode="auto">
                     <a:xfrm>
                       <a:off x="0" y="0"/>
-                      <a:ext cx="4172473" cy="543848"/>
+                      <a:ext cx="3597672" cy="3274286"/>
                     </a:xfrm>
                     <a:prstGeom prst="rect">
                       <a:avLst/>
@@ -3378,7 +3515,9 @@
     </w:p>
     <w:p>
       <w:pPr>
+        <w:spacing w:after="160" w:line="259" w:lineRule="auto"/>
         <w:ind w:firstLine="0"/>
+        <w:jc w:val="left"/>
         <w:rPr>
           <w:lang w:eastAsia="pt-BR"/>
         </w:rPr>
@@ -3388,6 +3527,21 @@
           <w:lang w:eastAsia="pt-BR"/>
         </w:rPr>
         <w:br w:type="page"/>
+      </w:r>
+    </w:p>
+    <w:p>
+      <w:pPr>
+        <w:pStyle w:val="Ttulo1"/>
+        <w:rPr>
+          <w:lang w:eastAsia="pt-BR"/>
+        </w:rPr>
+      </w:pPr>
+      <w:r>
+        <w:rPr>
+          <w:lang w:eastAsia="pt-BR"/>
+        </w:rPr>
+        <w:lastRenderedPageBreak/>
+        <w:t>DESENVOLVEDORES</w:t>
       </w:r>
     </w:p>
     <w:p>
@@ -3395,7 +3549,7 @@
         <w:pStyle w:val="PargrafodaLista"/>
         <w:numPr>
           <w:ilvl w:val="0"/>
-          <w:numId w:val="5"/>
+          <w:numId w:val="6"/>
         </w:numPr>
         <w:rPr>
           <w:lang w:eastAsia="pt-BR"/>
@@ -3405,57 +3559,7 @@
         <w:rPr>
           <w:lang w:eastAsia="pt-BR"/>
         </w:rPr>
-        <w:lastRenderedPageBreak/>
-        <w:t xml:space="preserve">Carrossel: </w:t>
-      </w:r>
-      <w:r>
-        <w:rPr>
-          <w:lang w:eastAsia="pt-BR"/>
-        </w:rPr>
-        <w:t>G</w:t>
-      </w:r>
-      <w:r>
-        <w:rPr>
-          <w:lang w:eastAsia="pt-BR"/>
-        </w:rPr>
-        <w:t>aleria de imagens</w:t>
-      </w:r>
-      <w:r>
-        <w:rPr>
-          <w:lang w:eastAsia="pt-BR"/>
-        </w:rPr>
-        <w:t xml:space="preserve"> d</w:t>
-      </w:r>
-      <w:r>
-        <w:rPr>
-          <w:lang w:eastAsia="pt-BR"/>
-        </w:rPr>
-        <w:t xml:space="preserve">entro </w:t>
-      </w:r>
-      <w:r>
-        <w:rPr>
-          <w:lang w:eastAsia="pt-BR"/>
-        </w:rPr>
-        <w:t>da janela de informações</w:t>
-      </w:r>
-      <w:r>
-        <w:rPr>
-          <w:lang w:eastAsia="pt-BR"/>
-        </w:rPr>
-        <w:t>, use os botões com setas nas laterais da imagem para navegar entre as diferentes fotos do produto. Ao final do carrossel, os bot</w:t>
-      </w:r>
-      <w:r>
-        <w:rPr>
-          <w:rFonts w:cs="Arial"/>
-          <w:lang w:eastAsia="pt-BR"/>
-        </w:rPr>
-        <w:t>õ</w:t>
-      </w:r>
-      <w:r>
-        <w:rPr>
-          <w:lang w:eastAsia="pt-BR"/>
-        </w:rPr>
-        <w:t>es se desabilitam automaticamente.</w:t>
+        <w:t>Uma página acessível por meio dos footers / rodapés, composta por cinco cards contendo nome e pelo menos uma forma de contato com os desenvolvedores do site.</w:t>
       </w:r>
     </w:p>
     <w:p>
@@ -3472,10 +3576,10 @@
           <w:lang w:eastAsia="pt-BR"/>
         </w:rPr>
         <w:drawing>
-          <wp:inline distT="0" distB="0" distL="0" distR="0" wp14:anchorId="330951A3" wp14:editId="73339860">
-            <wp:extent cx="3597672" cy="3274286"/>
-            <wp:effectExtent l="0" t="0" r="3175" b="2540"/>
-            <wp:docPr id="1961135017" name="Imagem 14"/>
+          <wp:inline distT="0" distB="0" distL="0" distR="0" wp14:anchorId="780509A6" wp14:editId="16C4B0F5">
+            <wp:extent cx="4320000" cy="2460953"/>
+            <wp:effectExtent l="0" t="0" r="4445" b="0"/>
+            <wp:docPr id="624363337" name="Imagem 6"/>
             <wp:cNvGraphicFramePr>
               <a:graphicFrameLocks xmlns:a="http://schemas.openxmlformats.org/drawingml/2006/main" noChangeAspect="1"/>
             </wp:cNvGraphicFramePr>
@@ -3483,19 +3587,20 @@
               <a:graphicData uri="http://schemas.openxmlformats.org/drawingml/2006/picture">
                 <pic:pic xmlns:pic="http://schemas.openxmlformats.org/drawingml/2006/picture">
                   <pic:nvPicPr>
-                    <pic:cNvPr id="1961135017" name="Imagem 14"/>
+                    <pic:cNvPr id="0" name="Picture 2"/>
                     <pic:cNvPicPr>
                       <a:picLocks noChangeAspect="1" noChangeArrowheads="1"/>
                     </pic:cNvPicPr>
                   </pic:nvPicPr>
                   <pic:blipFill>
-                    <a:blip r:embed="rId35">
+                    <a:blip r:embed="rId35" cstate="print">
                       <a:extLst>
                         <a:ext uri="{28A0092B-C50C-407E-A947-70E740481C1C}">
                           <a14:useLocalDpi xmlns:a14="http://schemas.microsoft.com/office/drawing/2010/main" val="0"/>
                         </a:ext>
                       </a:extLst>
                     </a:blip>
+                    <a:srcRect/>
                     <a:stretch>
                       <a:fillRect/>
                     </a:stretch>
@@ -3503,7 +3608,7 @@
                   <pic:spPr bwMode="auto">
                     <a:xfrm>
                       <a:off x="0" y="0"/>
-                      <a:ext cx="3597672" cy="3274286"/>
+                      <a:ext cx="4320000" cy="2460953"/>
                     </a:xfrm>
                     <a:prstGeom prst="rect">
                       <a:avLst/>

</xml_diff>